<commit_message>
Refactor and extend RectangleCalculator with tests
Moved source files to 'main' package and added package declarations. Implemented RectangleCalculator with area, perimeter, and diagonal methods, and added a Main class to demonstrate usage. Added RectangleCalculatorTest with unit tests for all calculation methods. Cleaned up old source files and reorganized project structure.
</commit_message>
<xml_diff>
--- a/Modules/Semester_1/Modern Code/Aufgaben/02_Java_Variables_Types_Expression_Control_Structures/Protocol.docx
+++ b/Modules/Semester_1/Modern Code/Aufgaben/02_Java_Variables_Types_Expression_Control_Structures/Protocol.docx
@@ -265,7 +265,6 @@
                                   <w:tab/>
                                 </w:r>
                                 <w:proofErr w:type="spellStart"/>
-                                <w:proofErr w:type="gramStart"/>
                                 <w:r>
                                   <w:t>xx</w:t>
                                 </w:r>
@@ -275,7 +274,6 @@
                                 <w:r>
                                   <w:t>xx</w:t>
                                 </w:r>
-                                <w:proofErr w:type="gramEnd"/>
                                 <w:r>
                                   <w:t>:</w:t>
                                 </w:r>
@@ -379,7 +377,6 @@
                             <w:tab/>
                           </w:r>
                           <w:proofErr w:type="spellStart"/>
-                          <w:proofErr w:type="gramStart"/>
                           <w:r>
                             <w:t>xx</w:t>
                           </w:r>
@@ -389,7 +386,6 @@
                           <w:r>
                             <w:t>xx</w:t>
                           </w:r>
-                          <w:proofErr w:type="gramEnd"/>
                           <w:r>
                             <w:t>:</w:t>
                           </w:r>
@@ -2179,6 +2175,11 @@
       <w:bookmarkEnd w:id="1"/>
     </w:p>
     <w:p>
+      <w:r>
+        <w:t>Create methods to calculate each property and then print each of them out.</w:t>
+      </w:r>
+    </w:p>
+    <w:p>
       <w:pPr>
         <w:pStyle w:val="Heading2"/>
       </w:pPr>
@@ -2189,15 +2190,565 @@
       <w:bookmarkEnd w:id="2"/>
     </w:p>
     <w:p>
+      <w:r>
+        <w:rPr>
+          <w:noProof/>
+        </w:rPr>
+        <mc:AlternateContent>
+          <mc:Choice Requires="wps">
+            <w:drawing>
+              <wp:anchor distT="0" distB="0" distL="114300" distR="114300" simplePos="0" relativeHeight="251664384" behindDoc="0" locked="0" layoutInCell="1" allowOverlap="1" wp14:anchorId="0DBD41AC" wp14:editId="553A13E6">
+                <wp:simplePos x="0" y="0"/>
+                <wp:positionH relativeFrom="column">
+                  <wp:posOffset>177165</wp:posOffset>
+                </wp:positionH>
+                <wp:positionV relativeFrom="paragraph">
+                  <wp:posOffset>4928235</wp:posOffset>
+                </wp:positionV>
+                <wp:extent cx="5182870" cy="635"/>
+                <wp:effectExtent l="0" t="0" r="0" b="0"/>
+                <wp:wrapTopAndBottom/>
+                <wp:docPr id="1763025251" name="Text Box 1"/>
+                <wp:cNvGraphicFramePr/>
+                <a:graphic xmlns:a="http://schemas.openxmlformats.org/drawingml/2006/main">
+                  <a:graphicData uri="http://schemas.microsoft.com/office/word/2010/wordprocessingShape">
+                    <wps:wsp>
+                      <wps:cNvSpPr txBox="1"/>
+                      <wps:spPr>
+                        <a:xfrm>
+                          <a:off x="0" y="0"/>
+                          <a:ext cx="5182870" cy="635"/>
+                        </a:xfrm>
+                        <a:prstGeom prst="rect">
+                          <a:avLst/>
+                        </a:prstGeom>
+                        <a:solidFill>
+                          <a:prstClr val="white"/>
+                        </a:solidFill>
+                        <a:ln>
+                          <a:noFill/>
+                        </a:ln>
+                      </wps:spPr>
+                      <wps:txbx>
+                        <w:txbxContent>
+                          <w:p>
+                            <w:pPr>
+                              <w:pStyle w:val="Caption"/>
+                            </w:pPr>
+                            <w:r>
+                              <w:t xml:space="preserve">Figure </w:t>
+                            </w:r>
+                            <w:r>
+                              <w:fldChar w:fldCharType="begin"/>
+                            </w:r>
+                            <w:r>
+                              <w:instrText xml:space="preserve"> SEQ Figure \* ARABIC </w:instrText>
+                            </w:r>
+                            <w:r>
+                              <w:fldChar w:fldCharType="separate"/>
+                            </w:r>
+                            <w:r>
+                              <w:rPr>
+                                <w:noProof/>
+                              </w:rPr>
+                              <w:t>1</w:t>
+                            </w:r>
+                            <w:r>
+                              <w:fldChar w:fldCharType="end"/>
+                            </w:r>
+                            <w:r>
+                              <w:t xml:space="preserve">: </w:t>
+                            </w:r>
+                            <w:proofErr w:type="spellStart"/>
+                            <w:r>
+                              <w:t>RectangleCalculator</w:t>
+                            </w:r>
+                            <w:proofErr w:type="spellEnd"/>
+                          </w:p>
+                        </w:txbxContent>
+                      </wps:txbx>
+                      <wps:bodyPr rot="0" spcFirstLastPara="0" vertOverflow="overflow" horzOverflow="overflow" vert="horz" wrap="square" lIns="0" tIns="0" rIns="0" bIns="0" numCol="1" spcCol="0" rtlCol="0" fromWordArt="0" anchor="t" anchorCtr="0" forceAA="0" compatLnSpc="1">
+                        <a:prstTxWarp prst="textNoShape">
+                          <a:avLst/>
+                        </a:prstTxWarp>
+                        <a:spAutoFit/>
+                      </wps:bodyPr>
+                    </wps:wsp>
+                  </a:graphicData>
+                </a:graphic>
+              </wp:anchor>
+            </w:drawing>
+          </mc:Choice>
+          <mc:Fallback>
+            <w:pict>
+              <v:shape w14:anchorId="0DBD41AC" id="Text Box 1" o:spid="_x0000_s1028" type="#_x0000_t202" style="position:absolute;left:0;text-align:left;margin-left:13.95pt;margin-top:388.05pt;width:408.1pt;height:.05pt;z-index:251664384;visibility:visible;mso-wrap-style:square;mso-wrap-distance-left:9pt;mso-wrap-distance-top:0;mso-wrap-distance-right:9pt;mso-wrap-distance-bottom:0;mso-position-horizontal:absolute;mso-position-horizontal-relative:text;mso-position-vertical:absolute;mso-position-vertical-relative:text;v-text-anchor:top" o:gfxdata="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" stroked="f">
+                <v:textbox style="mso-fit-shape-to-text:t" inset="0,0,0,0">
+                  <w:txbxContent>
+                    <w:p>
+                      <w:pPr>
+                        <w:pStyle w:val="Caption"/>
+                      </w:pPr>
+                      <w:r>
+                        <w:t xml:space="preserve">Figure </w:t>
+                      </w:r>
+                      <w:r>
+                        <w:fldChar w:fldCharType="begin"/>
+                      </w:r>
+                      <w:r>
+                        <w:instrText xml:space="preserve"> SEQ Figure \* ARABIC </w:instrText>
+                      </w:r>
+                      <w:r>
+                        <w:fldChar w:fldCharType="separate"/>
+                      </w:r>
+                      <w:r>
+                        <w:rPr>
+                          <w:noProof/>
+                        </w:rPr>
+                        <w:t>1</w:t>
+                      </w:r>
+                      <w:r>
+                        <w:fldChar w:fldCharType="end"/>
+                      </w:r>
+                      <w:r>
+                        <w:t xml:space="preserve">: </w:t>
+                      </w:r>
+                      <w:proofErr w:type="spellStart"/>
+                      <w:r>
+                        <w:t>RectangleCalculator</w:t>
+                      </w:r>
+                      <w:proofErr w:type="spellEnd"/>
+                    </w:p>
+                  </w:txbxContent>
+                </v:textbox>
+                <w10:wrap type="topAndBottom"/>
+              </v:shape>
+            </w:pict>
+          </mc:Fallback>
+        </mc:AlternateContent>
+      </w:r>
+      <w:r>
+        <w:drawing>
+          <wp:anchor distT="0" distB="0" distL="114300" distR="114300" simplePos="0" relativeHeight="251662336" behindDoc="0" locked="0" layoutInCell="1" allowOverlap="1" wp14:anchorId="7FC8AC6C" wp14:editId="36BDE926">
+            <wp:simplePos x="0" y="0"/>
+            <wp:positionH relativeFrom="column">
+              <wp:posOffset>177495</wp:posOffset>
+            </wp:positionH>
+            <wp:positionV relativeFrom="paragraph">
+              <wp:posOffset>289453</wp:posOffset>
+            </wp:positionV>
+            <wp:extent cx="5182870" cy="4582160"/>
+            <wp:effectExtent l="0" t="0" r="0" b="8890"/>
+            <wp:wrapTopAndBottom/>
+            <wp:docPr id="1879396722" name="Picture 1" descr="A computer screen shot of a program&#10;&#10;AI-generated content may be incorrect."/>
+            <wp:cNvGraphicFramePr>
+              <a:graphicFrameLocks xmlns:a="http://schemas.openxmlformats.org/drawingml/2006/main" noChangeAspect="1"/>
+            </wp:cNvGraphicFramePr>
+            <a:graphic xmlns:a="http://schemas.openxmlformats.org/drawingml/2006/main">
+              <a:graphicData uri="http://schemas.openxmlformats.org/drawingml/2006/picture">
+                <pic:pic xmlns:pic="http://schemas.openxmlformats.org/drawingml/2006/picture">
+                  <pic:nvPicPr>
+                    <pic:cNvPr id="1879396722" name="Picture 1" descr="A computer screen shot of a program&#10;&#10;AI-generated content may be incorrect."/>
+                    <pic:cNvPicPr/>
+                  </pic:nvPicPr>
+                  <pic:blipFill>
+                    <a:blip r:embed="rId8">
+                      <a:extLst>
+                        <a:ext uri="{28A0092B-C50C-407E-A947-70E740481C1C}">
+                          <a14:useLocalDpi xmlns:a14="http://schemas.microsoft.com/office/drawing/2010/main" val="0"/>
+                        </a:ext>
+                      </a:extLst>
+                    </a:blip>
+                    <a:stretch>
+                      <a:fillRect/>
+                    </a:stretch>
+                  </pic:blipFill>
+                  <pic:spPr>
+                    <a:xfrm>
+                      <a:off x="0" y="0"/>
+                      <a:ext cx="5182870" cy="4582160"/>
+                    </a:xfrm>
+                    <a:prstGeom prst="rect">
+                      <a:avLst/>
+                    </a:prstGeom>
+                  </pic:spPr>
+                </pic:pic>
+              </a:graphicData>
+            </a:graphic>
+          </wp:anchor>
+        </w:drawing>
+      </w:r>
+    </w:p>
+    <w:p/>
+    <w:p>
       <w:pPr>
         <w:pStyle w:val="Heading2"/>
       </w:pPr>
       <w:bookmarkStart w:id="3" w:name="_Toc212464877"/>
       <w:r>
+        <w:lastRenderedPageBreak/>
         <w:t>Tests</w:t>
       </w:r>
       <w:bookmarkEnd w:id="3"/>
     </w:p>
+    <w:p>
+      <w:r>
+        <w:rPr>
+          <w:noProof/>
+        </w:rPr>
+        <mc:AlternateContent>
+          <mc:Choice Requires="wps">
+            <w:drawing>
+              <wp:anchor distT="0" distB="0" distL="114300" distR="114300" simplePos="0" relativeHeight="251667456" behindDoc="0" locked="0" layoutInCell="1" allowOverlap="1" wp14:anchorId="32787B37" wp14:editId="123B18BB">
+                <wp:simplePos x="0" y="0"/>
+                <wp:positionH relativeFrom="column">
+                  <wp:posOffset>1410335</wp:posOffset>
+                </wp:positionH>
+                <wp:positionV relativeFrom="paragraph">
+                  <wp:posOffset>1698625</wp:posOffset>
+                </wp:positionV>
+                <wp:extent cx="2362200" cy="635"/>
+                <wp:effectExtent l="0" t="0" r="0" b="0"/>
+                <wp:wrapTopAndBottom/>
+                <wp:docPr id="1909723908" name="Text Box 1"/>
+                <wp:cNvGraphicFramePr/>
+                <a:graphic xmlns:a="http://schemas.openxmlformats.org/drawingml/2006/main">
+                  <a:graphicData uri="http://schemas.microsoft.com/office/word/2010/wordprocessingShape">
+                    <wps:wsp>
+                      <wps:cNvSpPr txBox="1"/>
+                      <wps:spPr>
+                        <a:xfrm>
+                          <a:off x="0" y="0"/>
+                          <a:ext cx="2362200" cy="635"/>
+                        </a:xfrm>
+                        <a:prstGeom prst="rect">
+                          <a:avLst/>
+                        </a:prstGeom>
+                        <a:solidFill>
+                          <a:prstClr val="white"/>
+                        </a:solidFill>
+                        <a:ln>
+                          <a:noFill/>
+                        </a:ln>
+                      </wps:spPr>
+                      <wps:txbx>
+                        <w:txbxContent>
+                          <w:p>
+                            <w:pPr>
+                              <w:pStyle w:val="Caption"/>
+                            </w:pPr>
+                            <w:r>
+                              <w:t xml:space="preserve">Figure </w:t>
+                            </w:r>
+                            <w:r>
+                              <w:fldChar w:fldCharType="begin"/>
+                            </w:r>
+                            <w:r>
+                              <w:instrText xml:space="preserve"> SEQ Figure \* ARABIC </w:instrText>
+                            </w:r>
+                            <w:r>
+                              <w:fldChar w:fldCharType="separate"/>
+                            </w:r>
+                            <w:r>
+                              <w:rPr>
+                                <w:noProof/>
+                              </w:rPr>
+                              <w:t>2</w:t>
+                            </w:r>
+                            <w:r>
+                              <w:fldChar w:fldCharType="end"/>
+                            </w:r>
+                            <w:r>
+                              <w:t>: Test Output</w:t>
+                            </w:r>
+                          </w:p>
+                        </w:txbxContent>
+                      </wps:txbx>
+                      <wps:bodyPr rot="0" spcFirstLastPara="0" vertOverflow="overflow" horzOverflow="overflow" vert="horz" wrap="square" lIns="0" tIns="0" rIns="0" bIns="0" numCol="1" spcCol="0" rtlCol="0" fromWordArt="0" anchor="t" anchorCtr="0" forceAA="0" compatLnSpc="1">
+                        <a:prstTxWarp prst="textNoShape">
+                          <a:avLst/>
+                        </a:prstTxWarp>
+                        <a:spAutoFit/>
+                      </wps:bodyPr>
+                    </wps:wsp>
+                  </a:graphicData>
+                </a:graphic>
+              </wp:anchor>
+            </w:drawing>
+          </mc:Choice>
+          <mc:Fallback>
+            <w:pict>
+              <v:shape w14:anchorId="32787B37" id="_x0000_s1029" type="#_x0000_t202" style="position:absolute;left:0;text-align:left;margin-left:111.05pt;margin-top:133.75pt;width:186pt;height:.05pt;z-index:251667456;visibility:visible;mso-wrap-style:square;mso-wrap-distance-left:9pt;mso-wrap-distance-top:0;mso-wrap-distance-right:9pt;mso-wrap-distance-bottom:0;mso-position-horizontal:absolute;mso-position-horizontal-relative:text;mso-position-vertical:absolute;mso-position-vertical-relative:text;v-text-anchor:top" o:gfxdata="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" stroked="f">
+                <v:textbox style="mso-fit-shape-to-text:t" inset="0,0,0,0">
+                  <w:txbxContent>
+                    <w:p>
+                      <w:pPr>
+                        <w:pStyle w:val="Caption"/>
+                      </w:pPr>
+                      <w:r>
+                        <w:t xml:space="preserve">Figure </w:t>
+                      </w:r>
+                      <w:r>
+                        <w:fldChar w:fldCharType="begin"/>
+                      </w:r>
+                      <w:r>
+                        <w:instrText xml:space="preserve"> SEQ Figure \* ARABIC </w:instrText>
+                      </w:r>
+                      <w:r>
+                        <w:fldChar w:fldCharType="separate"/>
+                      </w:r>
+                      <w:r>
+                        <w:rPr>
+                          <w:noProof/>
+                        </w:rPr>
+                        <w:t>2</w:t>
+                      </w:r>
+                      <w:r>
+                        <w:fldChar w:fldCharType="end"/>
+                      </w:r>
+                      <w:r>
+                        <w:t>: Test Output</w:t>
+                      </w:r>
+                    </w:p>
+                  </w:txbxContent>
+                </v:textbox>
+                <w10:wrap type="topAndBottom"/>
+              </v:shape>
+            </w:pict>
+          </mc:Fallback>
+        </mc:AlternateContent>
+      </w:r>
+      <w:r>
+        <w:drawing>
+          <wp:anchor distT="0" distB="0" distL="114300" distR="114300" simplePos="0" relativeHeight="251665408" behindDoc="0" locked="0" layoutInCell="1" allowOverlap="1" wp14:anchorId="76EB206C" wp14:editId="7370681B">
+            <wp:simplePos x="0" y="0"/>
+            <wp:positionH relativeFrom="margin">
+              <wp:align>center</wp:align>
+            </wp:positionH>
+            <wp:positionV relativeFrom="paragraph">
+              <wp:posOffset>365711</wp:posOffset>
+            </wp:positionV>
+            <wp:extent cx="2362530" cy="1276528"/>
+            <wp:effectExtent l="0" t="0" r="0" b="0"/>
+            <wp:wrapTopAndBottom/>
+            <wp:docPr id="899339545" name="Picture 1" descr="A white background with black text&#10;&#10;AI-generated content may be incorrect."/>
+            <wp:cNvGraphicFramePr>
+              <a:graphicFrameLocks xmlns:a="http://schemas.openxmlformats.org/drawingml/2006/main" noChangeAspect="1"/>
+            </wp:cNvGraphicFramePr>
+            <a:graphic xmlns:a="http://schemas.openxmlformats.org/drawingml/2006/main">
+              <a:graphicData uri="http://schemas.openxmlformats.org/drawingml/2006/picture">
+                <pic:pic xmlns:pic="http://schemas.openxmlformats.org/drawingml/2006/picture">
+                  <pic:nvPicPr>
+                    <pic:cNvPr id="899339545" name="Picture 1" descr="A white background with black text&#10;&#10;AI-generated content may be incorrect."/>
+                    <pic:cNvPicPr/>
+                  </pic:nvPicPr>
+                  <pic:blipFill>
+                    <a:blip r:embed="rId9">
+                      <a:extLst>
+                        <a:ext uri="{28A0092B-C50C-407E-A947-70E740481C1C}">
+                          <a14:useLocalDpi xmlns:a14="http://schemas.microsoft.com/office/drawing/2010/main" val="0"/>
+                        </a:ext>
+                      </a:extLst>
+                    </a:blip>
+                    <a:stretch>
+                      <a:fillRect/>
+                    </a:stretch>
+                  </pic:blipFill>
+                  <pic:spPr>
+                    <a:xfrm>
+                      <a:off x="0" y="0"/>
+                      <a:ext cx="2362530" cy="1276528"/>
+                    </a:xfrm>
+                    <a:prstGeom prst="rect">
+                      <a:avLst/>
+                    </a:prstGeom>
+                  </pic:spPr>
+                </pic:pic>
+              </a:graphicData>
+            </a:graphic>
+          </wp:anchor>
+        </w:drawing>
+      </w:r>
+    </w:p>
+    <w:p>
+      <w:r>
+        <w:rPr>
+          <w:noProof/>
+        </w:rPr>
+        <mc:AlternateContent>
+          <mc:Choice Requires="wps">
+            <w:drawing>
+              <wp:anchor distT="0" distB="0" distL="114300" distR="114300" simplePos="0" relativeHeight="251670528" behindDoc="0" locked="0" layoutInCell="1" allowOverlap="1" wp14:anchorId="3210B43D" wp14:editId="54058389">
+                <wp:simplePos x="0" y="0"/>
+                <wp:positionH relativeFrom="column">
+                  <wp:posOffset>1162685</wp:posOffset>
+                </wp:positionH>
+                <wp:positionV relativeFrom="paragraph">
+                  <wp:posOffset>3137535</wp:posOffset>
+                </wp:positionV>
+                <wp:extent cx="3352800" cy="635"/>
+                <wp:effectExtent l="0" t="0" r="0" b="0"/>
+                <wp:wrapTopAndBottom/>
+                <wp:docPr id="2073880127" name="Text Box 1"/>
+                <wp:cNvGraphicFramePr/>
+                <a:graphic xmlns:a="http://schemas.openxmlformats.org/drawingml/2006/main">
+                  <a:graphicData uri="http://schemas.microsoft.com/office/word/2010/wordprocessingShape">
+                    <wps:wsp>
+                      <wps:cNvSpPr txBox="1"/>
+                      <wps:spPr>
+                        <a:xfrm>
+                          <a:off x="0" y="0"/>
+                          <a:ext cx="3352800" cy="635"/>
+                        </a:xfrm>
+                        <a:prstGeom prst="rect">
+                          <a:avLst/>
+                        </a:prstGeom>
+                        <a:solidFill>
+                          <a:prstClr val="white"/>
+                        </a:solidFill>
+                        <a:ln>
+                          <a:noFill/>
+                        </a:ln>
+                      </wps:spPr>
+                      <wps:txbx>
+                        <w:txbxContent>
+                          <w:p>
+                            <w:pPr>
+                              <w:pStyle w:val="Caption"/>
+                            </w:pPr>
+                            <w:r>
+                              <w:t xml:space="preserve">Figure </w:t>
+                            </w:r>
+                            <w:r>
+                              <w:fldChar w:fldCharType="begin"/>
+                            </w:r>
+                            <w:r>
+                              <w:instrText xml:space="preserve"> SEQ Figure \* ARABIC </w:instrText>
+                            </w:r>
+                            <w:r>
+                              <w:fldChar w:fldCharType="separate"/>
+                            </w:r>
+                            <w:r>
+                              <w:rPr>
+                                <w:noProof/>
+                              </w:rPr>
+                              <w:t>3</w:t>
+                            </w:r>
+                            <w:r>
+                              <w:fldChar w:fldCharType="end"/>
+                            </w:r>
+                            <w:r>
+                              <w:t>: Unit Tests</w:t>
+                            </w:r>
+                          </w:p>
+                        </w:txbxContent>
+                      </wps:txbx>
+                      <wps:bodyPr rot="0" spcFirstLastPara="0" vertOverflow="overflow" horzOverflow="overflow" vert="horz" wrap="square" lIns="0" tIns="0" rIns="0" bIns="0" numCol="1" spcCol="0" rtlCol="0" fromWordArt="0" anchor="t" anchorCtr="0" forceAA="0" compatLnSpc="1">
+                        <a:prstTxWarp prst="textNoShape">
+                          <a:avLst/>
+                        </a:prstTxWarp>
+                        <a:spAutoFit/>
+                      </wps:bodyPr>
+                    </wps:wsp>
+                  </a:graphicData>
+                </a:graphic>
+              </wp:anchor>
+            </w:drawing>
+          </mc:Choice>
+          <mc:Fallback>
+            <w:pict>
+              <v:shape w14:anchorId="3210B43D" id="_x0000_s1030" type="#_x0000_t202" style="position:absolute;left:0;text-align:left;margin-left:91.55pt;margin-top:247.05pt;width:264pt;height:.05pt;z-index:251670528;visibility:visible;mso-wrap-style:square;mso-wrap-distance-left:9pt;mso-wrap-distance-top:0;mso-wrap-distance-right:9pt;mso-wrap-distance-bottom:0;mso-position-horizontal:absolute;mso-position-horizontal-relative:text;mso-position-vertical:absolute;mso-position-vertical-relative:text;v-text-anchor:top" o:gfxdata="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" stroked="f">
+                <v:textbox style="mso-fit-shape-to-text:t" inset="0,0,0,0">
+                  <w:txbxContent>
+                    <w:p>
+                      <w:pPr>
+                        <w:pStyle w:val="Caption"/>
+                      </w:pPr>
+                      <w:r>
+                        <w:t xml:space="preserve">Figure </w:t>
+                      </w:r>
+                      <w:r>
+                        <w:fldChar w:fldCharType="begin"/>
+                      </w:r>
+                      <w:r>
+                        <w:instrText xml:space="preserve"> SEQ Figure \* ARABIC </w:instrText>
+                      </w:r>
+                      <w:r>
+                        <w:fldChar w:fldCharType="separate"/>
+                      </w:r>
+                      <w:r>
+                        <w:rPr>
+                          <w:noProof/>
+                        </w:rPr>
+                        <w:t>3</w:t>
+                      </w:r>
+                      <w:r>
+                        <w:fldChar w:fldCharType="end"/>
+                      </w:r>
+                      <w:r>
+                        <w:t>: Unit Tests</w:t>
+                      </w:r>
+                    </w:p>
+                  </w:txbxContent>
+                </v:textbox>
+                <w10:wrap type="topAndBottom"/>
+              </v:shape>
+            </w:pict>
+          </mc:Fallback>
+        </mc:AlternateContent>
+      </w:r>
+      <w:r>
+        <w:drawing>
+          <wp:anchor distT="0" distB="0" distL="114300" distR="114300" simplePos="0" relativeHeight="251668480" behindDoc="0" locked="0" layoutInCell="1" allowOverlap="1" wp14:anchorId="0810C21A" wp14:editId="2F9BB37B">
+            <wp:simplePos x="0" y="0"/>
+            <wp:positionH relativeFrom="column">
+              <wp:posOffset>1163147</wp:posOffset>
+            </wp:positionH>
+            <wp:positionV relativeFrom="paragraph">
+              <wp:posOffset>2023432</wp:posOffset>
+            </wp:positionV>
+            <wp:extent cx="3353268" cy="1057423"/>
+            <wp:effectExtent l="0" t="0" r="0" b="9525"/>
+            <wp:wrapTopAndBottom/>
+            <wp:docPr id="1825386819" name="Picture 1"/>
+            <wp:cNvGraphicFramePr>
+              <a:graphicFrameLocks xmlns:a="http://schemas.openxmlformats.org/drawingml/2006/main" noChangeAspect="1"/>
+            </wp:cNvGraphicFramePr>
+            <a:graphic xmlns:a="http://schemas.openxmlformats.org/drawingml/2006/main">
+              <a:graphicData uri="http://schemas.openxmlformats.org/drawingml/2006/picture">
+                <pic:pic xmlns:pic="http://schemas.openxmlformats.org/drawingml/2006/picture">
+                  <pic:nvPicPr>
+                    <pic:cNvPr id="1825386819" name=""/>
+                    <pic:cNvPicPr/>
+                  </pic:nvPicPr>
+                  <pic:blipFill>
+                    <a:blip r:embed="rId10">
+                      <a:extLst>
+                        <a:ext uri="{28A0092B-C50C-407E-A947-70E740481C1C}">
+                          <a14:useLocalDpi xmlns:a14="http://schemas.microsoft.com/office/drawing/2010/main" val="0"/>
+                        </a:ext>
+                      </a:extLst>
+                    </a:blip>
+                    <a:stretch>
+                      <a:fillRect/>
+                    </a:stretch>
+                  </pic:blipFill>
+                  <pic:spPr>
+                    <a:xfrm>
+                      <a:off x="0" y="0"/>
+                      <a:ext cx="3353268" cy="1057423"/>
+                    </a:xfrm>
+                    <a:prstGeom prst="rect">
+                      <a:avLst/>
+                    </a:prstGeom>
+                  </pic:spPr>
+                </pic:pic>
+              </a:graphicData>
+            </a:graphic>
+          </wp:anchor>
+        </w:drawing>
+      </w:r>
+    </w:p>
+    <w:p/>
     <w:p>
       <w:pPr>
         <w:jc w:val="left"/>
@@ -2500,9 +3051,9 @@
     </w:p>
     <w:p/>
     <w:sectPr>
-      <w:headerReference w:type="default" r:id="rId8"/>
-      <w:footerReference w:type="default" r:id="rId9"/>
-      <w:headerReference w:type="first" r:id="rId10"/>
+      <w:headerReference w:type="default" r:id="rId11"/>
+      <w:footerReference w:type="default" r:id="rId12"/>
+      <w:headerReference w:type="first" r:id="rId13"/>
       <w:pgSz w:w="11906" w:h="16838"/>
       <w:pgMar w:top="1872" w:right="1872" w:bottom="1872" w:left="1872" w:header="706" w:footer="706" w:gutter="0"/>
       <w:pgNumType w:start="0"/>

</xml_diff>

<commit_message>
Add FizzBuzz implementation and tests
Introduced a FizzBuzz class with logic to print FizzBuzz results up to a specified count. Updated Main to run FizzBuzz after rectangle calculations. Added unit tests for FizzBuzz output. Updated Protocol.docx.
</commit_message>
<xml_diff>
--- a/Modules/Semester_1/Modern Code/Aufgaben/02_Java_Variables_Types_Expression_Control_Structures/Protocol.docx
+++ b/Modules/Semester_1/Modern Code/Aufgaben/02_Java_Variables_Types_Expression_Control_Structures/Protocol.docx
@@ -2794,6 +2794,14 @@
       <w:bookmarkEnd w:id="5"/>
     </w:p>
     <w:p>
+      <w:r>
+        <w:t>Using if-statement, one can check whether a number is divisible by 5 or 3 and return the corresponding Fizz or Buzz.</w:t>
+      </w:r>
+      <w:r>
+        <w:t xml:space="preserve"> This can run inside a for-loop.</w:t>
+      </w:r>
+    </w:p>
+    <w:p>
       <w:pPr>
         <w:pStyle w:val="Heading2"/>
       </w:pPr>
@@ -2804,6 +2812,392 @@
       <w:bookmarkEnd w:id="6"/>
     </w:p>
     <w:p>
+      <w:r>
+        <w:rPr>
+          <w:noProof/>
+        </w:rPr>
+        <mc:AlternateContent>
+          <mc:Choice Requires="wps">
+            <w:drawing>
+              <wp:anchor distT="0" distB="0" distL="114300" distR="114300" simplePos="0" relativeHeight="251673600" behindDoc="0" locked="0" layoutInCell="1" allowOverlap="1" wp14:anchorId="40C2A37A" wp14:editId="52C00166">
+                <wp:simplePos x="0" y="0"/>
+                <wp:positionH relativeFrom="column">
+                  <wp:posOffset>465455</wp:posOffset>
+                </wp:positionH>
+                <wp:positionV relativeFrom="paragraph">
+                  <wp:posOffset>5842635</wp:posOffset>
+                </wp:positionV>
+                <wp:extent cx="4251325" cy="635"/>
+                <wp:effectExtent l="0" t="0" r="0" b="0"/>
+                <wp:wrapTopAndBottom/>
+                <wp:docPr id="1938758989" name="Text Box 1"/>
+                <wp:cNvGraphicFramePr/>
+                <a:graphic xmlns:a="http://schemas.openxmlformats.org/drawingml/2006/main">
+                  <a:graphicData uri="http://schemas.microsoft.com/office/word/2010/wordprocessingShape">
+                    <wps:wsp>
+                      <wps:cNvSpPr txBox="1"/>
+                      <wps:spPr>
+                        <a:xfrm>
+                          <a:off x="0" y="0"/>
+                          <a:ext cx="4251325" cy="635"/>
+                        </a:xfrm>
+                        <a:prstGeom prst="rect">
+                          <a:avLst/>
+                        </a:prstGeom>
+                        <a:solidFill>
+                          <a:prstClr val="white"/>
+                        </a:solidFill>
+                        <a:ln>
+                          <a:noFill/>
+                        </a:ln>
+                      </wps:spPr>
+                      <wps:txbx>
+                        <w:txbxContent>
+                          <w:p>
+                            <w:pPr>
+                              <w:pStyle w:val="Caption"/>
+                            </w:pPr>
+                            <w:r>
+                              <w:t xml:space="preserve">Figure </w:t>
+                            </w:r>
+                            <w:r>
+                              <w:fldChar w:fldCharType="begin"/>
+                            </w:r>
+                            <w:r>
+                              <w:instrText xml:space="preserve"> SEQ Figure \* ARABIC </w:instrText>
+                            </w:r>
+                            <w:r>
+                              <w:fldChar w:fldCharType="separate"/>
+                            </w:r>
+                            <w:r>
+                              <w:rPr>
+                                <w:noProof/>
+                              </w:rPr>
+                              <w:t>4</w:t>
+                            </w:r>
+                            <w:r>
+                              <w:fldChar w:fldCharType="end"/>
+                            </w:r>
+                            <w:r>
+                              <w:t xml:space="preserve">: </w:t>
+                            </w:r>
+                            <w:proofErr w:type="spellStart"/>
+                            <w:r>
+                              <w:t>FizzBuzz</w:t>
+                            </w:r>
+                            <w:proofErr w:type="spellEnd"/>
+                          </w:p>
+                        </w:txbxContent>
+                      </wps:txbx>
+                      <wps:bodyPr rot="0" spcFirstLastPara="0" vertOverflow="overflow" horzOverflow="overflow" vert="horz" wrap="square" lIns="0" tIns="0" rIns="0" bIns="0" numCol="1" spcCol="0" rtlCol="0" fromWordArt="0" anchor="t" anchorCtr="0" forceAA="0" compatLnSpc="1">
+                        <a:prstTxWarp prst="textNoShape">
+                          <a:avLst/>
+                        </a:prstTxWarp>
+                        <a:spAutoFit/>
+                      </wps:bodyPr>
+                    </wps:wsp>
+                  </a:graphicData>
+                </a:graphic>
+              </wp:anchor>
+            </w:drawing>
+          </mc:Choice>
+          <mc:Fallback>
+            <w:pict>
+              <v:shape w14:anchorId="40C2A37A" id="_x0000_s1031" type="#_x0000_t202" style="position:absolute;left:0;text-align:left;margin-left:36.65pt;margin-top:460.05pt;width:334.75pt;height:.05pt;z-index:251673600;visibility:visible;mso-wrap-style:square;mso-wrap-distance-left:9pt;mso-wrap-distance-top:0;mso-wrap-distance-right:9pt;mso-wrap-distance-bottom:0;mso-position-horizontal:absolute;mso-position-horizontal-relative:text;mso-position-vertical:absolute;mso-position-vertical-relative:text;v-text-anchor:top" o:gfxdata="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" stroked="f">
+                <v:textbox style="mso-fit-shape-to-text:t" inset="0,0,0,0">
+                  <w:txbxContent>
+                    <w:p>
+                      <w:pPr>
+                        <w:pStyle w:val="Caption"/>
+                      </w:pPr>
+                      <w:r>
+                        <w:t xml:space="preserve">Figure </w:t>
+                      </w:r>
+                      <w:r>
+                        <w:fldChar w:fldCharType="begin"/>
+                      </w:r>
+                      <w:r>
+                        <w:instrText xml:space="preserve"> SEQ Figure \* ARABIC </w:instrText>
+                      </w:r>
+                      <w:r>
+                        <w:fldChar w:fldCharType="separate"/>
+                      </w:r>
+                      <w:r>
+                        <w:rPr>
+                          <w:noProof/>
+                        </w:rPr>
+                        <w:t>4</w:t>
+                      </w:r>
+                      <w:r>
+                        <w:fldChar w:fldCharType="end"/>
+                      </w:r>
+                      <w:r>
+                        <w:t xml:space="preserve">: </w:t>
+                      </w:r>
+                      <w:proofErr w:type="spellStart"/>
+                      <w:r>
+                        <w:t>FizzBuzz</w:t>
+                      </w:r>
+                      <w:proofErr w:type="spellEnd"/>
+                    </w:p>
+                  </w:txbxContent>
+                </v:textbox>
+                <w10:wrap type="topAndBottom"/>
+              </v:shape>
+            </w:pict>
+          </mc:Fallback>
+        </mc:AlternateContent>
+      </w:r>
+      <w:r>
+        <w:drawing>
+          <wp:anchor distT="0" distB="0" distL="114300" distR="114300" simplePos="0" relativeHeight="251671552" behindDoc="0" locked="0" layoutInCell="1" allowOverlap="1" wp14:anchorId="3D22D195" wp14:editId="644F0D37">
+            <wp:simplePos x="0" y="0"/>
+            <wp:positionH relativeFrom="margin">
+              <wp:align>center</wp:align>
+            </wp:positionH>
+            <wp:positionV relativeFrom="paragraph">
+              <wp:posOffset>367684</wp:posOffset>
+            </wp:positionV>
+            <wp:extent cx="4251325" cy="5417820"/>
+            <wp:effectExtent l="0" t="0" r="0" b="0"/>
+            <wp:wrapTopAndBottom/>
+            <wp:docPr id="311025367" name="Picture 1" descr="A screenshot of a computer program&#10;&#10;AI-generated content may be incorrect."/>
+            <wp:cNvGraphicFramePr>
+              <a:graphicFrameLocks xmlns:a="http://schemas.openxmlformats.org/drawingml/2006/main" noChangeAspect="1"/>
+            </wp:cNvGraphicFramePr>
+            <a:graphic xmlns:a="http://schemas.openxmlformats.org/drawingml/2006/main">
+              <a:graphicData uri="http://schemas.openxmlformats.org/drawingml/2006/picture">
+                <pic:pic xmlns:pic="http://schemas.openxmlformats.org/drawingml/2006/picture">
+                  <pic:nvPicPr>
+                    <pic:cNvPr id="311025367" name="Picture 1" descr="A screenshot of a computer program&#10;&#10;AI-generated content may be incorrect."/>
+                    <pic:cNvPicPr/>
+                  </pic:nvPicPr>
+                  <pic:blipFill>
+                    <a:blip r:embed="rId11">
+                      <a:extLst>
+                        <a:ext uri="{28A0092B-C50C-407E-A947-70E740481C1C}">
+                          <a14:useLocalDpi xmlns:a14="http://schemas.microsoft.com/office/drawing/2010/main" val="0"/>
+                        </a:ext>
+                      </a:extLst>
+                    </a:blip>
+                    <a:stretch>
+                      <a:fillRect/>
+                    </a:stretch>
+                  </pic:blipFill>
+                  <pic:spPr>
+                    <a:xfrm>
+                      <a:off x="0" y="0"/>
+                      <a:ext cx="4251325" cy="5417820"/>
+                    </a:xfrm>
+                    <a:prstGeom prst="rect">
+                      <a:avLst/>
+                    </a:prstGeom>
+                  </pic:spPr>
+                </pic:pic>
+              </a:graphicData>
+            </a:graphic>
+            <wp14:sizeRelH relativeFrom="margin">
+              <wp14:pctWidth>0</wp14:pctWidth>
+            </wp14:sizeRelH>
+            <wp14:sizeRelV relativeFrom="margin">
+              <wp14:pctHeight>0</wp14:pctHeight>
+            </wp14:sizeRelV>
+          </wp:anchor>
+        </w:drawing>
+      </w:r>
+    </w:p>
+    <w:p/>
+    <w:p>
+      <w:r>
+        <w:rPr>
+          <w:noProof/>
+        </w:rPr>
+        <w:lastRenderedPageBreak/>
+        <mc:AlternateContent>
+          <mc:Choice Requires="wps">
+            <w:drawing>
+              <wp:anchor distT="0" distB="0" distL="114300" distR="114300" simplePos="0" relativeHeight="251676672" behindDoc="0" locked="0" layoutInCell="1" allowOverlap="1" wp14:anchorId="0D7320C6" wp14:editId="450F3041">
+                <wp:simplePos x="0" y="0"/>
+                <wp:positionH relativeFrom="column">
+                  <wp:posOffset>638810</wp:posOffset>
+                </wp:positionH>
+                <wp:positionV relativeFrom="paragraph">
+                  <wp:posOffset>2573020</wp:posOffset>
+                </wp:positionV>
+                <wp:extent cx="3895725" cy="635"/>
+                <wp:effectExtent l="0" t="0" r="0" b="0"/>
+                <wp:wrapTopAndBottom/>
+                <wp:docPr id="428164717" name="Text Box 1"/>
+                <wp:cNvGraphicFramePr/>
+                <a:graphic xmlns:a="http://schemas.openxmlformats.org/drawingml/2006/main">
+                  <a:graphicData uri="http://schemas.microsoft.com/office/word/2010/wordprocessingShape">
+                    <wps:wsp>
+                      <wps:cNvSpPr txBox="1"/>
+                      <wps:spPr>
+                        <a:xfrm>
+                          <a:off x="0" y="0"/>
+                          <a:ext cx="3895725" cy="635"/>
+                        </a:xfrm>
+                        <a:prstGeom prst="rect">
+                          <a:avLst/>
+                        </a:prstGeom>
+                        <a:solidFill>
+                          <a:prstClr val="white"/>
+                        </a:solidFill>
+                        <a:ln>
+                          <a:noFill/>
+                        </a:ln>
+                      </wps:spPr>
+                      <wps:txbx>
+                        <w:txbxContent>
+                          <w:p>
+                            <w:pPr>
+                              <w:pStyle w:val="Caption"/>
+                            </w:pPr>
+                            <w:r>
+                              <w:t xml:space="preserve">Figure </w:t>
+                            </w:r>
+                            <w:r>
+                              <w:fldChar w:fldCharType="begin"/>
+                            </w:r>
+                            <w:r>
+                              <w:instrText xml:space="preserve"> SEQ Figure \* ARABIC </w:instrText>
+                            </w:r>
+                            <w:r>
+                              <w:fldChar w:fldCharType="separate"/>
+                            </w:r>
+                            <w:r>
+                              <w:rPr>
+                                <w:noProof/>
+                              </w:rPr>
+                              <w:t>5</w:t>
+                            </w:r>
+                            <w:r>
+                              <w:fldChar w:fldCharType="end"/>
+                            </w:r>
+                            <w:r>
+                              <w:t xml:space="preserve">: </w:t>
+                            </w:r>
+                            <w:proofErr w:type="spellStart"/>
+                            <w:r>
+                              <w:t>FizzBuzz</w:t>
+                            </w:r>
+                            <w:proofErr w:type="spellEnd"/>
+                          </w:p>
+                        </w:txbxContent>
+                      </wps:txbx>
+                      <wps:bodyPr rot="0" spcFirstLastPara="0" vertOverflow="overflow" horzOverflow="overflow" vert="horz" wrap="square" lIns="0" tIns="0" rIns="0" bIns="0" numCol="1" spcCol="0" rtlCol="0" fromWordArt="0" anchor="t" anchorCtr="0" forceAA="0" compatLnSpc="1">
+                        <a:prstTxWarp prst="textNoShape">
+                          <a:avLst/>
+                        </a:prstTxWarp>
+                        <a:spAutoFit/>
+                      </wps:bodyPr>
+                    </wps:wsp>
+                  </a:graphicData>
+                </a:graphic>
+              </wp:anchor>
+            </w:drawing>
+          </mc:Choice>
+          <mc:Fallback>
+            <w:pict>
+              <v:shape w14:anchorId="0D7320C6" id="_x0000_s1032" type="#_x0000_t202" style="position:absolute;left:0;text-align:left;margin-left:50.3pt;margin-top:202.6pt;width:306.75pt;height:.05pt;z-index:251676672;visibility:visible;mso-wrap-style:square;mso-wrap-distance-left:9pt;mso-wrap-distance-top:0;mso-wrap-distance-right:9pt;mso-wrap-distance-bottom:0;mso-position-horizontal:absolute;mso-position-horizontal-relative:text;mso-position-vertical:absolute;mso-position-vertical-relative:text;v-text-anchor:top" o:gfxdata="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" stroked="f">
+                <v:textbox style="mso-fit-shape-to-text:t" inset="0,0,0,0">
+                  <w:txbxContent>
+                    <w:p>
+                      <w:pPr>
+                        <w:pStyle w:val="Caption"/>
+                      </w:pPr>
+                      <w:r>
+                        <w:t xml:space="preserve">Figure </w:t>
+                      </w:r>
+                      <w:r>
+                        <w:fldChar w:fldCharType="begin"/>
+                      </w:r>
+                      <w:r>
+                        <w:instrText xml:space="preserve"> SEQ Figure \* ARABIC </w:instrText>
+                      </w:r>
+                      <w:r>
+                        <w:fldChar w:fldCharType="separate"/>
+                      </w:r>
+                      <w:r>
+                        <w:rPr>
+                          <w:noProof/>
+                        </w:rPr>
+                        <w:t>5</w:t>
+                      </w:r>
+                      <w:r>
+                        <w:fldChar w:fldCharType="end"/>
+                      </w:r>
+                      <w:r>
+                        <w:t xml:space="preserve">: </w:t>
+                      </w:r>
+                      <w:proofErr w:type="spellStart"/>
+                      <w:r>
+                        <w:t>FizzBuzz</w:t>
+                      </w:r>
+                      <w:proofErr w:type="spellEnd"/>
+                    </w:p>
+                  </w:txbxContent>
+                </v:textbox>
+                <w10:wrap type="topAndBottom"/>
+              </v:shape>
+            </w:pict>
+          </mc:Fallback>
+        </mc:AlternateContent>
+      </w:r>
+      <w:r>
+        <w:drawing>
+          <wp:anchor distT="0" distB="0" distL="114300" distR="114300" simplePos="0" relativeHeight="251674624" behindDoc="0" locked="0" layoutInCell="1" allowOverlap="1" wp14:anchorId="04000B4E" wp14:editId="2AF3FD4A">
+            <wp:simplePos x="0" y="0"/>
+            <wp:positionH relativeFrom="margin">
+              <wp:align>center</wp:align>
+            </wp:positionH>
+            <wp:positionV relativeFrom="paragraph">
+              <wp:posOffset>163270</wp:posOffset>
+            </wp:positionV>
+            <wp:extent cx="3896269" cy="2353003"/>
+            <wp:effectExtent l="0" t="0" r="9525" b="0"/>
+            <wp:wrapTopAndBottom/>
+            <wp:docPr id="711139831" name="Picture 1" descr="A computer screen shot of text&#10;&#10;AI-generated content may be incorrect."/>
+            <wp:cNvGraphicFramePr>
+              <a:graphicFrameLocks xmlns:a="http://schemas.openxmlformats.org/drawingml/2006/main" noChangeAspect="1"/>
+            </wp:cNvGraphicFramePr>
+            <a:graphic xmlns:a="http://schemas.openxmlformats.org/drawingml/2006/main">
+              <a:graphicData uri="http://schemas.openxmlformats.org/drawingml/2006/picture">
+                <pic:pic xmlns:pic="http://schemas.openxmlformats.org/drawingml/2006/picture">
+                  <pic:nvPicPr>
+                    <pic:cNvPr id="711139831" name="Picture 1" descr="A computer screen shot of text&#10;&#10;AI-generated content may be incorrect."/>
+                    <pic:cNvPicPr/>
+                  </pic:nvPicPr>
+                  <pic:blipFill>
+                    <a:blip r:embed="rId12">
+                      <a:extLst>
+                        <a:ext uri="{28A0092B-C50C-407E-A947-70E740481C1C}">
+                          <a14:useLocalDpi xmlns:a14="http://schemas.microsoft.com/office/drawing/2010/main" val="0"/>
+                        </a:ext>
+                      </a:extLst>
+                    </a:blip>
+                    <a:stretch>
+                      <a:fillRect/>
+                    </a:stretch>
+                  </pic:blipFill>
+                  <pic:spPr>
+                    <a:xfrm>
+                      <a:off x="0" y="0"/>
+                      <a:ext cx="3896269" cy="2353003"/>
+                    </a:xfrm>
+                    <a:prstGeom prst="rect">
+                      <a:avLst/>
+                    </a:prstGeom>
+                  </pic:spPr>
+                </pic:pic>
+              </a:graphicData>
+            </a:graphic>
+          </wp:anchor>
+        </w:drawing>
+      </w:r>
+    </w:p>
+    <w:p>
       <w:pPr>
         <w:pStyle w:val="Heading2"/>
       </w:pPr>
@@ -2813,6 +3207,400 @@
       </w:r>
       <w:bookmarkEnd w:id="7"/>
     </w:p>
+    <w:p>
+      <w:r>
+        <w:rPr>
+          <w:noProof/>
+        </w:rPr>
+        <mc:AlternateContent>
+          <mc:Choice Requires="wps">
+            <w:drawing>
+              <wp:anchor distT="0" distB="0" distL="114300" distR="114300" simplePos="0" relativeHeight="251679744" behindDoc="0" locked="0" layoutInCell="1" allowOverlap="1" wp14:anchorId="001C0062" wp14:editId="759B8DB7">
+                <wp:simplePos x="0" y="0"/>
+                <wp:positionH relativeFrom="column">
+                  <wp:posOffset>1591310</wp:posOffset>
+                </wp:positionH>
+                <wp:positionV relativeFrom="paragraph">
+                  <wp:posOffset>3961130</wp:posOffset>
+                </wp:positionV>
+                <wp:extent cx="2000250" cy="635"/>
+                <wp:effectExtent l="0" t="0" r="0" b="0"/>
+                <wp:wrapTopAndBottom/>
+                <wp:docPr id="1841674132" name="Text Box 1"/>
+                <wp:cNvGraphicFramePr/>
+                <a:graphic xmlns:a="http://schemas.openxmlformats.org/drawingml/2006/main">
+                  <a:graphicData uri="http://schemas.microsoft.com/office/word/2010/wordprocessingShape">
+                    <wps:wsp>
+                      <wps:cNvSpPr txBox="1"/>
+                      <wps:spPr>
+                        <a:xfrm>
+                          <a:off x="0" y="0"/>
+                          <a:ext cx="2000250" cy="635"/>
+                        </a:xfrm>
+                        <a:prstGeom prst="rect">
+                          <a:avLst/>
+                        </a:prstGeom>
+                        <a:solidFill>
+                          <a:prstClr val="white"/>
+                        </a:solidFill>
+                        <a:ln>
+                          <a:noFill/>
+                        </a:ln>
+                      </wps:spPr>
+                      <wps:txbx>
+                        <w:txbxContent>
+                          <w:p>
+                            <w:pPr>
+                              <w:pStyle w:val="Caption"/>
+                            </w:pPr>
+                            <w:r>
+                              <w:t xml:space="preserve">Figure </w:t>
+                            </w:r>
+                            <w:r>
+                              <w:fldChar w:fldCharType="begin"/>
+                            </w:r>
+                            <w:r>
+                              <w:instrText xml:space="preserve"> SEQ Figure \* ARABIC </w:instrText>
+                            </w:r>
+                            <w:r>
+                              <w:fldChar w:fldCharType="separate"/>
+                            </w:r>
+                            <w:r>
+                              <w:rPr>
+                                <w:noProof/>
+                              </w:rPr>
+                              <w:t>6</w:t>
+                            </w:r>
+                            <w:r>
+                              <w:fldChar w:fldCharType="end"/>
+                            </w:r>
+                            <w:r>
+                              <w:t xml:space="preserve">: </w:t>
+                            </w:r>
+                            <w:proofErr w:type="spellStart"/>
+                            <w:r>
+                              <w:t>FizzBuzz</w:t>
+                            </w:r>
+                            <w:proofErr w:type="spellEnd"/>
+                            <w:r>
+                              <w:t xml:space="preserve"> Output</w:t>
+                            </w:r>
+                          </w:p>
+                        </w:txbxContent>
+                      </wps:txbx>
+                      <wps:bodyPr rot="0" spcFirstLastPara="0" vertOverflow="overflow" horzOverflow="overflow" vert="horz" wrap="square" lIns="0" tIns="0" rIns="0" bIns="0" numCol="1" spcCol="0" rtlCol="0" fromWordArt="0" anchor="t" anchorCtr="0" forceAA="0" compatLnSpc="1">
+                        <a:prstTxWarp prst="textNoShape">
+                          <a:avLst/>
+                        </a:prstTxWarp>
+                        <a:spAutoFit/>
+                      </wps:bodyPr>
+                    </wps:wsp>
+                  </a:graphicData>
+                </a:graphic>
+              </wp:anchor>
+            </w:drawing>
+          </mc:Choice>
+          <mc:Fallback>
+            <w:pict>
+              <v:shape w14:anchorId="001C0062" id="_x0000_s1033" type="#_x0000_t202" style="position:absolute;left:0;text-align:left;margin-left:125.3pt;margin-top:311.9pt;width:157.5pt;height:.05pt;z-index:251679744;visibility:visible;mso-wrap-style:square;mso-wrap-distance-left:9pt;mso-wrap-distance-top:0;mso-wrap-distance-right:9pt;mso-wrap-distance-bottom:0;mso-position-horizontal:absolute;mso-position-horizontal-relative:text;mso-position-vertical:absolute;mso-position-vertical-relative:text;v-text-anchor:top" o:gfxdata="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" stroked="f">
+                <v:textbox style="mso-fit-shape-to-text:t" inset="0,0,0,0">
+                  <w:txbxContent>
+                    <w:p>
+                      <w:pPr>
+                        <w:pStyle w:val="Caption"/>
+                      </w:pPr>
+                      <w:r>
+                        <w:t xml:space="preserve">Figure </w:t>
+                      </w:r>
+                      <w:r>
+                        <w:fldChar w:fldCharType="begin"/>
+                      </w:r>
+                      <w:r>
+                        <w:instrText xml:space="preserve"> SEQ Figure \* ARABIC </w:instrText>
+                      </w:r>
+                      <w:r>
+                        <w:fldChar w:fldCharType="separate"/>
+                      </w:r>
+                      <w:r>
+                        <w:rPr>
+                          <w:noProof/>
+                        </w:rPr>
+                        <w:t>6</w:t>
+                      </w:r>
+                      <w:r>
+                        <w:fldChar w:fldCharType="end"/>
+                      </w:r>
+                      <w:r>
+                        <w:t xml:space="preserve">: </w:t>
+                      </w:r>
+                      <w:proofErr w:type="spellStart"/>
+                      <w:r>
+                        <w:t>FizzBuzz</w:t>
+                      </w:r>
+                      <w:proofErr w:type="spellEnd"/>
+                      <w:r>
+                        <w:t xml:space="preserve"> Output</w:t>
+                      </w:r>
+                    </w:p>
+                  </w:txbxContent>
+                </v:textbox>
+                <w10:wrap type="topAndBottom"/>
+              </v:shape>
+            </w:pict>
+          </mc:Fallback>
+        </mc:AlternateContent>
+      </w:r>
+      <w:r>
+        <w:drawing>
+          <wp:anchor distT="0" distB="0" distL="114300" distR="114300" simplePos="0" relativeHeight="251677696" behindDoc="0" locked="0" layoutInCell="1" allowOverlap="1" wp14:anchorId="08A72E9F" wp14:editId="1A451E98">
+            <wp:simplePos x="0" y="0"/>
+            <wp:positionH relativeFrom="margin">
+              <wp:align>center</wp:align>
+            </wp:positionH>
+            <wp:positionV relativeFrom="paragraph">
+              <wp:posOffset>294327</wp:posOffset>
+            </wp:positionV>
+            <wp:extent cx="2000529" cy="3610479"/>
+            <wp:effectExtent l="0" t="0" r="0" b="9525"/>
+            <wp:wrapTopAndBottom/>
+            <wp:docPr id="1643980844" name="Picture 1" descr="A screenshot of a computer&#10;&#10;AI-generated content may be incorrect."/>
+            <wp:cNvGraphicFramePr>
+              <a:graphicFrameLocks xmlns:a="http://schemas.openxmlformats.org/drawingml/2006/main" noChangeAspect="1"/>
+            </wp:cNvGraphicFramePr>
+            <a:graphic xmlns:a="http://schemas.openxmlformats.org/drawingml/2006/main">
+              <a:graphicData uri="http://schemas.openxmlformats.org/drawingml/2006/picture">
+                <pic:pic xmlns:pic="http://schemas.openxmlformats.org/drawingml/2006/picture">
+                  <pic:nvPicPr>
+                    <pic:cNvPr id="1643980844" name="Picture 1" descr="A screenshot of a computer&#10;&#10;AI-generated content may be incorrect."/>
+                    <pic:cNvPicPr/>
+                  </pic:nvPicPr>
+                  <pic:blipFill>
+                    <a:blip r:embed="rId13">
+                      <a:extLst>
+                        <a:ext uri="{28A0092B-C50C-407E-A947-70E740481C1C}">
+                          <a14:useLocalDpi xmlns:a14="http://schemas.microsoft.com/office/drawing/2010/main" val="0"/>
+                        </a:ext>
+                      </a:extLst>
+                    </a:blip>
+                    <a:stretch>
+                      <a:fillRect/>
+                    </a:stretch>
+                  </pic:blipFill>
+                  <pic:spPr>
+                    <a:xfrm>
+                      <a:off x="0" y="0"/>
+                      <a:ext cx="2000529" cy="3610479"/>
+                    </a:xfrm>
+                    <a:prstGeom prst="rect">
+                      <a:avLst/>
+                    </a:prstGeom>
+                  </pic:spPr>
+                </pic:pic>
+              </a:graphicData>
+            </a:graphic>
+          </wp:anchor>
+        </w:drawing>
+      </w:r>
+    </w:p>
+    <w:p/>
+    <w:p/>
+    <w:p>
+      <w:r>
+        <w:rPr>
+          <w:noProof/>
+        </w:rPr>
+        <w:lastRenderedPageBreak/>
+        <mc:AlternateContent>
+          <mc:Choice Requires="wps">
+            <w:drawing>
+              <wp:anchor distT="0" distB="0" distL="114300" distR="114300" simplePos="0" relativeHeight="251682816" behindDoc="0" locked="0" layoutInCell="1" allowOverlap="1" wp14:anchorId="109ADBDA" wp14:editId="6DAE94FD">
+                <wp:simplePos x="0" y="0"/>
+                <wp:positionH relativeFrom="column">
+                  <wp:posOffset>915035</wp:posOffset>
+                </wp:positionH>
+                <wp:positionV relativeFrom="paragraph">
+                  <wp:posOffset>908050</wp:posOffset>
+                </wp:positionV>
+                <wp:extent cx="3352800" cy="635"/>
+                <wp:effectExtent l="0" t="0" r="0" b="0"/>
+                <wp:wrapTopAndBottom/>
+                <wp:docPr id="584374128" name="Text Box 1"/>
+                <wp:cNvGraphicFramePr/>
+                <a:graphic xmlns:a="http://schemas.openxmlformats.org/drawingml/2006/main">
+                  <a:graphicData uri="http://schemas.microsoft.com/office/word/2010/wordprocessingShape">
+                    <wps:wsp>
+                      <wps:cNvSpPr txBox="1"/>
+                      <wps:spPr>
+                        <a:xfrm>
+                          <a:off x="0" y="0"/>
+                          <a:ext cx="3352800" cy="635"/>
+                        </a:xfrm>
+                        <a:prstGeom prst="rect">
+                          <a:avLst/>
+                        </a:prstGeom>
+                        <a:solidFill>
+                          <a:prstClr val="white"/>
+                        </a:solidFill>
+                        <a:ln>
+                          <a:noFill/>
+                        </a:ln>
+                      </wps:spPr>
+                      <wps:txbx>
+                        <w:txbxContent>
+                          <w:p>
+                            <w:pPr>
+                              <w:pStyle w:val="Caption"/>
+                            </w:pPr>
+                            <w:r>
+                              <w:t xml:space="preserve">Figure </w:t>
+                            </w:r>
+                            <w:r>
+                              <w:fldChar w:fldCharType="begin"/>
+                            </w:r>
+                            <w:r>
+                              <w:instrText xml:space="preserve"> SEQ Figure \* ARABIC </w:instrText>
+                            </w:r>
+                            <w:r>
+                              <w:fldChar w:fldCharType="separate"/>
+                            </w:r>
+                            <w:r>
+                              <w:rPr>
+                                <w:noProof/>
+                              </w:rPr>
+                              <w:t>7</w:t>
+                            </w:r>
+                            <w:r>
+                              <w:fldChar w:fldCharType="end"/>
+                            </w:r>
+                            <w:r>
+                              <w:t xml:space="preserve">: </w:t>
+                            </w:r>
+                            <w:proofErr w:type="spellStart"/>
+                            <w:r>
+                              <w:t>FizzBuzz</w:t>
+                            </w:r>
+                            <w:proofErr w:type="spellEnd"/>
+                            <w:r>
+                              <w:t xml:space="preserve"> Unit Test</w:t>
+                            </w:r>
+                          </w:p>
+                        </w:txbxContent>
+                      </wps:txbx>
+                      <wps:bodyPr rot="0" spcFirstLastPara="0" vertOverflow="overflow" horzOverflow="overflow" vert="horz" wrap="square" lIns="0" tIns="0" rIns="0" bIns="0" numCol="1" spcCol="0" rtlCol="0" fromWordArt="0" anchor="t" anchorCtr="0" forceAA="0" compatLnSpc="1">
+                        <a:prstTxWarp prst="textNoShape">
+                          <a:avLst/>
+                        </a:prstTxWarp>
+                        <a:spAutoFit/>
+                      </wps:bodyPr>
+                    </wps:wsp>
+                  </a:graphicData>
+                </a:graphic>
+              </wp:anchor>
+            </w:drawing>
+          </mc:Choice>
+          <mc:Fallback>
+            <w:pict>
+              <v:shape w14:anchorId="109ADBDA" id="_x0000_s1034" type="#_x0000_t202" style="position:absolute;left:0;text-align:left;margin-left:72.05pt;margin-top:71.5pt;width:264pt;height:.05pt;z-index:251682816;visibility:visible;mso-wrap-style:square;mso-wrap-distance-left:9pt;mso-wrap-distance-top:0;mso-wrap-distance-right:9pt;mso-wrap-distance-bottom:0;mso-position-horizontal:absolute;mso-position-horizontal-relative:text;mso-position-vertical:absolute;mso-position-vertical-relative:text;v-text-anchor:top" o:gfxdata="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" stroked="f">
+                <v:textbox style="mso-fit-shape-to-text:t" inset="0,0,0,0">
+                  <w:txbxContent>
+                    <w:p>
+                      <w:pPr>
+                        <w:pStyle w:val="Caption"/>
+                      </w:pPr>
+                      <w:r>
+                        <w:t xml:space="preserve">Figure </w:t>
+                      </w:r>
+                      <w:r>
+                        <w:fldChar w:fldCharType="begin"/>
+                      </w:r>
+                      <w:r>
+                        <w:instrText xml:space="preserve"> SEQ Figure \* ARABIC </w:instrText>
+                      </w:r>
+                      <w:r>
+                        <w:fldChar w:fldCharType="separate"/>
+                      </w:r>
+                      <w:r>
+                        <w:rPr>
+                          <w:noProof/>
+                        </w:rPr>
+                        <w:t>7</w:t>
+                      </w:r>
+                      <w:r>
+                        <w:fldChar w:fldCharType="end"/>
+                      </w:r>
+                      <w:r>
+                        <w:t xml:space="preserve">: </w:t>
+                      </w:r>
+                      <w:proofErr w:type="spellStart"/>
+                      <w:r>
+                        <w:t>FizzBuzz</w:t>
+                      </w:r>
+                      <w:proofErr w:type="spellEnd"/>
+                      <w:r>
+                        <w:t xml:space="preserve"> Unit Test</w:t>
+                      </w:r>
+                    </w:p>
+                  </w:txbxContent>
+                </v:textbox>
+                <w10:wrap type="topAndBottom"/>
+              </v:shape>
+            </w:pict>
+          </mc:Fallback>
+        </mc:AlternateContent>
+      </w:r>
+      <w:r>
+        <w:drawing>
+          <wp:anchor distT="0" distB="0" distL="114300" distR="114300" simplePos="0" relativeHeight="251680768" behindDoc="0" locked="0" layoutInCell="1" allowOverlap="1" wp14:anchorId="3DE61125" wp14:editId="6800F58E">
+            <wp:simplePos x="0" y="0"/>
+            <wp:positionH relativeFrom="margin">
+              <wp:align>center</wp:align>
+            </wp:positionH>
+            <wp:positionV relativeFrom="paragraph">
+              <wp:posOffset>232012</wp:posOffset>
+            </wp:positionV>
+            <wp:extent cx="3353268" cy="619211"/>
+            <wp:effectExtent l="0" t="0" r="0" b="9525"/>
+            <wp:wrapTopAndBottom/>
+            <wp:docPr id="1957272314" name="Picture 1" descr="A close up of a text&#10;&#10;AI-generated content may be incorrect."/>
+            <wp:cNvGraphicFramePr>
+              <a:graphicFrameLocks xmlns:a="http://schemas.openxmlformats.org/drawingml/2006/main" noChangeAspect="1"/>
+            </wp:cNvGraphicFramePr>
+            <a:graphic xmlns:a="http://schemas.openxmlformats.org/drawingml/2006/main">
+              <a:graphicData uri="http://schemas.openxmlformats.org/drawingml/2006/picture">
+                <pic:pic xmlns:pic="http://schemas.openxmlformats.org/drawingml/2006/picture">
+                  <pic:nvPicPr>
+                    <pic:cNvPr id="1957272314" name="Picture 1" descr="A close up of a text&#10;&#10;AI-generated content may be incorrect."/>
+                    <pic:cNvPicPr/>
+                  </pic:nvPicPr>
+                  <pic:blipFill>
+                    <a:blip r:embed="rId14">
+                      <a:extLst>
+                        <a:ext uri="{28A0092B-C50C-407E-A947-70E740481C1C}">
+                          <a14:useLocalDpi xmlns:a14="http://schemas.microsoft.com/office/drawing/2010/main" val="0"/>
+                        </a:ext>
+                      </a:extLst>
+                    </a:blip>
+                    <a:stretch>
+                      <a:fillRect/>
+                    </a:stretch>
+                  </pic:blipFill>
+                  <pic:spPr>
+                    <a:xfrm>
+                      <a:off x="0" y="0"/>
+                      <a:ext cx="3353268" cy="619211"/>
+                    </a:xfrm>
+                    <a:prstGeom prst="rect">
+                      <a:avLst/>
+                    </a:prstGeom>
+                  </pic:spPr>
+                </pic:pic>
+              </a:graphicData>
+            </a:graphic>
+          </wp:anchor>
+        </w:drawing>
+      </w:r>
+    </w:p>
+    <w:p/>
     <w:p>
       <w:pPr>
         <w:jc w:val="left"/>
@@ -3051,9 +3839,9 @@
     </w:p>
     <w:p/>
     <w:sectPr>
-      <w:headerReference w:type="default" r:id="rId11"/>
-      <w:footerReference w:type="default" r:id="rId12"/>
-      <w:headerReference w:type="first" r:id="rId13"/>
+      <w:headerReference w:type="default" r:id="rId15"/>
+      <w:footerReference w:type="default" r:id="rId16"/>
+      <w:headerReference w:type="first" r:id="rId17"/>
       <w:pgSz w:w="11906" w:h="16838"/>
       <w:pgMar w:top="1872" w:right="1872" w:bottom="1872" w:left="1872" w:header="706" w:footer="706" w:gutter="0"/>
       <w:pgNumType w:start="0"/>

</xml_diff>

<commit_message>
Add DayOfWeek class with tests and update docs
Implemented the DayOfWeek class with methods to validate day numbers, get weekday names, and determine day type (weekday/weekend). Added corresponding unit tests in DayOfWeekTest. Updated Main to demonstrate DayOfWeek usage and enhanced documentation with an example output and an image.
</commit_message>
<xml_diff>
--- a/Modules/Semester_1/Modern Code/Aufgaben/02_Java_Variables_Types_Expression_Control_Structures/Protocol.docx
+++ b/Modules/Semester_1/Modern Code/Aufgaben/02_Java_Variables_Types_Expression_Control_Structures/Protocol.docx
@@ -3641,6 +3641,17 @@
       <w:bookmarkEnd w:id="9"/>
     </w:p>
     <w:p>
+      <w:r>
+        <w:t xml:space="preserve">Create a validation method to check whether the day </w:t>
+      </w:r>
+      <w:r>
+        <w:t>is</w:t>
+      </w:r>
+      <w:r>
+        <w:t xml:space="preserve"> between 1 and 7. Use a switch to determine name and an if to determine day type.</w:t>
+      </w:r>
+    </w:p>
+    <w:p>
       <w:pPr>
         <w:pStyle w:val="Heading2"/>
       </w:pPr>
@@ -3651,15 +3662,795 @@
       <w:bookmarkEnd w:id="10"/>
     </w:p>
     <w:p>
+      <w:bookmarkStart w:id="11" w:name="_Toc212464885"/>
+      <w:r>
+        <w:rPr>
+          <w:noProof/>
+        </w:rPr>
+        <mc:AlternateContent>
+          <mc:Choice Requires="wps">
+            <w:drawing>
+              <wp:anchor distT="0" distB="0" distL="114300" distR="114300" simplePos="0" relativeHeight="251685888" behindDoc="0" locked="0" layoutInCell="1" allowOverlap="1" wp14:anchorId="440140C4" wp14:editId="022C5A67">
+                <wp:simplePos x="0" y="0"/>
+                <wp:positionH relativeFrom="column">
+                  <wp:posOffset>705485</wp:posOffset>
+                </wp:positionH>
+                <wp:positionV relativeFrom="paragraph">
+                  <wp:posOffset>5710555</wp:posOffset>
+                </wp:positionV>
+                <wp:extent cx="3763010" cy="635"/>
+                <wp:effectExtent l="0" t="0" r="0" b="0"/>
+                <wp:wrapTopAndBottom/>
+                <wp:docPr id="461607718" name="Text Box 1"/>
+                <wp:cNvGraphicFramePr/>
+                <a:graphic xmlns:a="http://schemas.openxmlformats.org/drawingml/2006/main">
+                  <a:graphicData uri="http://schemas.microsoft.com/office/word/2010/wordprocessingShape">
+                    <wps:wsp>
+                      <wps:cNvSpPr txBox="1"/>
+                      <wps:spPr>
+                        <a:xfrm>
+                          <a:off x="0" y="0"/>
+                          <a:ext cx="3763010" cy="635"/>
+                        </a:xfrm>
+                        <a:prstGeom prst="rect">
+                          <a:avLst/>
+                        </a:prstGeom>
+                        <a:solidFill>
+                          <a:prstClr val="white"/>
+                        </a:solidFill>
+                        <a:ln>
+                          <a:noFill/>
+                        </a:ln>
+                      </wps:spPr>
+                      <wps:txbx>
+                        <w:txbxContent>
+                          <w:p>
+                            <w:pPr>
+                              <w:pStyle w:val="Caption"/>
+                            </w:pPr>
+                            <w:r>
+                              <w:t xml:space="preserve">Figure </w:t>
+                            </w:r>
+                            <w:r>
+                              <w:fldChar w:fldCharType="begin"/>
+                            </w:r>
+                            <w:r>
+                              <w:instrText xml:space="preserve"> SEQ Figure \* ARABIC </w:instrText>
+                            </w:r>
+                            <w:r>
+                              <w:fldChar w:fldCharType="separate"/>
+                            </w:r>
+                            <w:r>
+                              <w:rPr>
+                                <w:noProof/>
+                              </w:rPr>
+                              <w:t>8</w:t>
+                            </w:r>
+                            <w:r>
+                              <w:fldChar w:fldCharType="end"/>
+                            </w:r>
+                            <w:r>
+                              <w:t xml:space="preserve">: </w:t>
+                            </w:r>
+                            <w:proofErr w:type="spellStart"/>
+                            <w:r>
+                              <w:t>DayOfWeek</w:t>
+                            </w:r>
+                            <w:proofErr w:type="spellEnd"/>
+                          </w:p>
+                        </w:txbxContent>
+                      </wps:txbx>
+                      <wps:bodyPr rot="0" spcFirstLastPara="0" vertOverflow="overflow" horzOverflow="overflow" vert="horz" wrap="square" lIns="0" tIns="0" rIns="0" bIns="0" numCol="1" spcCol="0" rtlCol="0" fromWordArt="0" anchor="t" anchorCtr="0" forceAA="0" compatLnSpc="1">
+                        <a:prstTxWarp prst="textNoShape">
+                          <a:avLst/>
+                        </a:prstTxWarp>
+                        <a:spAutoFit/>
+                      </wps:bodyPr>
+                    </wps:wsp>
+                  </a:graphicData>
+                </a:graphic>
+              </wp:anchor>
+            </w:drawing>
+          </mc:Choice>
+          <mc:Fallback>
+            <w:pict>
+              <v:shape w14:anchorId="440140C4" id="_x0000_s1035" type="#_x0000_t202" style="position:absolute;left:0;text-align:left;margin-left:55.55pt;margin-top:449.65pt;width:296.3pt;height:.05pt;z-index:251685888;visibility:visible;mso-wrap-style:square;mso-wrap-distance-left:9pt;mso-wrap-distance-top:0;mso-wrap-distance-right:9pt;mso-wrap-distance-bottom:0;mso-position-horizontal:absolute;mso-position-horizontal-relative:text;mso-position-vertical:absolute;mso-position-vertical-relative:text;v-text-anchor:top" o:gfxdata="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" stroked="f">
+                <v:textbox style="mso-fit-shape-to-text:t" inset="0,0,0,0">
+                  <w:txbxContent>
+                    <w:p>
+                      <w:pPr>
+                        <w:pStyle w:val="Caption"/>
+                      </w:pPr>
+                      <w:r>
+                        <w:t xml:space="preserve">Figure </w:t>
+                      </w:r>
+                      <w:r>
+                        <w:fldChar w:fldCharType="begin"/>
+                      </w:r>
+                      <w:r>
+                        <w:instrText xml:space="preserve"> SEQ Figure \* ARABIC </w:instrText>
+                      </w:r>
+                      <w:r>
+                        <w:fldChar w:fldCharType="separate"/>
+                      </w:r>
+                      <w:r>
+                        <w:rPr>
+                          <w:noProof/>
+                        </w:rPr>
+                        <w:t>8</w:t>
+                      </w:r>
+                      <w:r>
+                        <w:fldChar w:fldCharType="end"/>
+                      </w:r>
+                      <w:r>
+                        <w:t xml:space="preserve">: </w:t>
+                      </w:r>
+                      <w:proofErr w:type="spellStart"/>
+                      <w:r>
+                        <w:t>DayOfWeek</w:t>
+                      </w:r>
+                      <w:proofErr w:type="spellEnd"/>
+                    </w:p>
+                  </w:txbxContent>
+                </v:textbox>
+                <w10:wrap type="topAndBottom"/>
+              </v:shape>
+            </w:pict>
+          </mc:Fallback>
+        </mc:AlternateContent>
+      </w:r>
+      <w:r>
+        <w:drawing>
+          <wp:anchor distT="0" distB="0" distL="114300" distR="114300" simplePos="0" relativeHeight="251683840" behindDoc="0" locked="0" layoutInCell="1" allowOverlap="1" wp14:anchorId="3D1272DF" wp14:editId="0C99BED0">
+            <wp:simplePos x="0" y="0"/>
+            <wp:positionH relativeFrom="margin">
+              <wp:align>center</wp:align>
+            </wp:positionH>
+            <wp:positionV relativeFrom="paragraph">
+              <wp:posOffset>370195</wp:posOffset>
+            </wp:positionV>
+            <wp:extent cx="3763603" cy="5283892"/>
+            <wp:effectExtent l="0" t="0" r="8890" b="0"/>
+            <wp:wrapTopAndBottom/>
+            <wp:docPr id="2087203321" name="Picture 1"/>
+            <wp:cNvGraphicFramePr>
+              <a:graphicFrameLocks xmlns:a="http://schemas.openxmlformats.org/drawingml/2006/main" noChangeAspect="1"/>
+            </wp:cNvGraphicFramePr>
+            <a:graphic xmlns:a="http://schemas.openxmlformats.org/drawingml/2006/main">
+              <a:graphicData uri="http://schemas.openxmlformats.org/drawingml/2006/picture">
+                <pic:pic xmlns:pic="http://schemas.openxmlformats.org/drawingml/2006/picture">
+                  <pic:nvPicPr>
+                    <pic:cNvPr id="2087203321" name=""/>
+                    <pic:cNvPicPr/>
+                  </pic:nvPicPr>
+                  <pic:blipFill>
+                    <a:blip r:embed="rId15">
+                      <a:extLst>
+                        <a:ext uri="{28A0092B-C50C-407E-A947-70E740481C1C}">
+                          <a14:useLocalDpi xmlns:a14="http://schemas.microsoft.com/office/drawing/2010/main" val="0"/>
+                        </a:ext>
+                      </a:extLst>
+                    </a:blip>
+                    <a:stretch>
+                      <a:fillRect/>
+                    </a:stretch>
+                  </pic:blipFill>
+                  <pic:spPr>
+                    <a:xfrm>
+                      <a:off x="0" y="0"/>
+                      <a:ext cx="3763603" cy="5283892"/>
+                    </a:xfrm>
+                    <a:prstGeom prst="rect">
+                      <a:avLst/>
+                    </a:prstGeom>
+                  </pic:spPr>
+                </pic:pic>
+              </a:graphicData>
+            </a:graphic>
+          </wp:anchor>
+        </w:drawing>
+      </w:r>
+    </w:p>
+    <w:p/>
+    <w:p/>
+    <w:p>
+      <w:r>
+        <w:lastRenderedPageBreak/>
+        <w:drawing>
+          <wp:anchor distT="0" distB="0" distL="114300" distR="114300" simplePos="0" relativeHeight="251686912" behindDoc="0" locked="0" layoutInCell="1" allowOverlap="1" wp14:anchorId="7E938A1E" wp14:editId="6B395F8B">
+            <wp:simplePos x="0" y="0"/>
+            <wp:positionH relativeFrom="column">
+              <wp:posOffset>339090</wp:posOffset>
+            </wp:positionH>
+            <wp:positionV relativeFrom="paragraph">
+              <wp:posOffset>394335</wp:posOffset>
+            </wp:positionV>
+            <wp:extent cx="4495800" cy="6191885"/>
+            <wp:effectExtent l="0" t="0" r="0" b="0"/>
+            <wp:wrapTopAndBottom/>
+            <wp:docPr id="1630007674" name="Picture 1"/>
+            <wp:cNvGraphicFramePr>
+              <a:graphicFrameLocks xmlns:a="http://schemas.openxmlformats.org/drawingml/2006/main" noChangeAspect="1"/>
+            </wp:cNvGraphicFramePr>
+            <a:graphic xmlns:a="http://schemas.openxmlformats.org/drawingml/2006/main">
+              <a:graphicData uri="http://schemas.openxmlformats.org/drawingml/2006/picture">
+                <pic:pic xmlns:pic="http://schemas.openxmlformats.org/drawingml/2006/picture">
+                  <pic:nvPicPr>
+                    <pic:cNvPr id="1630007674" name=""/>
+                    <pic:cNvPicPr/>
+                  </pic:nvPicPr>
+                  <pic:blipFill>
+                    <a:blip r:embed="rId16">
+                      <a:extLst>
+                        <a:ext uri="{28A0092B-C50C-407E-A947-70E740481C1C}">
+                          <a14:useLocalDpi xmlns:a14="http://schemas.microsoft.com/office/drawing/2010/main" val="0"/>
+                        </a:ext>
+                      </a:extLst>
+                    </a:blip>
+                    <a:stretch>
+                      <a:fillRect/>
+                    </a:stretch>
+                  </pic:blipFill>
+                  <pic:spPr>
+                    <a:xfrm>
+                      <a:off x="0" y="0"/>
+                      <a:ext cx="4495800" cy="6191885"/>
+                    </a:xfrm>
+                    <a:prstGeom prst="rect">
+                      <a:avLst/>
+                    </a:prstGeom>
+                  </pic:spPr>
+                </pic:pic>
+              </a:graphicData>
+            </a:graphic>
+          </wp:anchor>
+        </w:drawing>
+      </w:r>
+      <w:r>
+        <w:rPr>
+          <w:noProof/>
+        </w:rPr>
+        <mc:AlternateContent>
+          <mc:Choice Requires="wps">
+            <w:drawing>
+              <wp:anchor distT="0" distB="0" distL="114300" distR="114300" simplePos="0" relativeHeight="251688960" behindDoc="0" locked="0" layoutInCell="1" allowOverlap="1" wp14:anchorId="71A9A0B7" wp14:editId="636511E9">
+                <wp:simplePos x="0" y="0"/>
+                <wp:positionH relativeFrom="column">
+                  <wp:posOffset>339422</wp:posOffset>
+                </wp:positionH>
+                <wp:positionV relativeFrom="paragraph">
+                  <wp:posOffset>6643512</wp:posOffset>
+                </wp:positionV>
+                <wp:extent cx="4495800" cy="635"/>
+                <wp:effectExtent l="0" t="0" r="0" b="0"/>
+                <wp:wrapTopAndBottom/>
+                <wp:docPr id="1134207514" name="Text Box 1"/>
+                <wp:cNvGraphicFramePr/>
+                <a:graphic xmlns:a="http://schemas.openxmlformats.org/drawingml/2006/main">
+                  <a:graphicData uri="http://schemas.microsoft.com/office/word/2010/wordprocessingShape">
+                    <wps:wsp>
+                      <wps:cNvSpPr txBox="1"/>
+                      <wps:spPr>
+                        <a:xfrm>
+                          <a:off x="0" y="0"/>
+                          <a:ext cx="4495800" cy="635"/>
+                        </a:xfrm>
+                        <a:prstGeom prst="rect">
+                          <a:avLst/>
+                        </a:prstGeom>
+                        <a:solidFill>
+                          <a:prstClr val="white"/>
+                        </a:solidFill>
+                        <a:ln>
+                          <a:noFill/>
+                        </a:ln>
+                      </wps:spPr>
+                      <wps:txbx>
+                        <w:txbxContent>
+                          <w:p>
+                            <w:pPr>
+                              <w:pStyle w:val="Caption"/>
+                            </w:pPr>
+                            <w:r>
+                              <w:t xml:space="preserve">Figure </w:t>
+                            </w:r>
+                            <w:r>
+                              <w:fldChar w:fldCharType="begin"/>
+                            </w:r>
+                            <w:r>
+                              <w:instrText xml:space="preserve"> SEQ Figure \* ARABIC </w:instrText>
+                            </w:r>
+                            <w:r>
+                              <w:fldChar w:fldCharType="separate"/>
+                            </w:r>
+                            <w:r>
+                              <w:rPr>
+                                <w:noProof/>
+                              </w:rPr>
+                              <w:t>9</w:t>
+                            </w:r>
+                            <w:r>
+                              <w:fldChar w:fldCharType="end"/>
+                            </w:r>
+                            <w:r>
+                              <w:t>: Day of Week</w:t>
+                            </w:r>
+                          </w:p>
+                        </w:txbxContent>
+                      </wps:txbx>
+                      <wps:bodyPr rot="0" spcFirstLastPara="0" vertOverflow="overflow" horzOverflow="overflow" vert="horz" wrap="square" lIns="0" tIns="0" rIns="0" bIns="0" numCol="1" spcCol="0" rtlCol="0" fromWordArt="0" anchor="t" anchorCtr="0" forceAA="0" compatLnSpc="1">
+                        <a:prstTxWarp prst="textNoShape">
+                          <a:avLst/>
+                        </a:prstTxWarp>
+                        <a:spAutoFit/>
+                      </wps:bodyPr>
+                    </wps:wsp>
+                  </a:graphicData>
+                </a:graphic>
+              </wp:anchor>
+            </w:drawing>
+          </mc:Choice>
+          <mc:Fallback>
+            <w:pict>
+              <v:shape w14:anchorId="71A9A0B7" id="_x0000_s1036" type="#_x0000_t202" style="position:absolute;left:0;text-align:left;margin-left:26.75pt;margin-top:523.1pt;width:354pt;height:.05pt;z-index:251688960;visibility:visible;mso-wrap-style:square;mso-wrap-distance-left:9pt;mso-wrap-distance-top:0;mso-wrap-distance-right:9pt;mso-wrap-distance-bottom:0;mso-position-horizontal:absolute;mso-position-horizontal-relative:text;mso-position-vertical:absolute;mso-position-vertical-relative:text;v-text-anchor:top" o:gfxdata="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" stroked="f">
+                <v:textbox style="mso-fit-shape-to-text:t" inset="0,0,0,0">
+                  <w:txbxContent>
+                    <w:p>
+                      <w:pPr>
+                        <w:pStyle w:val="Caption"/>
+                      </w:pPr>
+                      <w:r>
+                        <w:t xml:space="preserve">Figure </w:t>
+                      </w:r>
+                      <w:r>
+                        <w:fldChar w:fldCharType="begin"/>
+                      </w:r>
+                      <w:r>
+                        <w:instrText xml:space="preserve"> SEQ Figure \* ARABIC </w:instrText>
+                      </w:r>
+                      <w:r>
+                        <w:fldChar w:fldCharType="separate"/>
+                      </w:r>
+                      <w:r>
+                        <w:rPr>
+                          <w:noProof/>
+                        </w:rPr>
+                        <w:t>9</w:t>
+                      </w:r>
+                      <w:r>
+                        <w:fldChar w:fldCharType="end"/>
+                      </w:r>
+                      <w:r>
+                        <w:t>: Day of Week</w:t>
+                      </w:r>
+                    </w:p>
+                  </w:txbxContent>
+                </v:textbox>
+                <w10:wrap type="topAndBottom"/>
+              </v:shape>
+            </w:pict>
+          </mc:Fallback>
+        </mc:AlternateContent>
+      </w:r>
+    </w:p>
+    <w:p/>
+    <w:p>
+      <w:pPr>
+        <w:jc w:val="left"/>
+        <w:rPr>
+          <w:rFonts w:eastAsiaTheme="majorEastAsia" w:cstheme="majorBidi"/>
+          <w:b/>
+          <w:color w:val="000000" w:themeColor="text1"/>
+          <w:sz w:val="32"/>
+          <w:szCs w:val="32"/>
+        </w:rPr>
+      </w:pPr>
+      <w:r>
+        <w:br w:type="page"/>
+      </w:r>
+    </w:p>
+    <w:p>
       <w:pPr>
         <w:pStyle w:val="Heading2"/>
       </w:pPr>
-      <w:bookmarkStart w:id="11" w:name="_Toc212464885"/>
-      <w:r>
+      <w:r>
+        <w:lastRenderedPageBreak/>
         <w:t>Tests</w:t>
       </w:r>
       <w:bookmarkEnd w:id="11"/>
     </w:p>
+    <w:p>
+      <w:r>
+        <w:rPr>
+          <w:noProof/>
+        </w:rPr>
+        <mc:AlternateContent>
+          <mc:Choice Requires="wps">
+            <w:drawing>
+              <wp:anchor distT="0" distB="0" distL="114300" distR="114300" simplePos="0" relativeHeight="251692032" behindDoc="0" locked="0" layoutInCell="1" allowOverlap="1" wp14:anchorId="051B6624" wp14:editId="78240E79">
+                <wp:simplePos x="0" y="0"/>
+                <wp:positionH relativeFrom="column">
+                  <wp:posOffset>1400810</wp:posOffset>
+                </wp:positionH>
+                <wp:positionV relativeFrom="paragraph">
+                  <wp:posOffset>1466215</wp:posOffset>
+                </wp:positionV>
+                <wp:extent cx="2381250" cy="635"/>
+                <wp:effectExtent l="0" t="0" r="0" b="0"/>
+                <wp:wrapTopAndBottom/>
+                <wp:docPr id="1382055691" name="Text Box 1"/>
+                <wp:cNvGraphicFramePr/>
+                <a:graphic xmlns:a="http://schemas.openxmlformats.org/drawingml/2006/main">
+                  <a:graphicData uri="http://schemas.microsoft.com/office/word/2010/wordprocessingShape">
+                    <wps:wsp>
+                      <wps:cNvSpPr txBox="1"/>
+                      <wps:spPr>
+                        <a:xfrm>
+                          <a:off x="0" y="0"/>
+                          <a:ext cx="2381250" cy="635"/>
+                        </a:xfrm>
+                        <a:prstGeom prst="rect">
+                          <a:avLst/>
+                        </a:prstGeom>
+                        <a:solidFill>
+                          <a:prstClr val="white"/>
+                        </a:solidFill>
+                        <a:ln>
+                          <a:noFill/>
+                        </a:ln>
+                      </wps:spPr>
+                      <wps:txbx>
+                        <w:txbxContent>
+                          <w:p>
+                            <w:pPr>
+                              <w:pStyle w:val="Caption"/>
+                            </w:pPr>
+                            <w:r>
+                              <w:t xml:space="preserve">Figure </w:t>
+                            </w:r>
+                            <w:r>
+                              <w:fldChar w:fldCharType="begin"/>
+                            </w:r>
+                            <w:r>
+                              <w:instrText xml:space="preserve"> SEQ Figure \* ARABIC </w:instrText>
+                            </w:r>
+                            <w:r>
+                              <w:fldChar w:fldCharType="separate"/>
+                            </w:r>
+                            <w:r>
+                              <w:rPr>
+                                <w:noProof/>
+                              </w:rPr>
+                              <w:t>10</w:t>
+                            </w:r>
+                            <w:r>
+                              <w:fldChar w:fldCharType="end"/>
+                            </w:r>
+                            <w:r>
+                              <w:t xml:space="preserve">: </w:t>
+                            </w:r>
+                            <w:proofErr w:type="spellStart"/>
+                            <w:r>
+                              <w:t>DayOfWeek</w:t>
+                            </w:r>
+                            <w:proofErr w:type="spellEnd"/>
+                            <w:r>
+                              <w:t xml:space="preserve"> output</w:t>
+                            </w:r>
+                          </w:p>
+                        </w:txbxContent>
+                      </wps:txbx>
+                      <wps:bodyPr rot="0" spcFirstLastPara="0" vertOverflow="overflow" horzOverflow="overflow" vert="horz" wrap="square" lIns="0" tIns="0" rIns="0" bIns="0" numCol="1" spcCol="0" rtlCol="0" fromWordArt="0" anchor="t" anchorCtr="0" forceAA="0" compatLnSpc="1">
+                        <a:prstTxWarp prst="textNoShape">
+                          <a:avLst/>
+                        </a:prstTxWarp>
+                        <a:spAutoFit/>
+                      </wps:bodyPr>
+                    </wps:wsp>
+                  </a:graphicData>
+                </a:graphic>
+              </wp:anchor>
+            </w:drawing>
+          </mc:Choice>
+          <mc:Fallback>
+            <w:pict>
+              <v:shape w14:anchorId="051B6624" id="_x0000_s1037" type="#_x0000_t202" style="position:absolute;left:0;text-align:left;margin-left:110.3pt;margin-top:115.45pt;width:187.5pt;height:.05pt;z-index:251692032;visibility:visible;mso-wrap-style:square;mso-wrap-distance-left:9pt;mso-wrap-distance-top:0;mso-wrap-distance-right:9pt;mso-wrap-distance-bottom:0;mso-position-horizontal:absolute;mso-position-horizontal-relative:text;mso-position-vertical:absolute;mso-position-vertical-relative:text;v-text-anchor:top" o:gfxdata="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" stroked="f">
+                <v:textbox style="mso-fit-shape-to-text:t" inset="0,0,0,0">
+                  <w:txbxContent>
+                    <w:p>
+                      <w:pPr>
+                        <w:pStyle w:val="Caption"/>
+                      </w:pPr>
+                      <w:r>
+                        <w:t xml:space="preserve">Figure </w:t>
+                      </w:r>
+                      <w:r>
+                        <w:fldChar w:fldCharType="begin"/>
+                      </w:r>
+                      <w:r>
+                        <w:instrText xml:space="preserve"> SEQ Figure \* ARABIC </w:instrText>
+                      </w:r>
+                      <w:r>
+                        <w:fldChar w:fldCharType="separate"/>
+                      </w:r>
+                      <w:r>
+                        <w:rPr>
+                          <w:noProof/>
+                        </w:rPr>
+                        <w:t>10</w:t>
+                      </w:r>
+                      <w:r>
+                        <w:fldChar w:fldCharType="end"/>
+                      </w:r>
+                      <w:r>
+                        <w:t xml:space="preserve">: </w:t>
+                      </w:r>
+                      <w:proofErr w:type="spellStart"/>
+                      <w:r>
+                        <w:t>DayOfWeek</w:t>
+                      </w:r>
+                      <w:proofErr w:type="spellEnd"/>
+                      <w:r>
+                        <w:t xml:space="preserve"> output</w:t>
+                      </w:r>
+                    </w:p>
+                  </w:txbxContent>
+                </v:textbox>
+                <w10:wrap type="topAndBottom"/>
+              </v:shape>
+            </w:pict>
+          </mc:Fallback>
+        </mc:AlternateContent>
+      </w:r>
+      <w:r>
+        <w:drawing>
+          <wp:anchor distT="0" distB="0" distL="114300" distR="114300" simplePos="0" relativeHeight="251689984" behindDoc="0" locked="0" layoutInCell="1" allowOverlap="1" wp14:anchorId="7A3A0651" wp14:editId="62983BAE">
+            <wp:simplePos x="0" y="0"/>
+            <wp:positionH relativeFrom="margin">
+              <wp:align>center</wp:align>
+            </wp:positionH>
+            <wp:positionV relativeFrom="paragraph">
+              <wp:posOffset>456830</wp:posOffset>
+            </wp:positionV>
+            <wp:extent cx="2381582" cy="952633"/>
+            <wp:effectExtent l="0" t="0" r="0" b="0"/>
+            <wp:wrapTopAndBottom/>
+            <wp:docPr id="1692521702" name="Picture 1"/>
+            <wp:cNvGraphicFramePr>
+              <a:graphicFrameLocks xmlns:a="http://schemas.openxmlformats.org/drawingml/2006/main" noChangeAspect="1"/>
+            </wp:cNvGraphicFramePr>
+            <a:graphic xmlns:a="http://schemas.openxmlformats.org/drawingml/2006/main">
+              <a:graphicData uri="http://schemas.openxmlformats.org/drawingml/2006/picture">
+                <pic:pic xmlns:pic="http://schemas.openxmlformats.org/drawingml/2006/picture">
+                  <pic:nvPicPr>
+                    <pic:cNvPr id="1692521702" name=""/>
+                    <pic:cNvPicPr/>
+                  </pic:nvPicPr>
+                  <pic:blipFill>
+                    <a:blip r:embed="rId17">
+                      <a:extLst>
+                        <a:ext uri="{28A0092B-C50C-407E-A947-70E740481C1C}">
+                          <a14:useLocalDpi xmlns:a14="http://schemas.microsoft.com/office/drawing/2010/main" val="0"/>
+                        </a:ext>
+                      </a:extLst>
+                    </a:blip>
+                    <a:stretch>
+                      <a:fillRect/>
+                    </a:stretch>
+                  </pic:blipFill>
+                  <pic:spPr>
+                    <a:xfrm>
+                      <a:off x="0" y="0"/>
+                      <a:ext cx="2381582" cy="952633"/>
+                    </a:xfrm>
+                    <a:prstGeom prst="rect">
+                      <a:avLst/>
+                    </a:prstGeom>
+                  </pic:spPr>
+                </pic:pic>
+              </a:graphicData>
+            </a:graphic>
+          </wp:anchor>
+        </w:drawing>
+      </w:r>
+    </w:p>
+    <w:p>
+      <w:r>
+        <w:rPr>
+          <w:noProof/>
+        </w:rPr>
+        <mc:AlternateContent>
+          <mc:Choice Requires="wps">
+            <w:drawing>
+              <wp:anchor distT="0" distB="0" distL="114300" distR="114300" simplePos="0" relativeHeight="251695104" behindDoc="0" locked="0" layoutInCell="1" allowOverlap="1" wp14:anchorId="7C89E0B4" wp14:editId="5B1D8365">
+                <wp:simplePos x="0" y="0"/>
+                <wp:positionH relativeFrom="column">
+                  <wp:posOffset>924560</wp:posOffset>
+                </wp:positionH>
+                <wp:positionV relativeFrom="paragraph">
+                  <wp:posOffset>3718560</wp:posOffset>
+                </wp:positionV>
+                <wp:extent cx="3333750" cy="635"/>
+                <wp:effectExtent l="0" t="0" r="0" b="0"/>
+                <wp:wrapTopAndBottom/>
+                <wp:docPr id="985624935" name="Text Box 1"/>
+                <wp:cNvGraphicFramePr/>
+                <a:graphic xmlns:a="http://schemas.openxmlformats.org/drawingml/2006/main">
+                  <a:graphicData uri="http://schemas.microsoft.com/office/word/2010/wordprocessingShape">
+                    <wps:wsp>
+                      <wps:cNvSpPr txBox="1"/>
+                      <wps:spPr>
+                        <a:xfrm>
+                          <a:off x="0" y="0"/>
+                          <a:ext cx="3333750" cy="635"/>
+                        </a:xfrm>
+                        <a:prstGeom prst="rect">
+                          <a:avLst/>
+                        </a:prstGeom>
+                        <a:solidFill>
+                          <a:prstClr val="white"/>
+                        </a:solidFill>
+                        <a:ln>
+                          <a:noFill/>
+                        </a:ln>
+                      </wps:spPr>
+                      <wps:txbx>
+                        <w:txbxContent>
+                          <w:p>
+                            <w:pPr>
+                              <w:pStyle w:val="Caption"/>
+                            </w:pPr>
+                            <w:r>
+                              <w:t xml:space="preserve">Figure </w:t>
+                            </w:r>
+                            <w:r>
+                              <w:fldChar w:fldCharType="begin"/>
+                            </w:r>
+                            <w:r>
+                              <w:instrText xml:space="preserve"> SEQ Figure \* ARABIC </w:instrText>
+                            </w:r>
+                            <w:r>
+                              <w:fldChar w:fldCharType="separate"/>
+                            </w:r>
+                            <w:r>
+                              <w:rPr>
+                                <w:noProof/>
+                              </w:rPr>
+                              <w:t>11</w:t>
+                            </w:r>
+                            <w:r>
+                              <w:fldChar w:fldCharType="end"/>
+                            </w:r>
+                            <w:r>
+                              <w:t xml:space="preserve">: </w:t>
+                            </w:r>
+                            <w:proofErr w:type="spellStart"/>
+                            <w:r>
+                              <w:t>DayOfWeek</w:t>
+                            </w:r>
+                            <w:proofErr w:type="spellEnd"/>
+                            <w:r>
+                              <w:t xml:space="preserve"> Unit Tests</w:t>
+                            </w:r>
+                          </w:p>
+                        </w:txbxContent>
+                      </wps:txbx>
+                      <wps:bodyPr rot="0" spcFirstLastPara="0" vertOverflow="overflow" horzOverflow="overflow" vert="horz" wrap="square" lIns="0" tIns="0" rIns="0" bIns="0" numCol="1" spcCol="0" rtlCol="0" fromWordArt="0" anchor="t" anchorCtr="0" forceAA="0" compatLnSpc="1">
+                        <a:prstTxWarp prst="textNoShape">
+                          <a:avLst/>
+                        </a:prstTxWarp>
+                        <a:spAutoFit/>
+                      </wps:bodyPr>
+                    </wps:wsp>
+                  </a:graphicData>
+                </a:graphic>
+              </wp:anchor>
+            </w:drawing>
+          </mc:Choice>
+          <mc:Fallback>
+            <w:pict>
+              <v:shape w14:anchorId="7C89E0B4" id="_x0000_s1038" type="#_x0000_t202" style="position:absolute;left:0;text-align:left;margin-left:72.8pt;margin-top:292.8pt;width:262.5pt;height:.05pt;z-index:251695104;visibility:visible;mso-wrap-style:square;mso-wrap-distance-left:9pt;mso-wrap-distance-top:0;mso-wrap-distance-right:9pt;mso-wrap-distance-bottom:0;mso-position-horizontal:absolute;mso-position-horizontal-relative:text;mso-position-vertical:absolute;mso-position-vertical-relative:text;v-text-anchor:top" o:gfxdata="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" stroked="f">
+                <v:textbox style="mso-fit-shape-to-text:t" inset="0,0,0,0">
+                  <w:txbxContent>
+                    <w:p>
+                      <w:pPr>
+                        <w:pStyle w:val="Caption"/>
+                      </w:pPr>
+                      <w:r>
+                        <w:t xml:space="preserve">Figure </w:t>
+                      </w:r>
+                      <w:r>
+                        <w:fldChar w:fldCharType="begin"/>
+                      </w:r>
+                      <w:r>
+                        <w:instrText xml:space="preserve"> SEQ Figure \* ARABIC </w:instrText>
+                      </w:r>
+                      <w:r>
+                        <w:fldChar w:fldCharType="separate"/>
+                      </w:r>
+                      <w:r>
+                        <w:rPr>
+                          <w:noProof/>
+                        </w:rPr>
+                        <w:t>11</w:t>
+                      </w:r>
+                      <w:r>
+                        <w:fldChar w:fldCharType="end"/>
+                      </w:r>
+                      <w:r>
+                        <w:t xml:space="preserve">: </w:t>
+                      </w:r>
+                      <w:proofErr w:type="spellStart"/>
+                      <w:r>
+                        <w:t>DayOfWeek</w:t>
+                      </w:r>
+                      <w:proofErr w:type="spellEnd"/>
+                      <w:r>
+                        <w:t xml:space="preserve"> Unit Tests</w:t>
+                      </w:r>
+                    </w:p>
+                  </w:txbxContent>
+                </v:textbox>
+                <w10:wrap type="topAndBottom"/>
+              </v:shape>
+            </w:pict>
+          </mc:Fallback>
+        </mc:AlternateContent>
+      </w:r>
+      <w:r>
+        <w:drawing>
+          <wp:anchor distT="0" distB="0" distL="114300" distR="114300" simplePos="0" relativeHeight="251693056" behindDoc="0" locked="0" layoutInCell="1" allowOverlap="1" wp14:anchorId="3985235E" wp14:editId="28E2A042">
+            <wp:simplePos x="0" y="0"/>
+            <wp:positionH relativeFrom="margin">
+              <wp:align>center</wp:align>
+            </wp:positionH>
+            <wp:positionV relativeFrom="paragraph">
+              <wp:posOffset>1794804</wp:posOffset>
+            </wp:positionV>
+            <wp:extent cx="3334215" cy="1867161"/>
+            <wp:effectExtent l="0" t="0" r="0" b="0"/>
+            <wp:wrapTopAndBottom/>
+            <wp:docPr id="1790704921" name="Picture 1"/>
+            <wp:cNvGraphicFramePr>
+              <a:graphicFrameLocks xmlns:a="http://schemas.openxmlformats.org/drawingml/2006/main" noChangeAspect="1"/>
+            </wp:cNvGraphicFramePr>
+            <a:graphic xmlns:a="http://schemas.openxmlformats.org/drawingml/2006/main">
+              <a:graphicData uri="http://schemas.openxmlformats.org/drawingml/2006/picture">
+                <pic:pic xmlns:pic="http://schemas.openxmlformats.org/drawingml/2006/picture">
+                  <pic:nvPicPr>
+                    <pic:cNvPr id="1790704921" name=""/>
+                    <pic:cNvPicPr/>
+                  </pic:nvPicPr>
+                  <pic:blipFill>
+                    <a:blip r:embed="rId18">
+                      <a:extLst>
+                        <a:ext uri="{28A0092B-C50C-407E-A947-70E740481C1C}">
+                          <a14:useLocalDpi xmlns:a14="http://schemas.microsoft.com/office/drawing/2010/main" val="0"/>
+                        </a:ext>
+                      </a:extLst>
+                    </a:blip>
+                    <a:stretch>
+                      <a:fillRect/>
+                    </a:stretch>
+                  </pic:blipFill>
+                  <pic:spPr>
+                    <a:xfrm>
+                      <a:off x="0" y="0"/>
+                      <a:ext cx="3334215" cy="1867161"/>
+                    </a:xfrm>
+                    <a:prstGeom prst="rect">
+                      <a:avLst/>
+                    </a:prstGeom>
+                  </pic:spPr>
+                </pic:pic>
+              </a:graphicData>
+            </a:graphic>
+          </wp:anchor>
+        </w:drawing>
+      </w:r>
+    </w:p>
+    <w:p/>
+    <w:p/>
     <w:p>
       <w:pPr>
         <w:jc w:val="left"/>
@@ -3839,9 +4630,9 @@
     </w:p>
     <w:p/>
     <w:sectPr>
-      <w:headerReference w:type="default" r:id="rId15"/>
-      <w:footerReference w:type="default" r:id="rId16"/>
-      <w:headerReference w:type="first" r:id="rId17"/>
+      <w:headerReference w:type="default" r:id="rId19"/>
+      <w:footerReference w:type="default" r:id="rId20"/>
+      <w:headerReference w:type="first" r:id="rId21"/>
       <w:pgSz w:w="11906" w:h="16838"/>
       <w:pgMar w:top="1872" w:right="1872" w:bottom="1872" w:left="1872" w:header="706" w:footer="706" w:gutter="0"/>
       <w:pgNumType w:start="0"/>

</xml_diff>

<commit_message>
Add star pattern generator to Main and StarPattern
Introduced a StarPattern class with a constructor for pattern size and a method to generate a star pattern. Updated Main.java to create and use StarPattern, displaying the generated pattern.
</commit_message>
<xml_diff>
--- a/Modules/Semester_1/Modern Code/Aufgaben/02_Java_Variables_Types_Expression_Control_Structures/Protocol.docx
+++ b/Modules/Semester_1/Modern Code/Aufgaben/02_Java_Variables_Types_Expression_Control_Structures/Protocol.docx
@@ -4491,6 +4491,11 @@
       <w:bookmarkEnd w:id="13"/>
     </w:p>
     <w:p>
+      <w:r>
+        <w:t xml:space="preserve">A for loop inside another for loop. </w:t>
+      </w:r>
+    </w:p>
+    <w:p>
       <w:pPr>
         <w:pStyle w:val="Heading2"/>
       </w:pPr>
@@ -4501,15 +4506,386 @@
       <w:bookmarkEnd w:id="14"/>
     </w:p>
     <w:p>
+      <w:r>
+        <w:rPr>
+          <w:noProof/>
+        </w:rPr>
+        <mc:AlternateContent>
+          <mc:Choice Requires="wps">
+            <w:drawing>
+              <wp:anchor distT="0" distB="0" distL="114300" distR="114300" simplePos="0" relativeHeight="251698176" behindDoc="0" locked="0" layoutInCell="1" allowOverlap="1" wp14:anchorId="4526FBDF" wp14:editId="6222FC47">
+                <wp:simplePos x="0" y="0"/>
+                <wp:positionH relativeFrom="column">
+                  <wp:posOffset>646430</wp:posOffset>
+                </wp:positionH>
+                <wp:positionV relativeFrom="paragraph">
+                  <wp:posOffset>4551680</wp:posOffset>
+                </wp:positionV>
+                <wp:extent cx="3889375" cy="635"/>
+                <wp:effectExtent l="0" t="0" r="0" b="0"/>
+                <wp:wrapTopAndBottom/>
+                <wp:docPr id="1689107650" name="Text Box 1"/>
+                <wp:cNvGraphicFramePr/>
+                <a:graphic xmlns:a="http://schemas.openxmlformats.org/drawingml/2006/main">
+                  <a:graphicData uri="http://schemas.microsoft.com/office/word/2010/wordprocessingShape">
+                    <wps:wsp>
+                      <wps:cNvSpPr txBox="1"/>
+                      <wps:spPr>
+                        <a:xfrm>
+                          <a:off x="0" y="0"/>
+                          <a:ext cx="3889375" cy="635"/>
+                        </a:xfrm>
+                        <a:prstGeom prst="rect">
+                          <a:avLst/>
+                        </a:prstGeom>
+                        <a:solidFill>
+                          <a:prstClr val="white"/>
+                        </a:solidFill>
+                        <a:ln>
+                          <a:noFill/>
+                        </a:ln>
+                      </wps:spPr>
+                      <wps:txbx>
+                        <w:txbxContent>
+                          <w:p>
+                            <w:pPr>
+                              <w:pStyle w:val="Caption"/>
+                            </w:pPr>
+                            <w:r>
+                              <w:t xml:space="preserve">Figure </w:t>
+                            </w:r>
+                            <w:r>
+                              <w:fldChar w:fldCharType="begin"/>
+                            </w:r>
+                            <w:r>
+                              <w:instrText xml:space="preserve"> SEQ Figure \* ARABIC </w:instrText>
+                            </w:r>
+                            <w:r>
+                              <w:fldChar w:fldCharType="separate"/>
+                            </w:r>
+                            <w:r>
+                              <w:rPr>
+                                <w:noProof/>
+                              </w:rPr>
+                              <w:t>12</w:t>
+                            </w:r>
+                            <w:r>
+                              <w:fldChar w:fldCharType="end"/>
+                            </w:r>
+                            <w:r>
+                              <w:t>: Star Pattern</w:t>
+                            </w:r>
+                          </w:p>
+                        </w:txbxContent>
+                      </wps:txbx>
+                      <wps:bodyPr rot="0" spcFirstLastPara="0" vertOverflow="overflow" horzOverflow="overflow" vert="horz" wrap="square" lIns="0" tIns="0" rIns="0" bIns="0" numCol="1" spcCol="0" rtlCol="0" fromWordArt="0" anchor="t" anchorCtr="0" forceAA="0" compatLnSpc="1">
+                        <a:prstTxWarp prst="textNoShape">
+                          <a:avLst/>
+                        </a:prstTxWarp>
+                        <a:spAutoFit/>
+                      </wps:bodyPr>
+                    </wps:wsp>
+                  </a:graphicData>
+                </a:graphic>
+              </wp:anchor>
+            </w:drawing>
+          </mc:Choice>
+          <mc:Fallback>
+            <w:pict>
+              <v:shape w14:anchorId="4526FBDF" id="_x0000_s1039" type="#_x0000_t202" style="position:absolute;left:0;text-align:left;margin-left:50.9pt;margin-top:358.4pt;width:306.25pt;height:.05pt;z-index:251698176;visibility:visible;mso-wrap-style:square;mso-wrap-distance-left:9pt;mso-wrap-distance-top:0;mso-wrap-distance-right:9pt;mso-wrap-distance-bottom:0;mso-position-horizontal:absolute;mso-position-horizontal-relative:text;mso-position-vertical:absolute;mso-position-vertical-relative:text;v-text-anchor:top" o:gfxdata="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" stroked="f">
+                <v:textbox style="mso-fit-shape-to-text:t" inset="0,0,0,0">
+                  <w:txbxContent>
+                    <w:p>
+                      <w:pPr>
+                        <w:pStyle w:val="Caption"/>
+                      </w:pPr>
+                      <w:r>
+                        <w:t xml:space="preserve">Figure </w:t>
+                      </w:r>
+                      <w:r>
+                        <w:fldChar w:fldCharType="begin"/>
+                      </w:r>
+                      <w:r>
+                        <w:instrText xml:space="preserve"> SEQ Figure \* ARABIC </w:instrText>
+                      </w:r>
+                      <w:r>
+                        <w:fldChar w:fldCharType="separate"/>
+                      </w:r>
+                      <w:r>
+                        <w:rPr>
+                          <w:noProof/>
+                        </w:rPr>
+                        <w:t>12</w:t>
+                      </w:r>
+                      <w:r>
+                        <w:fldChar w:fldCharType="end"/>
+                      </w:r>
+                      <w:r>
+                        <w:t>: Star Pattern</w:t>
+                      </w:r>
+                    </w:p>
+                  </w:txbxContent>
+                </v:textbox>
+                <w10:wrap type="topAndBottom"/>
+              </v:shape>
+            </w:pict>
+          </mc:Fallback>
+        </mc:AlternateContent>
+      </w:r>
+      <w:r>
+        <w:drawing>
+          <wp:anchor distT="0" distB="0" distL="114300" distR="114300" simplePos="0" relativeHeight="251696128" behindDoc="0" locked="0" layoutInCell="1" allowOverlap="1" wp14:anchorId="08E41B1A" wp14:editId="26474F12">
+            <wp:simplePos x="0" y="0"/>
+            <wp:positionH relativeFrom="margin">
+              <wp:align>center</wp:align>
+            </wp:positionH>
+            <wp:positionV relativeFrom="paragraph">
+              <wp:posOffset>320315</wp:posOffset>
+            </wp:positionV>
+            <wp:extent cx="3889375" cy="4174490"/>
+            <wp:effectExtent l="0" t="0" r="0" b="0"/>
+            <wp:wrapTopAndBottom/>
+            <wp:docPr id="1722033306" name="Picture 1"/>
+            <wp:cNvGraphicFramePr>
+              <a:graphicFrameLocks xmlns:a="http://schemas.openxmlformats.org/drawingml/2006/main" noChangeAspect="1"/>
+            </wp:cNvGraphicFramePr>
+            <a:graphic xmlns:a="http://schemas.openxmlformats.org/drawingml/2006/main">
+              <a:graphicData uri="http://schemas.openxmlformats.org/drawingml/2006/picture">
+                <pic:pic xmlns:pic="http://schemas.openxmlformats.org/drawingml/2006/picture">
+                  <pic:nvPicPr>
+                    <pic:cNvPr id="1722033306" name=""/>
+                    <pic:cNvPicPr/>
+                  </pic:nvPicPr>
+                  <pic:blipFill>
+                    <a:blip r:embed="rId19">
+                      <a:extLst>
+                        <a:ext uri="{28A0092B-C50C-407E-A947-70E740481C1C}">
+                          <a14:useLocalDpi xmlns:a14="http://schemas.microsoft.com/office/drawing/2010/main" val="0"/>
+                        </a:ext>
+                      </a:extLst>
+                    </a:blip>
+                    <a:stretch>
+                      <a:fillRect/>
+                    </a:stretch>
+                  </pic:blipFill>
+                  <pic:spPr>
+                    <a:xfrm>
+                      <a:off x="0" y="0"/>
+                      <a:ext cx="3889375" cy="4174490"/>
+                    </a:xfrm>
+                    <a:prstGeom prst="rect">
+                      <a:avLst/>
+                    </a:prstGeom>
+                  </pic:spPr>
+                </pic:pic>
+              </a:graphicData>
+            </a:graphic>
+            <wp14:sizeRelH relativeFrom="margin">
+              <wp14:pctWidth>0</wp14:pctWidth>
+            </wp14:sizeRelH>
+            <wp14:sizeRelV relativeFrom="margin">
+              <wp14:pctHeight>0</wp14:pctHeight>
+            </wp14:sizeRelV>
+          </wp:anchor>
+        </w:drawing>
+      </w:r>
+    </w:p>
+    <w:p/>
+    <w:p>
       <w:pPr>
         <w:pStyle w:val="Heading2"/>
       </w:pPr>
       <w:bookmarkStart w:id="15" w:name="_Toc212464889"/>
+      <w:r>
+        <w:rPr>
+          <w:noProof/>
+        </w:rPr>
+        <w:lastRenderedPageBreak/>
+        <mc:AlternateContent>
+          <mc:Choice Requires="wps">
+            <w:drawing>
+              <wp:anchor distT="0" distB="0" distL="114300" distR="114300" simplePos="0" relativeHeight="251701248" behindDoc="0" locked="0" layoutInCell="1" allowOverlap="1" wp14:anchorId="5B708287" wp14:editId="3E0306A4">
+                <wp:simplePos x="0" y="0"/>
+                <wp:positionH relativeFrom="column">
+                  <wp:posOffset>1315085</wp:posOffset>
+                </wp:positionH>
+                <wp:positionV relativeFrom="paragraph">
+                  <wp:posOffset>2047240</wp:posOffset>
+                </wp:positionV>
+                <wp:extent cx="2552700" cy="635"/>
+                <wp:effectExtent l="0" t="0" r="0" b="0"/>
+                <wp:wrapTopAndBottom/>
+                <wp:docPr id="479518916" name="Text Box 1"/>
+                <wp:cNvGraphicFramePr/>
+                <a:graphic xmlns:a="http://schemas.openxmlformats.org/drawingml/2006/main">
+                  <a:graphicData uri="http://schemas.microsoft.com/office/word/2010/wordprocessingShape">
+                    <wps:wsp>
+                      <wps:cNvSpPr txBox="1"/>
+                      <wps:spPr>
+                        <a:xfrm>
+                          <a:off x="0" y="0"/>
+                          <a:ext cx="2552700" cy="635"/>
+                        </a:xfrm>
+                        <a:prstGeom prst="rect">
+                          <a:avLst/>
+                        </a:prstGeom>
+                        <a:solidFill>
+                          <a:prstClr val="white"/>
+                        </a:solidFill>
+                        <a:ln>
+                          <a:noFill/>
+                        </a:ln>
+                      </wps:spPr>
+                      <wps:txbx>
+                        <w:txbxContent>
+                          <w:p>
+                            <w:pPr>
+                              <w:pStyle w:val="Caption"/>
+                              <w:rPr>
+                                <w:b/>
+                              </w:rPr>
+                            </w:pPr>
+                            <w:r>
+                              <w:t xml:space="preserve">Figure </w:t>
+                            </w:r>
+                            <w:r>
+                              <w:fldChar w:fldCharType="begin"/>
+                            </w:r>
+                            <w:r>
+                              <w:instrText xml:space="preserve"> SEQ Figure \* ARABIC </w:instrText>
+                            </w:r>
+                            <w:r>
+                              <w:fldChar w:fldCharType="separate"/>
+                            </w:r>
+                            <w:r>
+                              <w:rPr>
+                                <w:noProof/>
+                              </w:rPr>
+                              <w:t>13</w:t>
+                            </w:r>
+                            <w:r>
+                              <w:fldChar w:fldCharType="end"/>
+                            </w:r>
+                            <w:r>
+                              <w:t>: Star Pattern Output</w:t>
+                            </w:r>
+                          </w:p>
+                        </w:txbxContent>
+                      </wps:txbx>
+                      <wps:bodyPr rot="0" spcFirstLastPara="0" vertOverflow="overflow" horzOverflow="overflow" vert="horz" wrap="square" lIns="0" tIns="0" rIns="0" bIns="0" numCol="1" spcCol="0" rtlCol="0" fromWordArt="0" anchor="t" anchorCtr="0" forceAA="0" compatLnSpc="1">
+                        <a:prstTxWarp prst="textNoShape">
+                          <a:avLst/>
+                        </a:prstTxWarp>
+                        <a:spAutoFit/>
+                      </wps:bodyPr>
+                    </wps:wsp>
+                  </a:graphicData>
+                </a:graphic>
+              </wp:anchor>
+            </w:drawing>
+          </mc:Choice>
+          <mc:Fallback>
+            <w:pict>
+              <v:shape w14:anchorId="5B708287" id="_x0000_s1040" type="#_x0000_t202" style="position:absolute;margin-left:103.55pt;margin-top:161.2pt;width:201pt;height:.05pt;z-index:251701248;visibility:visible;mso-wrap-style:square;mso-wrap-distance-left:9pt;mso-wrap-distance-top:0;mso-wrap-distance-right:9pt;mso-wrap-distance-bottom:0;mso-position-horizontal:absolute;mso-position-horizontal-relative:text;mso-position-vertical:absolute;mso-position-vertical-relative:text;v-text-anchor:top" o:gfxdata="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" stroked="f">
+                <v:textbox style="mso-fit-shape-to-text:t" inset="0,0,0,0">
+                  <w:txbxContent>
+                    <w:p>
+                      <w:pPr>
+                        <w:pStyle w:val="Caption"/>
+                        <w:rPr>
+                          <w:b/>
+                        </w:rPr>
+                      </w:pPr>
+                      <w:r>
+                        <w:t xml:space="preserve">Figure </w:t>
+                      </w:r>
+                      <w:r>
+                        <w:fldChar w:fldCharType="begin"/>
+                      </w:r>
+                      <w:r>
+                        <w:instrText xml:space="preserve"> SEQ Figure \* ARABIC </w:instrText>
+                      </w:r>
+                      <w:r>
+                        <w:fldChar w:fldCharType="separate"/>
+                      </w:r>
+                      <w:r>
+                        <w:rPr>
+                          <w:noProof/>
+                        </w:rPr>
+                        <w:t>13</w:t>
+                      </w:r>
+                      <w:r>
+                        <w:fldChar w:fldCharType="end"/>
+                      </w:r>
+                      <w:r>
+                        <w:t>: Star Pattern Output</w:t>
+                      </w:r>
+                    </w:p>
+                  </w:txbxContent>
+                </v:textbox>
+                <w10:wrap type="topAndBottom"/>
+              </v:shape>
+            </w:pict>
+          </mc:Fallback>
+        </mc:AlternateContent>
+      </w:r>
+      <w:r>
+        <w:drawing>
+          <wp:anchor distT="0" distB="0" distL="114300" distR="114300" simplePos="0" relativeHeight="251699200" behindDoc="0" locked="0" layoutInCell="1" allowOverlap="1" wp14:anchorId="019D67E9" wp14:editId="6C993371">
+            <wp:simplePos x="0" y="0"/>
+            <wp:positionH relativeFrom="margin">
+              <wp:align>center</wp:align>
+            </wp:positionH>
+            <wp:positionV relativeFrom="paragraph">
+              <wp:posOffset>476202</wp:posOffset>
+            </wp:positionV>
+            <wp:extent cx="2553056" cy="1514686"/>
+            <wp:effectExtent l="0" t="0" r="0" b="9525"/>
+            <wp:wrapTopAndBottom/>
+            <wp:docPr id="1156691976" name="Picture 1"/>
+            <wp:cNvGraphicFramePr>
+              <a:graphicFrameLocks xmlns:a="http://schemas.openxmlformats.org/drawingml/2006/main" noChangeAspect="1"/>
+            </wp:cNvGraphicFramePr>
+            <a:graphic xmlns:a="http://schemas.openxmlformats.org/drawingml/2006/main">
+              <a:graphicData uri="http://schemas.openxmlformats.org/drawingml/2006/picture">
+                <pic:pic xmlns:pic="http://schemas.openxmlformats.org/drawingml/2006/picture">
+                  <pic:nvPicPr>
+                    <pic:cNvPr id="1156691976" name=""/>
+                    <pic:cNvPicPr/>
+                  </pic:nvPicPr>
+                  <pic:blipFill>
+                    <a:blip r:embed="rId20">
+                      <a:extLst>
+                        <a:ext uri="{28A0092B-C50C-407E-A947-70E740481C1C}">
+                          <a14:useLocalDpi xmlns:a14="http://schemas.microsoft.com/office/drawing/2010/main" val="0"/>
+                        </a:ext>
+                      </a:extLst>
+                    </a:blip>
+                    <a:stretch>
+                      <a:fillRect/>
+                    </a:stretch>
+                  </pic:blipFill>
+                  <pic:spPr>
+                    <a:xfrm>
+                      <a:off x="0" y="0"/>
+                      <a:ext cx="2553056" cy="1514686"/>
+                    </a:xfrm>
+                    <a:prstGeom prst="rect">
+                      <a:avLst/>
+                    </a:prstGeom>
+                  </pic:spPr>
+                </pic:pic>
+              </a:graphicData>
+            </a:graphic>
+          </wp:anchor>
+        </w:drawing>
+      </w:r>
       <w:r>
         <w:t>Tests</w:t>
       </w:r>
       <w:bookmarkEnd w:id="15"/>
     </w:p>
+    <w:p/>
     <w:p>
       <w:pPr>
         <w:jc w:val="left"/>
@@ -4630,9 +5006,9 @@
     </w:p>
     <w:p/>
     <w:sectPr>
-      <w:headerReference w:type="default" r:id="rId19"/>
-      <w:footerReference w:type="default" r:id="rId20"/>
-      <w:headerReference w:type="first" r:id="rId21"/>
+      <w:headerReference w:type="default" r:id="rId21"/>
+      <w:footerReference w:type="default" r:id="rId22"/>
+      <w:headerReference w:type="first" r:id="rId23"/>
       <w:pgSz w:w="11906" w:h="16838"/>
       <w:pgMar w:top="1872" w:right="1872" w:bottom="1872" w:left="1872" w:header="706" w:footer="706" w:gutter="0"/>
       <w:pgNumType w:start="0"/>

</xml_diff>

<commit_message>
Add Collatz Conjecture implementation and tests
Implemented the Collatz Conjecture logic in CollatzConjecture.java with methods to process numbers and run the sequence. Updated Main.java to demonstrate usage. Added CollatzConjectureTest.java with unit tests for both methods. Updated Protocol.docx.
</commit_message>
<xml_diff>
--- a/Modules/Semester_1/Modern Code/Aufgaben/02_Java_Variables_Types_Expression_Control_Structures/Protocol.docx
+++ b/Modules/Semester_1/Modern Code/Aufgaben/02_Java_Variables_Types_Expression_Control_Structures/Protocol.docx
@@ -265,6 +265,7 @@
                                   <w:tab/>
                                 </w:r>
                                 <w:proofErr w:type="spellStart"/>
+                                <w:proofErr w:type="gramStart"/>
                                 <w:r>
                                   <w:t>xx</w:t>
                                 </w:r>
@@ -274,6 +275,7 @@
                                 <w:r>
                                   <w:t>xx</w:t>
                                 </w:r>
+                                <w:proofErr w:type="gramEnd"/>
                                 <w:r>
                                   <w:t>:</w:t>
                                 </w:r>
@@ -377,6 +379,7 @@
                             <w:tab/>
                           </w:r>
                           <w:proofErr w:type="spellStart"/>
+                          <w:proofErr w:type="gramStart"/>
                           <w:r>
                             <w:t>xx</w:t>
                           </w:r>
@@ -386,6 +389,7 @@
                           <w:r>
                             <w:t>xx</w:t>
                           </w:r>
+                          <w:proofErr w:type="gramEnd"/>
                           <w:r>
                             <w:t>:</w:t>
                           </w:r>
@@ -4926,6 +4930,17 @@
       <w:bookmarkEnd w:id="17"/>
     </w:p>
     <w:p>
+      <w:r>
+        <w:t xml:space="preserve">While the number isn’t 1, with an if statement check whether it’s divisible by two or </w:t>
+      </w:r>
+      <w:r>
+        <w:t>not and</w:t>
+      </w:r>
+      <w:r>
+        <w:t xml:space="preserve"> do the appropriate calculation on the number. </w:t>
+      </w:r>
+    </w:p>
+    <w:p>
       <w:pPr>
         <w:pStyle w:val="Heading2"/>
       </w:pPr>
@@ -4934,6 +4949,191 @@
         <w:t>Code</w:t>
       </w:r>
       <w:bookmarkEnd w:id="18"/>
+    </w:p>
+    <w:p>
+      <w:r>
+        <w:rPr>
+          <w:noProof/>
+        </w:rPr>
+        <mc:AlternateContent>
+          <mc:Choice Requires="wps">
+            <w:drawing>
+              <wp:anchor distT="0" distB="0" distL="114300" distR="114300" simplePos="0" relativeHeight="251704320" behindDoc="0" locked="0" layoutInCell="1" allowOverlap="1" wp14:anchorId="350A1DF5" wp14:editId="76D25B8B">
+                <wp:simplePos x="0" y="0"/>
+                <wp:positionH relativeFrom="column">
+                  <wp:posOffset>196850</wp:posOffset>
+                </wp:positionH>
+                <wp:positionV relativeFrom="paragraph">
+                  <wp:posOffset>6170295</wp:posOffset>
+                </wp:positionV>
+                <wp:extent cx="4789170" cy="635"/>
+                <wp:effectExtent l="0" t="0" r="0" b="0"/>
+                <wp:wrapTopAndBottom/>
+                <wp:docPr id="674660336" name="Text Box 1"/>
+                <wp:cNvGraphicFramePr/>
+                <a:graphic xmlns:a="http://schemas.openxmlformats.org/drawingml/2006/main">
+                  <a:graphicData uri="http://schemas.microsoft.com/office/word/2010/wordprocessingShape">
+                    <wps:wsp>
+                      <wps:cNvSpPr txBox="1"/>
+                      <wps:spPr>
+                        <a:xfrm>
+                          <a:off x="0" y="0"/>
+                          <a:ext cx="4789170" cy="635"/>
+                        </a:xfrm>
+                        <a:prstGeom prst="rect">
+                          <a:avLst/>
+                        </a:prstGeom>
+                        <a:solidFill>
+                          <a:prstClr val="white"/>
+                        </a:solidFill>
+                        <a:ln>
+                          <a:noFill/>
+                        </a:ln>
+                      </wps:spPr>
+                      <wps:txbx>
+                        <w:txbxContent>
+                          <w:p>
+                            <w:pPr>
+                              <w:pStyle w:val="Caption"/>
+                            </w:pPr>
+                            <w:r>
+                              <w:t xml:space="preserve">Figure </w:t>
+                            </w:r>
+                            <w:r>
+                              <w:fldChar w:fldCharType="begin"/>
+                            </w:r>
+                            <w:r>
+                              <w:instrText xml:space="preserve"> SEQ Figure \* ARABIC </w:instrText>
+                            </w:r>
+                            <w:r>
+                              <w:fldChar w:fldCharType="separate"/>
+                            </w:r>
+                            <w:r>
+                              <w:rPr>
+                                <w:noProof/>
+                              </w:rPr>
+                              <w:t>14</w:t>
+                            </w:r>
+                            <w:r>
+                              <w:fldChar w:fldCharType="end"/>
+                            </w:r>
+                            <w:r>
+                              <w:t>: Collatz Conjecture Code</w:t>
+                            </w:r>
+                          </w:p>
+                        </w:txbxContent>
+                      </wps:txbx>
+                      <wps:bodyPr rot="0" spcFirstLastPara="0" vertOverflow="overflow" horzOverflow="overflow" vert="horz" wrap="square" lIns="0" tIns="0" rIns="0" bIns="0" numCol="1" spcCol="0" rtlCol="0" fromWordArt="0" anchor="t" anchorCtr="0" forceAA="0" compatLnSpc="1">
+                        <a:prstTxWarp prst="textNoShape">
+                          <a:avLst/>
+                        </a:prstTxWarp>
+                        <a:spAutoFit/>
+                      </wps:bodyPr>
+                    </wps:wsp>
+                  </a:graphicData>
+                </a:graphic>
+              </wp:anchor>
+            </w:drawing>
+          </mc:Choice>
+          <mc:Fallback>
+            <w:pict>
+              <v:shape w14:anchorId="350A1DF5" id="_x0000_s1041" type="#_x0000_t202" style="position:absolute;left:0;text-align:left;margin-left:15.5pt;margin-top:485.85pt;width:377.1pt;height:.05pt;z-index:251704320;visibility:visible;mso-wrap-style:square;mso-wrap-distance-left:9pt;mso-wrap-distance-top:0;mso-wrap-distance-right:9pt;mso-wrap-distance-bottom:0;mso-position-horizontal:absolute;mso-position-horizontal-relative:text;mso-position-vertical:absolute;mso-position-vertical-relative:text;v-text-anchor:top" o:gfxdata="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" stroked="f">
+                <v:textbox style="mso-fit-shape-to-text:t" inset="0,0,0,0">
+                  <w:txbxContent>
+                    <w:p>
+                      <w:pPr>
+                        <w:pStyle w:val="Caption"/>
+                      </w:pPr>
+                      <w:r>
+                        <w:t xml:space="preserve">Figure </w:t>
+                      </w:r>
+                      <w:r>
+                        <w:fldChar w:fldCharType="begin"/>
+                      </w:r>
+                      <w:r>
+                        <w:instrText xml:space="preserve"> SEQ Figure \* ARABIC </w:instrText>
+                      </w:r>
+                      <w:r>
+                        <w:fldChar w:fldCharType="separate"/>
+                      </w:r>
+                      <w:r>
+                        <w:rPr>
+                          <w:noProof/>
+                        </w:rPr>
+                        <w:t>14</w:t>
+                      </w:r>
+                      <w:r>
+                        <w:fldChar w:fldCharType="end"/>
+                      </w:r>
+                      <w:r>
+                        <w:t>: Collatz Conjecture Code</w:t>
+                      </w:r>
+                    </w:p>
+                  </w:txbxContent>
+                </v:textbox>
+                <w10:wrap type="topAndBottom"/>
+              </v:shape>
+            </w:pict>
+          </mc:Fallback>
+        </mc:AlternateContent>
+      </w:r>
+      <w:r>
+        <w:drawing>
+          <wp:anchor distT="0" distB="0" distL="114300" distR="114300" simplePos="0" relativeHeight="251702272" behindDoc="0" locked="0" layoutInCell="1" allowOverlap="1" wp14:anchorId="1EAC8D06" wp14:editId="0DA6CDDB">
+            <wp:simplePos x="0" y="0"/>
+            <wp:positionH relativeFrom="margin">
+              <wp:align>center</wp:align>
+            </wp:positionH>
+            <wp:positionV relativeFrom="paragraph">
+              <wp:posOffset>299464</wp:posOffset>
+            </wp:positionV>
+            <wp:extent cx="4789170" cy="5814060"/>
+            <wp:effectExtent l="0" t="0" r="0" b="0"/>
+            <wp:wrapTopAndBottom/>
+            <wp:docPr id="525944732" name="Picture 1"/>
+            <wp:cNvGraphicFramePr>
+              <a:graphicFrameLocks xmlns:a="http://schemas.openxmlformats.org/drawingml/2006/main" noChangeAspect="1"/>
+            </wp:cNvGraphicFramePr>
+            <a:graphic xmlns:a="http://schemas.openxmlformats.org/drawingml/2006/main">
+              <a:graphicData uri="http://schemas.openxmlformats.org/drawingml/2006/picture">
+                <pic:pic xmlns:pic="http://schemas.openxmlformats.org/drawingml/2006/picture">
+                  <pic:nvPicPr>
+                    <pic:cNvPr id="525944732" name=""/>
+                    <pic:cNvPicPr/>
+                  </pic:nvPicPr>
+                  <pic:blipFill>
+                    <a:blip r:embed="rId21">
+                      <a:extLst>
+                        <a:ext uri="{28A0092B-C50C-407E-A947-70E740481C1C}">
+                          <a14:useLocalDpi xmlns:a14="http://schemas.microsoft.com/office/drawing/2010/main" val="0"/>
+                        </a:ext>
+                      </a:extLst>
+                    </a:blip>
+                    <a:stretch>
+                      <a:fillRect/>
+                    </a:stretch>
+                  </pic:blipFill>
+                  <pic:spPr>
+                    <a:xfrm>
+                      <a:off x="0" y="0"/>
+                      <a:ext cx="4789170" cy="5814060"/>
+                    </a:xfrm>
+                    <a:prstGeom prst="rect">
+                      <a:avLst/>
+                    </a:prstGeom>
+                  </pic:spPr>
+                </pic:pic>
+              </a:graphicData>
+            </a:graphic>
+            <wp14:sizeRelH relativeFrom="margin">
+              <wp14:pctWidth>0</wp14:pctWidth>
+            </wp14:sizeRelH>
+            <wp14:sizeRelV relativeFrom="margin">
+              <wp14:pctHeight>0</wp14:pctHeight>
+            </wp14:sizeRelV>
+          </wp:anchor>
+        </w:drawing>
+      </w:r>
     </w:p>
     <w:p>
       <w:pPr>
@@ -4941,9 +5141,267 @@
       </w:pPr>
       <w:bookmarkStart w:id="19" w:name="_Toc212464893"/>
       <w:r>
+        <w:rPr>
+          <w:noProof/>
+        </w:rPr>
+        <w:lastRenderedPageBreak/>
+        <mc:AlternateContent>
+          <mc:Choice Requires="wps">
+            <w:drawing>
+              <wp:anchor distT="0" distB="0" distL="114300" distR="114300" simplePos="0" relativeHeight="251707392" behindDoc="0" locked="0" layoutInCell="1" allowOverlap="1" wp14:anchorId="2E87D05B" wp14:editId="24B09897">
+                <wp:simplePos x="0" y="0"/>
+                <wp:positionH relativeFrom="column">
+                  <wp:posOffset>1372235</wp:posOffset>
+                </wp:positionH>
+                <wp:positionV relativeFrom="paragraph">
+                  <wp:posOffset>1313815</wp:posOffset>
+                </wp:positionV>
+                <wp:extent cx="2438400" cy="635"/>
+                <wp:effectExtent l="0" t="0" r="0" b="0"/>
+                <wp:wrapTopAndBottom/>
+                <wp:docPr id="57986817" name="Text Box 1"/>
+                <wp:cNvGraphicFramePr/>
+                <a:graphic xmlns:a="http://schemas.openxmlformats.org/drawingml/2006/main">
+                  <a:graphicData uri="http://schemas.microsoft.com/office/word/2010/wordprocessingShape">
+                    <wps:wsp>
+                      <wps:cNvSpPr txBox="1"/>
+                      <wps:spPr>
+                        <a:xfrm>
+                          <a:off x="0" y="0"/>
+                          <a:ext cx="2438400" cy="635"/>
+                        </a:xfrm>
+                        <a:prstGeom prst="rect">
+                          <a:avLst/>
+                        </a:prstGeom>
+                        <a:solidFill>
+                          <a:prstClr val="white"/>
+                        </a:solidFill>
+                        <a:ln>
+                          <a:noFill/>
+                        </a:ln>
+                      </wps:spPr>
+                      <wps:txbx>
+                        <w:txbxContent>
+                          <w:p>
+                            <w:pPr>
+                              <w:pStyle w:val="Caption"/>
+                              <w:rPr>
+                                <w:b/>
+                              </w:rPr>
+                            </w:pPr>
+                            <w:r>
+                              <w:t xml:space="preserve">Figure </w:t>
+                            </w:r>
+                            <w:r>
+                              <w:fldChar w:fldCharType="begin"/>
+                            </w:r>
+                            <w:r>
+                              <w:instrText xml:space="preserve"> SEQ Figure \* ARABIC </w:instrText>
+                            </w:r>
+                            <w:r>
+                              <w:fldChar w:fldCharType="separate"/>
+                            </w:r>
+                            <w:r>
+                              <w:rPr>
+                                <w:noProof/>
+                              </w:rPr>
+                              <w:t>15</w:t>
+                            </w:r>
+                            <w:r>
+                              <w:fldChar w:fldCharType="end"/>
+                            </w:r>
+                            <w:r>
+                              <w:t>: Collatz Conjecture Output</w:t>
+                            </w:r>
+                          </w:p>
+                        </w:txbxContent>
+                      </wps:txbx>
+                      <wps:bodyPr rot="0" spcFirstLastPara="0" vertOverflow="overflow" horzOverflow="overflow" vert="horz" wrap="square" lIns="0" tIns="0" rIns="0" bIns="0" numCol="1" spcCol="0" rtlCol="0" fromWordArt="0" anchor="t" anchorCtr="0" forceAA="0" compatLnSpc="1">
+                        <a:prstTxWarp prst="textNoShape">
+                          <a:avLst/>
+                        </a:prstTxWarp>
+                        <a:spAutoFit/>
+                      </wps:bodyPr>
+                    </wps:wsp>
+                  </a:graphicData>
+                </a:graphic>
+              </wp:anchor>
+            </w:drawing>
+          </mc:Choice>
+          <mc:Fallback>
+            <w:pict>
+              <v:shape w14:anchorId="2E87D05B" id="_x0000_s1042" type="#_x0000_t202" style="position:absolute;margin-left:108.05pt;margin-top:103.45pt;width:192pt;height:.05pt;z-index:251707392;visibility:visible;mso-wrap-style:square;mso-wrap-distance-left:9pt;mso-wrap-distance-top:0;mso-wrap-distance-right:9pt;mso-wrap-distance-bottom:0;mso-position-horizontal:absolute;mso-position-horizontal-relative:text;mso-position-vertical:absolute;mso-position-vertical-relative:text;v-text-anchor:top" o:gfxdata="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" stroked="f">
+                <v:textbox style="mso-fit-shape-to-text:t" inset="0,0,0,0">
+                  <w:txbxContent>
+                    <w:p>
+                      <w:pPr>
+                        <w:pStyle w:val="Caption"/>
+                        <w:rPr>
+                          <w:b/>
+                        </w:rPr>
+                      </w:pPr>
+                      <w:r>
+                        <w:t xml:space="preserve">Figure </w:t>
+                      </w:r>
+                      <w:r>
+                        <w:fldChar w:fldCharType="begin"/>
+                      </w:r>
+                      <w:r>
+                        <w:instrText xml:space="preserve"> SEQ Figure \* ARABIC </w:instrText>
+                      </w:r>
+                      <w:r>
+                        <w:fldChar w:fldCharType="separate"/>
+                      </w:r>
+                      <w:r>
+                        <w:rPr>
+                          <w:noProof/>
+                        </w:rPr>
+                        <w:t>15</w:t>
+                      </w:r>
+                      <w:r>
+                        <w:fldChar w:fldCharType="end"/>
+                      </w:r>
+                      <w:r>
+                        <w:t>: Collatz Conjecture Output</w:t>
+                      </w:r>
+                    </w:p>
+                  </w:txbxContent>
+                </v:textbox>
+                <w10:wrap type="topAndBottom"/>
+              </v:shape>
+            </w:pict>
+          </mc:Fallback>
+        </mc:AlternateContent>
+      </w:r>
+      <w:r>
+        <w:drawing>
+          <wp:anchor distT="0" distB="0" distL="114300" distR="114300" simplePos="0" relativeHeight="251705344" behindDoc="0" locked="0" layoutInCell="1" allowOverlap="1" wp14:anchorId="6E0B82FE" wp14:editId="7F39C051">
+            <wp:simplePos x="0" y="0"/>
+            <wp:positionH relativeFrom="margin">
+              <wp:align>center</wp:align>
+            </wp:positionH>
+            <wp:positionV relativeFrom="paragraph">
+              <wp:posOffset>476203</wp:posOffset>
+            </wp:positionV>
+            <wp:extent cx="2438740" cy="781159"/>
+            <wp:effectExtent l="0" t="0" r="0" b="0"/>
+            <wp:wrapTopAndBottom/>
+            <wp:docPr id="848404743" name="Picture 1"/>
+            <wp:cNvGraphicFramePr>
+              <a:graphicFrameLocks xmlns:a="http://schemas.openxmlformats.org/drawingml/2006/main" noChangeAspect="1"/>
+            </wp:cNvGraphicFramePr>
+            <a:graphic xmlns:a="http://schemas.openxmlformats.org/drawingml/2006/main">
+              <a:graphicData uri="http://schemas.openxmlformats.org/drawingml/2006/picture">
+                <pic:pic xmlns:pic="http://schemas.openxmlformats.org/drawingml/2006/picture">
+                  <pic:nvPicPr>
+                    <pic:cNvPr id="848404743" name=""/>
+                    <pic:cNvPicPr/>
+                  </pic:nvPicPr>
+                  <pic:blipFill>
+                    <a:blip r:embed="rId22">
+                      <a:extLst>
+                        <a:ext uri="{28A0092B-C50C-407E-A947-70E740481C1C}">
+                          <a14:useLocalDpi xmlns:a14="http://schemas.microsoft.com/office/drawing/2010/main" val="0"/>
+                        </a:ext>
+                      </a:extLst>
+                    </a:blip>
+                    <a:stretch>
+                      <a:fillRect/>
+                    </a:stretch>
+                  </pic:blipFill>
+                  <pic:spPr>
+                    <a:xfrm>
+                      <a:off x="0" y="0"/>
+                      <a:ext cx="2438740" cy="781159"/>
+                    </a:xfrm>
+                    <a:prstGeom prst="rect">
+                      <a:avLst/>
+                    </a:prstGeom>
+                  </pic:spPr>
+                </pic:pic>
+              </a:graphicData>
+            </a:graphic>
+          </wp:anchor>
+        </w:drawing>
+      </w:r>
+      <w:r>
         <w:t>Tests</w:t>
       </w:r>
       <w:bookmarkEnd w:id="19"/>
+    </w:p>
+    <w:p/>
+    <w:p/>
+    <w:p>
+      <w:pPr>
+        <w:keepNext/>
+      </w:pPr>
+      <w:r>
+        <w:drawing>
+          <wp:inline distT="0" distB="0" distL="0" distR="0" wp14:anchorId="1B7D7F41" wp14:editId="7979568F">
+            <wp:extent cx="5182870" cy="1324610"/>
+            <wp:effectExtent l="0" t="0" r="0" b="8890"/>
+            <wp:docPr id="1933774203" name="Picture 1"/>
+            <wp:cNvGraphicFramePr>
+              <a:graphicFrameLocks xmlns:a="http://schemas.openxmlformats.org/drawingml/2006/main" noChangeAspect="1"/>
+            </wp:cNvGraphicFramePr>
+            <a:graphic xmlns:a="http://schemas.openxmlformats.org/drawingml/2006/main">
+              <a:graphicData uri="http://schemas.openxmlformats.org/drawingml/2006/picture">
+                <pic:pic xmlns:pic="http://schemas.openxmlformats.org/drawingml/2006/picture">
+                  <pic:nvPicPr>
+                    <pic:cNvPr id="1933774203" name=""/>
+                    <pic:cNvPicPr/>
+                  </pic:nvPicPr>
+                  <pic:blipFill>
+                    <a:blip r:embed="rId23"/>
+                    <a:stretch>
+                      <a:fillRect/>
+                    </a:stretch>
+                  </pic:blipFill>
+                  <pic:spPr>
+                    <a:xfrm>
+                      <a:off x="0" y="0"/>
+                      <a:ext cx="5182870" cy="1324610"/>
+                    </a:xfrm>
+                    <a:prstGeom prst="rect">
+                      <a:avLst/>
+                    </a:prstGeom>
+                  </pic:spPr>
+                </pic:pic>
+              </a:graphicData>
+            </a:graphic>
+          </wp:inline>
+        </w:drawing>
+      </w:r>
+    </w:p>
+    <w:p>
+      <w:pPr>
+        <w:pStyle w:val="Caption"/>
+        <w:jc w:val="both"/>
+      </w:pPr>
+      <w:r>
+        <w:t xml:space="preserve">Figure </w:t>
+      </w:r>
+      <w:r>
+        <w:fldChar w:fldCharType="begin"/>
+      </w:r>
+      <w:r>
+        <w:instrText xml:space="preserve"> SEQ Figure \* ARABIC </w:instrText>
+      </w:r>
+      <w:r>
+        <w:fldChar w:fldCharType="separate"/>
+      </w:r>
+      <w:r>
+        <w:rPr>
+          <w:noProof/>
+        </w:rPr>
+        <w:t>16</w:t>
+      </w:r>
+      <w:r>
+        <w:fldChar w:fldCharType="end"/>
+      </w:r>
+      <w:r>
+        <w:t>: Collatz Conjecture Unit Tests</w:t>
+      </w:r>
     </w:p>
     <w:p>
       <w:pPr>
@@ -5006,9 +5464,9 @@
     </w:p>
     <w:p/>
     <w:sectPr>
-      <w:headerReference w:type="default" r:id="rId21"/>
-      <w:footerReference w:type="default" r:id="rId22"/>
-      <w:headerReference w:type="first" r:id="rId23"/>
+      <w:headerReference w:type="default" r:id="rId24"/>
+      <w:footerReference w:type="default" r:id="rId25"/>
+      <w:headerReference w:type="first" r:id="rId26"/>
       <w:pgSz w:w="11906" w:h="16838"/>
       <w:pgMar w:top="1872" w:right="1872" w:bottom="1872" w:left="1872" w:header="706" w:footer="706" w:gutter="0"/>
       <w:pgNumType w:start="0"/>

</xml_diff>

<commit_message>
Add DiceRollingSimulator with tests and main usage
Implemented DiceRollingSimulator with methods to roll a dice, validate input, and simulate rolls until a target is reached. Updated Main to demonstrate usage. Added unit tests for DiceRollingSimulator covering dice roll range, input validation, and simulation logic.
</commit_message>
<xml_diff>
--- a/Modules/Semester_1/Modern Code/Aufgaben/02_Java_Variables_Types_Expression_Control_Structures/Protocol.docx
+++ b/Modules/Semester_1/Modern Code/Aufgaben/02_Java_Variables_Types_Expression_Control_Structures/Protocol.docx
@@ -5443,30 +5443,771 @@
       <w:bookmarkEnd w:id="21"/>
     </w:p>
     <w:p>
-      <w:pPr>
-        <w:pStyle w:val="Heading2"/>
-      </w:pPr>
-      <w:bookmarkStart w:id="22" w:name="_Toc212464896"/>
-      <w:r>
-        <w:t>Code</w:t>
-      </w:r>
-      <w:bookmarkEnd w:id="22"/>
+      <w:r>
+        <w:t>Generate random numbers in a while loop until random number is equal to target number.</w:t>
+      </w:r>
     </w:p>
     <w:p>
       <w:pPr>
         <w:pStyle w:val="Heading2"/>
       </w:pPr>
+      <w:bookmarkStart w:id="22" w:name="_Toc212464896"/>
+      <w:r>
+        <w:rPr>
+          <w:noProof/>
+        </w:rPr>
+        <mc:AlternateContent>
+          <mc:Choice Requires="wps">
+            <w:drawing>
+              <wp:anchor distT="0" distB="0" distL="114300" distR="114300" simplePos="0" relativeHeight="251716608" behindDoc="0" locked="0" layoutInCell="1" allowOverlap="1" wp14:anchorId="4B1CA097" wp14:editId="6A8681AA">
+                <wp:simplePos x="0" y="0"/>
+                <wp:positionH relativeFrom="column">
+                  <wp:posOffset>438785</wp:posOffset>
+                </wp:positionH>
+                <wp:positionV relativeFrom="paragraph">
+                  <wp:posOffset>3458845</wp:posOffset>
+                </wp:positionV>
+                <wp:extent cx="4298315" cy="635"/>
+                <wp:effectExtent l="0" t="0" r="0" b="0"/>
+                <wp:wrapTopAndBottom/>
+                <wp:docPr id="2033705924" name="Text Box 1"/>
+                <wp:cNvGraphicFramePr/>
+                <a:graphic xmlns:a="http://schemas.openxmlformats.org/drawingml/2006/main">
+                  <a:graphicData uri="http://schemas.microsoft.com/office/word/2010/wordprocessingShape">
+                    <wps:wsp>
+                      <wps:cNvSpPr txBox="1"/>
+                      <wps:spPr>
+                        <a:xfrm>
+                          <a:off x="0" y="0"/>
+                          <a:ext cx="4298315" cy="635"/>
+                        </a:xfrm>
+                        <a:prstGeom prst="rect">
+                          <a:avLst/>
+                        </a:prstGeom>
+                        <a:solidFill>
+                          <a:prstClr val="white"/>
+                        </a:solidFill>
+                        <a:ln>
+                          <a:noFill/>
+                        </a:ln>
+                      </wps:spPr>
+                      <wps:txbx>
+                        <w:txbxContent>
+                          <w:p>
+                            <w:pPr>
+                              <w:pStyle w:val="Caption"/>
+                              <w:rPr>
+                                <w:b/>
+                              </w:rPr>
+                            </w:pPr>
+                            <w:r>
+                              <w:t xml:space="preserve">Figure </w:t>
+                            </w:r>
+                            <w:r>
+                              <w:fldChar w:fldCharType="begin"/>
+                            </w:r>
+                            <w:r>
+                              <w:instrText xml:space="preserve"> SEQ Figure \* ARABIC </w:instrText>
+                            </w:r>
+                            <w:r>
+                              <w:fldChar w:fldCharType="separate"/>
+                            </w:r>
+                            <w:r>
+                              <w:rPr>
+                                <w:noProof/>
+                              </w:rPr>
+                              <w:t>17</w:t>
+                            </w:r>
+                            <w:r>
+                              <w:fldChar w:fldCharType="end"/>
+                            </w:r>
+                            <w:r>
+                              <w:t>: Dice Rolling Sim</w:t>
+                            </w:r>
+                          </w:p>
+                        </w:txbxContent>
+                      </wps:txbx>
+                      <wps:bodyPr rot="0" spcFirstLastPara="0" vertOverflow="overflow" horzOverflow="overflow" vert="horz" wrap="square" lIns="0" tIns="0" rIns="0" bIns="0" numCol="1" spcCol="0" rtlCol="0" fromWordArt="0" anchor="t" anchorCtr="0" forceAA="0" compatLnSpc="1">
+                        <a:prstTxWarp prst="textNoShape">
+                          <a:avLst/>
+                        </a:prstTxWarp>
+                        <a:spAutoFit/>
+                      </wps:bodyPr>
+                    </wps:wsp>
+                  </a:graphicData>
+                </a:graphic>
+              </wp:anchor>
+            </w:drawing>
+          </mc:Choice>
+          <mc:Fallback>
+            <w:pict>
+              <v:shape w14:anchorId="4B1CA097" id="_x0000_s1043" type="#_x0000_t202" style="position:absolute;margin-left:34.55pt;margin-top:272.35pt;width:338.45pt;height:.05pt;z-index:251716608;visibility:visible;mso-wrap-style:square;mso-wrap-distance-left:9pt;mso-wrap-distance-top:0;mso-wrap-distance-right:9pt;mso-wrap-distance-bottom:0;mso-position-horizontal:absolute;mso-position-horizontal-relative:text;mso-position-vertical:absolute;mso-position-vertical-relative:text;v-text-anchor:top" o:gfxdata="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" stroked="f">
+                <v:textbox style="mso-fit-shape-to-text:t" inset="0,0,0,0">
+                  <w:txbxContent>
+                    <w:p>
+                      <w:pPr>
+                        <w:pStyle w:val="Caption"/>
+                        <w:rPr>
+                          <w:b/>
+                        </w:rPr>
+                      </w:pPr>
+                      <w:r>
+                        <w:t xml:space="preserve">Figure </w:t>
+                      </w:r>
+                      <w:r>
+                        <w:fldChar w:fldCharType="begin"/>
+                      </w:r>
+                      <w:r>
+                        <w:instrText xml:space="preserve"> SEQ Figure \* ARABIC </w:instrText>
+                      </w:r>
+                      <w:r>
+                        <w:fldChar w:fldCharType="separate"/>
+                      </w:r>
+                      <w:r>
+                        <w:rPr>
+                          <w:noProof/>
+                        </w:rPr>
+                        <w:t>17</w:t>
+                      </w:r>
+                      <w:r>
+                        <w:fldChar w:fldCharType="end"/>
+                      </w:r>
+                      <w:r>
+                        <w:t>: Dice Rolling Sim</w:t>
+                      </w:r>
+                    </w:p>
+                  </w:txbxContent>
+                </v:textbox>
+                <w10:wrap type="topAndBottom"/>
+              </v:shape>
+            </w:pict>
+          </mc:Fallback>
+        </mc:AlternateContent>
+      </w:r>
+      <w:r>
+        <w:drawing>
+          <wp:anchor distT="0" distB="0" distL="114300" distR="114300" simplePos="0" relativeHeight="251714560" behindDoc="0" locked="0" layoutInCell="1" allowOverlap="1" wp14:anchorId="0FFC8B8C" wp14:editId="782A7876">
+            <wp:simplePos x="0" y="0"/>
+            <wp:positionH relativeFrom="margin">
+              <wp:align>center</wp:align>
+            </wp:positionH>
+            <wp:positionV relativeFrom="paragraph">
+              <wp:posOffset>372479</wp:posOffset>
+            </wp:positionV>
+            <wp:extent cx="4298315" cy="3029585"/>
+            <wp:effectExtent l="0" t="0" r="6985" b="0"/>
+            <wp:wrapTopAndBottom/>
+            <wp:docPr id="1159107244" name="Picture 1"/>
+            <wp:cNvGraphicFramePr>
+              <a:graphicFrameLocks xmlns:a="http://schemas.openxmlformats.org/drawingml/2006/main" noChangeAspect="1"/>
+            </wp:cNvGraphicFramePr>
+            <a:graphic xmlns:a="http://schemas.openxmlformats.org/drawingml/2006/main">
+              <a:graphicData uri="http://schemas.openxmlformats.org/drawingml/2006/picture">
+                <pic:pic xmlns:pic="http://schemas.openxmlformats.org/drawingml/2006/picture">
+                  <pic:nvPicPr>
+                    <pic:cNvPr id="1159107244" name=""/>
+                    <pic:cNvPicPr/>
+                  </pic:nvPicPr>
+                  <pic:blipFill>
+                    <a:blip r:embed="rId24">
+                      <a:extLst>
+                        <a:ext uri="{28A0092B-C50C-407E-A947-70E740481C1C}">
+                          <a14:useLocalDpi xmlns:a14="http://schemas.microsoft.com/office/drawing/2010/main" val="0"/>
+                        </a:ext>
+                      </a:extLst>
+                    </a:blip>
+                    <a:stretch>
+                      <a:fillRect/>
+                    </a:stretch>
+                  </pic:blipFill>
+                  <pic:spPr>
+                    <a:xfrm>
+                      <a:off x="0" y="0"/>
+                      <a:ext cx="4298315" cy="3029585"/>
+                    </a:xfrm>
+                    <a:prstGeom prst="rect">
+                      <a:avLst/>
+                    </a:prstGeom>
+                  </pic:spPr>
+                </pic:pic>
+              </a:graphicData>
+            </a:graphic>
+            <wp14:sizeRelH relativeFrom="margin">
+              <wp14:pctWidth>0</wp14:pctWidth>
+            </wp14:sizeRelH>
+            <wp14:sizeRelV relativeFrom="margin">
+              <wp14:pctHeight>0</wp14:pctHeight>
+            </wp14:sizeRelV>
+          </wp:anchor>
+        </w:drawing>
+      </w:r>
+      <w:r>
+        <w:t>Code</w:t>
+      </w:r>
+      <w:bookmarkEnd w:id="22"/>
+    </w:p>
+    <w:p/>
+    <w:p>
+      <w:r>
+        <w:rPr>
+          <w:noProof/>
+        </w:rPr>
+        <w:lastRenderedPageBreak/>
+        <mc:AlternateContent>
+          <mc:Choice Requires="wps">
+            <w:drawing>
+              <wp:anchor distT="0" distB="0" distL="114300" distR="114300" simplePos="0" relativeHeight="251719680" behindDoc="0" locked="0" layoutInCell="1" allowOverlap="1" wp14:anchorId="595A26C3" wp14:editId="5239C738">
+                <wp:simplePos x="0" y="0"/>
+                <wp:positionH relativeFrom="column">
+                  <wp:posOffset>-1270</wp:posOffset>
+                </wp:positionH>
+                <wp:positionV relativeFrom="paragraph">
+                  <wp:posOffset>4413885</wp:posOffset>
+                </wp:positionV>
+                <wp:extent cx="5182870" cy="635"/>
+                <wp:effectExtent l="0" t="0" r="0" b="0"/>
+                <wp:wrapTopAndBottom/>
+                <wp:docPr id="1248332566" name="Text Box 1"/>
+                <wp:cNvGraphicFramePr/>
+                <a:graphic xmlns:a="http://schemas.openxmlformats.org/drawingml/2006/main">
+                  <a:graphicData uri="http://schemas.microsoft.com/office/word/2010/wordprocessingShape">
+                    <wps:wsp>
+                      <wps:cNvSpPr txBox="1"/>
+                      <wps:spPr>
+                        <a:xfrm>
+                          <a:off x="0" y="0"/>
+                          <a:ext cx="5182870" cy="635"/>
+                        </a:xfrm>
+                        <a:prstGeom prst="rect">
+                          <a:avLst/>
+                        </a:prstGeom>
+                        <a:solidFill>
+                          <a:prstClr val="white"/>
+                        </a:solidFill>
+                        <a:ln>
+                          <a:noFill/>
+                        </a:ln>
+                      </wps:spPr>
+                      <wps:txbx>
+                        <w:txbxContent>
+                          <w:p>
+                            <w:pPr>
+                              <w:pStyle w:val="Caption"/>
+                            </w:pPr>
+                            <w:r>
+                              <w:t xml:space="preserve">Figure </w:t>
+                            </w:r>
+                            <w:r>
+                              <w:fldChar w:fldCharType="begin"/>
+                            </w:r>
+                            <w:r>
+                              <w:instrText xml:space="preserve"> SEQ Figure \* ARABIC </w:instrText>
+                            </w:r>
+                            <w:r>
+                              <w:fldChar w:fldCharType="separate"/>
+                            </w:r>
+                            <w:r>
+                              <w:rPr>
+                                <w:noProof/>
+                              </w:rPr>
+                              <w:t>18</w:t>
+                            </w:r>
+                            <w:r>
+                              <w:fldChar w:fldCharType="end"/>
+                            </w:r>
+                            <w:r>
+                              <w:t>: Dice Rolling Sim</w:t>
+                            </w:r>
+                          </w:p>
+                        </w:txbxContent>
+                      </wps:txbx>
+                      <wps:bodyPr rot="0" spcFirstLastPara="0" vertOverflow="overflow" horzOverflow="overflow" vert="horz" wrap="square" lIns="0" tIns="0" rIns="0" bIns="0" numCol="1" spcCol="0" rtlCol="0" fromWordArt="0" anchor="t" anchorCtr="0" forceAA="0" compatLnSpc="1">
+                        <a:prstTxWarp prst="textNoShape">
+                          <a:avLst/>
+                        </a:prstTxWarp>
+                        <a:spAutoFit/>
+                      </wps:bodyPr>
+                    </wps:wsp>
+                  </a:graphicData>
+                </a:graphic>
+              </wp:anchor>
+            </w:drawing>
+          </mc:Choice>
+          <mc:Fallback>
+            <w:pict>
+              <v:shape w14:anchorId="595A26C3" id="_x0000_s1044" type="#_x0000_t202" style="position:absolute;left:0;text-align:left;margin-left:-.1pt;margin-top:347.55pt;width:408.1pt;height:.05pt;z-index:251719680;visibility:visible;mso-wrap-style:square;mso-wrap-distance-left:9pt;mso-wrap-distance-top:0;mso-wrap-distance-right:9pt;mso-wrap-distance-bottom:0;mso-position-horizontal:absolute;mso-position-horizontal-relative:text;mso-position-vertical:absolute;mso-position-vertical-relative:text;v-text-anchor:top" o:gfxdata="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" stroked="f">
+                <v:textbox style="mso-fit-shape-to-text:t" inset="0,0,0,0">
+                  <w:txbxContent>
+                    <w:p>
+                      <w:pPr>
+                        <w:pStyle w:val="Caption"/>
+                      </w:pPr>
+                      <w:r>
+                        <w:t xml:space="preserve">Figure </w:t>
+                      </w:r>
+                      <w:r>
+                        <w:fldChar w:fldCharType="begin"/>
+                      </w:r>
+                      <w:r>
+                        <w:instrText xml:space="preserve"> SEQ Figure \* ARABIC </w:instrText>
+                      </w:r>
+                      <w:r>
+                        <w:fldChar w:fldCharType="separate"/>
+                      </w:r>
+                      <w:r>
+                        <w:rPr>
+                          <w:noProof/>
+                        </w:rPr>
+                        <w:t>18</w:t>
+                      </w:r>
+                      <w:r>
+                        <w:fldChar w:fldCharType="end"/>
+                      </w:r>
+                      <w:r>
+                        <w:t>: Dice Rolling Sim</w:t>
+                      </w:r>
+                    </w:p>
+                  </w:txbxContent>
+                </v:textbox>
+                <w10:wrap type="topAndBottom"/>
+              </v:shape>
+            </w:pict>
+          </mc:Fallback>
+        </mc:AlternateContent>
+      </w:r>
+      <w:r>
+        <w:drawing>
+          <wp:anchor distT="0" distB="0" distL="114300" distR="114300" simplePos="0" relativeHeight="251717632" behindDoc="0" locked="0" layoutInCell="1" allowOverlap="1" wp14:anchorId="22638630" wp14:editId="207783C0">
+            <wp:simplePos x="0" y="0"/>
+            <wp:positionH relativeFrom="column">
+              <wp:posOffset>-1365</wp:posOffset>
+            </wp:positionH>
+            <wp:positionV relativeFrom="paragraph">
+              <wp:posOffset>540</wp:posOffset>
+            </wp:positionV>
+            <wp:extent cx="5182870" cy="4356735"/>
+            <wp:effectExtent l="0" t="0" r="0" b="5715"/>
+            <wp:wrapTopAndBottom/>
+            <wp:docPr id="1127570014" name="Picture 1"/>
+            <wp:cNvGraphicFramePr>
+              <a:graphicFrameLocks xmlns:a="http://schemas.openxmlformats.org/drawingml/2006/main" noChangeAspect="1"/>
+            </wp:cNvGraphicFramePr>
+            <a:graphic xmlns:a="http://schemas.openxmlformats.org/drawingml/2006/main">
+              <a:graphicData uri="http://schemas.openxmlformats.org/drawingml/2006/picture">
+                <pic:pic xmlns:pic="http://schemas.openxmlformats.org/drawingml/2006/picture">
+                  <pic:nvPicPr>
+                    <pic:cNvPr id="1127570014" name=""/>
+                    <pic:cNvPicPr/>
+                  </pic:nvPicPr>
+                  <pic:blipFill>
+                    <a:blip r:embed="rId25">
+                      <a:extLst>
+                        <a:ext uri="{28A0092B-C50C-407E-A947-70E740481C1C}">
+                          <a14:useLocalDpi xmlns:a14="http://schemas.microsoft.com/office/drawing/2010/main" val="0"/>
+                        </a:ext>
+                      </a:extLst>
+                    </a:blip>
+                    <a:stretch>
+                      <a:fillRect/>
+                    </a:stretch>
+                  </pic:blipFill>
+                  <pic:spPr>
+                    <a:xfrm>
+                      <a:off x="0" y="0"/>
+                      <a:ext cx="5182870" cy="4356735"/>
+                    </a:xfrm>
+                    <a:prstGeom prst="rect">
+                      <a:avLst/>
+                    </a:prstGeom>
+                  </pic:spPr>
+                </pic:pic>
+              </a:graphicData>
+            </a:graphic>
+          </wp:anchor>
+        </w:drawing>
+      </w:r>
+    </w:p>
+    <w:p/>
+    <w:p>
+      <w:pPr>
+        <w:pStyle w:val="Heading2"/>
+      </w:pPr>
       <w:bookmarkStart w:id="23" w:name="_Toc212464897"/>
+      <w:r>
+        <w:rPr>
+          <w:noProof/>
+        </w:rPr>
+        <w:lastRenderedPageBreak/>
+        <mc:AlternateContent>
+          <mc:Choice Requires="wps">
+            <w:drawing>
+              <wp:anchor distT="0" distB="0" distL="114300" distR="114300" simplePos="0" relativeHeight="251711488" behindDoc="0" locked="0" layoutInCell="1" allowOverlap="1" wp14:anchorId="1612BD2C" wp14:editId="5AE55DF3">
+                <wp:simplePos x="0" y="0"/>
+                <wp:positionH relativeFrom="margin">
+                  <wp:align>center</wp:align>
+                </wp:positionH>
+                <wp:positionV relativeFrom="paragraph">
+                  <wp:posOffset>2970094</wp:posOffset>
+                </wp:positionV>
+                <wp:extent cx="2847975" cy="635"/>
+                <wp:effectExtent l="0" t="0" r="9525" b="2540"/>
+                <wp:wrapTopAndBottom/>
+                <wp:docPr id="1382715092" name="Text Box 1"/>
+                <wp:cNvGraphicFramePr/>
+                <a:graphic xmlns:a="http://schemas.openxmlformats.org/drawingml/2006/main">
+                  <a:graphicData uri="http://schemas.microsoft.com/office/word/2010/wordprocessingShape">
+                    <wps:wsp>
+                      <wps:cNvSpPr txBox="1"/>
+                      <wps:spPr>
+                        <a:xfrm>
+                          <a:off x="0" y="0"/>
+                          <a:ext cx="2847975" cy="635"/>
+                        </a:xfrm>
+                        <a:prstGeom prst="rect">
+                          <a:avLst/>
+                        </a:prstGeom>
+                        <a:solidFill>
+                          <a:prstClr val="white"/>
+                        </a:solidFill>
+                        <a:ln>
+                          <a:noFill/>
+                        </a:ln>
+                      </wps:spPr>
+                      <wps:txbx>
+                        <w:txbxContent>
+                          <w:p>
+                            <w:pPr>
+                              <w:pStyle w:val="Caption"/>
+                              <w:rPr>
+                                <w:b/>
+                              </w:rPr>
+                            </w:pPr>
+                            <w:r>
+                              <w:t xml:space="preserve">Figure </w:t>
+                            </w:r>
+                            <w:r>
+                              <w:fldChar w:fldCharType="begin"/>
+                            </w:r>
+                            <w:r>
+                              <w:instrText xml:space="preserve"> SEQ Figure \* ARABIC </w:instrText>
+                            </w:r>
+                            <w:r>
+                              <w:fldChar w:fldCharType="separate"/>
+                            </w:r>
+                            <w:r>
+                              <w:rPr>
+                                <w:noProof/>
+                              </w:rPr>
+                              <w:t>19</w:t>
+                            </w:r>
+                            <w:r>
+                              <w:fldChar w:fldCharType="end"/>
+                            </w:r>
+                            <w:r>
+                              <w:t>: Dice Roll Output</w:t>
+                            </w:r>
+                          </w:p>
+                        </w:txbxContent>
+                      </wps:txbx>
+                      <wps:bodyPr rot="0" spcFirstLastPara="0" vertOverflow="overflow" horzOverflow="overflow" vert="horz" wrap="square" lIns="0" tIns="0" rIns="0" bIns="0" numCol="1" spcCol="0" rtlCol="0" fromWordArt="0" anchor="t" anchorCtr="0" forceAA="0" compatLnSpc="1">
+                        <a:prstTxWarp prst="textNoShape">
+                          <a:avLst/>
+                        </a:prstTxWarp>
+                        <a:spAutoFit/>
+                      </wps:bodyPr>
+                    </wps:wsp>
+                  </a:graphicData>
+                </a:graphic>
+              </wp:anchor>
+            </w:drawing>
+          </mc:Choice>
+          <mc:Fallback>
+            <w:pict>
+              <v:shape w14:anchorId="1612BD2C" id="_x0000_s1045" type="#_x0000_t202" style="position:absolute;margin-left:0;margin-top:233.85pt;width:224.25pt;height:.05pt;z-index:251711488;visibility:visible;mso-wrap-style:square;mso-wrap-distance-left:9pt;mso-wrap-distance-top:0;mso-wrap-distance-right:9pt;mso-wrap-distance-bottom:0;mso-position-horizontal:center;mso-position-horizontal-relative:margin;mso-position-vertical:absolute;mso-position-vertical-relative:text;v-text-anchor:top" o:gfxdata="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" stroked="f">
+                <v:textbox style="mso-fit-shape-to-text:t" inset="0,0,0,0">
+                  <w:txbxContent>
+                    <w:p>
+                      <w:pPr>
+                        <w:pStyle w:val="Caption"/>
+                        <w:rPr>
+                          <w:b/>
+                        </w:rPr>
+                      </w:pPr>
+                      <w:r>
+                        <w:t xml:space="preserve">Figure </w:t>
+                      </w:r>
+                      <w:r>
+                        <w:fldChar w:fldCharType="begin"/>
+                      </w:r>
+                      <w:r>
+                        <w:instrText xml:space="preserve"> SEQ Figure \* ARABIC </w:instrText>
+                      </w:r>
+                      <w:r>
+                        <w:fldChar w:fldCharType="separate"/>
+                      </w:r>
+                      <w:r>
+                        <w:rPr>
+                          <w:noProof/>
+                        </w:rPr>
+                        <w:t>19</w:t>
+                      </w:r>
+                      <w:r>
+                        <w:fldChar w:fldCharType="end"/>
+                      </w:r>
+                      <w:r>
+                        <w:t>: Dice Roll Output</w:t>
+                      </w:r>
+                    </w:p>
+                  </w:txbxContent>
+                </v:textbox>
+                <w10:wrap type="topAndBottom" anchorx="margin"/>
+              </v:shape>
+            </w:pict>
+          </mc:Fallback>
+        </mc:AlternateContent>
+      </w:r>
+      <w:r>
+        <w:drawing>
+          <wp:anchor distT="0" distB="0" distL="114300" distR="114300" simplePos="0" relativeHeight="251709440" behindDoc="0" locked="0" layoutInCell="1" allowOverlap="1" wp14:anchorId="1120B080" wp14:editId="24EDD397">
+            <wp:simplePos x="0" y="0"/>
+            <wp:positionH relativeFrom="margin">
+              <wp:posOffset>1339215</wp:posOffset>
+            </wp:positionH>
+            <wp:positionV relativeFrom="paragraph">
+              <wp:posOffset>350520</wp:posOffset>
+            </wp:positionV>
+            <wp:extent cx="2847975" cy="2619375"/>
+            <wp:effectExtent l="0" t="0" r="9525" b="9525"/>
+            <wp:wrapTopAndBottom/>
+            <wp:docPr id="1305815742" name="Picture 1"/>
+            <wp:cNvGraphicFramePr>
+              <a:graphicFrameLocks xmlns:a="http://schemas.openxmlformats.org/drawingml/2006/main" noChangeAspect="1"/>
+            </wp:cNvGraphicFramePr>
+            <a:graphic xmlns:a="http://schemas.openxmlformats.org/drawingml/2006/main">
+              <a:graphicData uri="http://schemas.openxmlformats.org/drawingml/2006/picture">
+                <pic:pic xmlns:pic="http://schemas.openxmlformats.org/drawingml/2006/picture">
+                  <pic:nvPicPr>
+                    <pic:cNvPr id="1305815742" name=""/>
+                    <pic:cNvPicPr/>
+                  </pic:nvPicPr>
+                  <pic:blipFill>
+                    <a:blip r:embed="rId26">
+                      <a:extLst>
+                        <a:ext uri="{28A0092B-C50C-407E-A947-70E740481C1C}">
+                          <a14:useLocalDpi xmlns:a14="http://schemas.microsoft.com/office/drawing/2010/main" val="0"/>
+                        </a:ext>
+                      </a:extLst>
+                    </a:blip>
+                    <a:stretch>
+                      <a:fillRect/>
+                    </a:stretch>
+                  </pic:blipFill>
+                  <pic:spPr>
+                    <a:xfrm>
+                      <a:off x="0" y="0"/>
+                      <a:ext cx="2847975" cy="2619375"/>
+                    </a:xfrm>
+                    <a:prstGeom prst="rect">
+                      <a:avLst/>
+                    </a:prstGeom>
+                  </pic:spPr>
+                </pic:pic>
+              </a:graphicData>
+            </a:graphic>
+          </wp:anchor>
+        </w:drawing>
+      </w:r>
       <w:r>
         <w:t>Tests</w:t>
       </w:r>
       <w:bookmarkEnd w:id="23"/>
     </w:p>
     <w:p/>
+    <w:p/>
+    <w:p>
+      <w:r>
+        <w:rPr>
+          <w:noProof/>
+        </w:rPr>
+        <mc:AlternateContent>
+          <mc:Choice Requires="wps">
+            <w:drawing>
+              <wp:anchor distT="0" distB="0" distL="114300" distR="114300" simplePos="0" relativeHeight="251713536" behindDoc="0" locked="0" layoutInCell="1" allowOverlap="1" wp14:anchorId="2508787D" wp14:editId="22BB8F67">
+                <wp:simplePos x="0" y="0"/>
+                <wp:positionH relativeFrom="column">
+                  <wp:posOffset>-1270</wp:posOffset>
+                </wp:positionH>
+                <wp:positionV relativeFrom="paragraph">
+                  <wp:posOffset>2150745</wp:posOffset>
+                </wp:positionV>
+                <wp:extent cx="5182870" cy="635"/>
+                <wp:effectExtent l="0" t="0" r="0" b="0"/>
+                <wp:wrapTopAndBottom/>
+                <wp:docPr id="1504949522" name="Text Box 1"/>
+                <wp:cNvGraphicFramePr/>
+                <a:graphic xmlns:a="http://schemas.openxmlformats.org/drawingml/2006/main">
+                  <a:graphicData uri="http://schemas.microsoft.com/office/word/2010/wordprocessingShape">
+                    <wps:wsp>
+                      <wps:cNvSpPr txBox="1"/>
+                      <wps:spPr>
+                        <a:xfrm>
+                          <a:off x="0" y="0"/>
+                          <a:ext cx="5182870" cy="635"/>
+                        </a:xfrm>
+                        <a:prstGeom prst="rect">
+                          <a:avLst/>
+                        </a:prstGeom>
+                        <a:solidFill>
+                          <a:prstClr val="white"/>
+                        </a:solidFill>
+                        <a:ln>
+                          <a:noFill/>
+                        </a:ln>
+                      </wps:spPr>
+                      <wps:txbx>
+                        <w:txbxContent>
+                          <w:p>
+                            <w:pPr>
+                              <w:pStyle w:val="Caption"/>
+                            </w:pPr>
+                            <w:r>
+                              <w:t xml:space="preserve">Figure </w:t>
+                            </w:r>
+                            <w:r>
+                              <w:fldChar w:fldCharType="begin"/>
+                            </w:r>
+                            <w:r>
+                              <w:instrText xml:space="preserve"> SEQ Figure \* ARABIC </w:instrText>
+                            </w:r>
+                            <w:r>
+                              <w:fldChar w:fldCharType="separate"/>
+                            </w:r>
+                            <w:r>
+                              <w:rPr>
+                                <w:noProof/>
+                              </w:rPr>
+                              <w:t>20</w:t>
+                            </w:r>
+                            <w:r>
+                              <w:fldChar w:fldCharType="end"/>
+                            </w:r>
+                            <w:r>
+                              <w:t>: Dice Roll Unit Tests</w:t>
+                            </w:r>
+                          </w:p>
+                        </w:txbxContent>
+                      </wps:txbx>
+                      <wps:bodyPr rot="0" spcFirstLastPara="0" vertOverflow="overflow" horzOverflow="overflow" vert="horz" wrap="square" lIns="0" tIns="0" rIns="0" bIns="0" numCol="1" spcCol="0" rtlCol="0" fromWordArt="0" anchor="t" anchorCtr="0" forceAA="0" compatLnSpc="1">
+                        <a:prstTxWarp prst="textNoShape">
+                          <a:avLst/>
+                        </a:prstTxWarp>
+                        <a:spAutoFit/>
+                      </wps:bodyPr>
+                    </wps:wsp>
+                  </a:graphicData>
+                </a:graphic>
+              </wp:anchor>
+            </w:drawing>
+          </mc:Choice>
+          <mc:Fallback>
+            <w:pict>
+              <v:shape w14:anchorId="2508787D" id="_x0000_s1046" type="#_x0000_t202" style="position:absolute;left:0;text-align:left;margin-left:-.1pt;margin-top:169.35pt;width:408.1pt;height:.05pt;z-index:251713536;visibility:visible;mso-wrap-style:square;mso-wrap-distance-left:9pt;mso-wrap-distance-top:0;mso-wrap-distance-right:9pt;mso-wrap-distance-bottom:0;mso-position-horizontal:absolute;mso-position-horizontal-relative:text;mso-position-vertical:absolute;mso-position-vertical-relative:text;v-text-anchor:top" o:gfxdata="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" stroked="f">
+                <v:textbox style="mso-fit-shape-to-text:t" inset="0,0,0,0">
+                  <w:txbxContent>
+                    <w:p>
+                      <w:pPr>
+                        <w:pStyle w:val="Caption"/>
+                      </w:pPr>
+                      <w:r>
+                        <w:t xml:space="preserve">Figure </w:t>
+                      </w:r>
+                      <w:r>
+                        <w:fldChar w:fldCharType="begin"/>
+                      </w:r>
+                      <w:r>
+                        <w:instrText xml:space="preserve"> SEQ Figure \* ARABIC </w:instrText>
+                      </w:r>
+                      <w:r>
+                        <w:fldChar w:fldCharType="separate"/>
+                      </w:r>
+                      <w:r>
+                        <w:rPr>
+                          <w:noProof/>
+                        </w:rPr>
+                        <w:t>20</w:t>
+                      </w:r>
+                      <w:r>
+                        <w:fldChar w:fldCharType="end"/>
+                      </w:r>
+                      <w:r>
+                        <w:t>: Dice Roll Unit Tests</w:t>
+                      </w:r>
+                    </w:p>
+                  </w:txbxContent>
+                </v:textbox>
+                <w10:wrap type="topAndBottom"/>
+              </v:shape>
+            </w:pict>
+          </mc:Fallback>
+        </mc:AlternateContent>
+      </w:r>
+      <w:r>
+        <w:drawing>
+          <wp:anchor distT="0" distB="0" distL="114300" distR="114300" simplePos="0" relativeHeight="251708416" behindDoc="0" locked="0" layoutInCell="1" allowOverlap="1" wp14:anchorId="5D0E7002" wp14:editId="184824E1">
+            <wp:simplePos x="0" y="0"/>
+            <wp:positionH relativeFrom="margin">
+              <wp:posOffset>-1270</wp:posOffset>
+            </wp:positionH>
+            <wp:positionV relativeFrom="paragraph">
+              <wp:posOffset>133417</wp:posOffset>
+            </wp:positionV>
+            <wp:extent cx="5182870" cy="1960245"/>
+            <wp:effectExtent l="0" t="0" r="0" b="1905"/>
+            <wp:wrapTopAndBottom/>
+            <wp:docPr id="1445435098" name="Picture 1"/>
+            <wp:cNvGraphicFramePr>
+              <a:graphicFrameLocks xmlns:a="http://schemas.openxmlformats.org/drawingml/2006/main" noChangeAspect="1"/>
+            </wp:cNvGraphicFramePr>
+            <a:graphic xmlns:a="http://schemas.openxmlformats.org/drawingml/2006/main">
+              <a:graphicData uri="http://schemas.openxmlformats.org/drawingml/2006/picture">
+                <pic:pic xmlns:pic="http://schemas.openxmlformats.org/drawingml/2006/picture">
+                  <pic:nvPicPr>
+                    <pic:cNvPr id="1445435098" name=""/>
+                    <pic:cNvPicPr/>
+                  </pic:nvPicPr>
+                  <pic:blipFill>
+                    <a:blip r:embed="rId27">
+                      <a:extLst>
+                        <a:ext uri="{28A0092B-C50C-407E-A947-70E740481C1C}">
+                          <a14:useLocalDpi xmlns:a14="http://schemas.microsoft.com/office/drawing/2010/main" val="0"/>
+                        </a:ext>
+                      </a:extLst>
+                    </a:blip>
+                    <a:stretch>
+                      <a:fillRect/>
+                    </a:stretch>
+                  </pic:blipFill>
+                  <pic:spPr>
+                    <a:xfrm>
+                      <a:off x="0" y="0"/>
+                      <a:ext cx="5182870" cy="1960245"/>
+                    </a:xfrm>
+                    <a:prstGeom prst="rect">
+                      <a:avLst/>
+                    </a:prstGeom>
+                  </pic:spPr>
+                </pic:pic>
+              </a:graphicData>
+            </a:graphic>
+          </wp:anchor>
+        </w:drawing>
+      </w:r>
+    </w:p>
+    <w:p/>
     <w:sectPr>
-      <w:headerReference w:type="default" r:id="rId24"/>
-      <w:footerReference w:type="default" r:id="rId25"/>
-      <w:headerReference w:type="first" r:id="rId26"/>
+      <w:headerReference w:type="default" r:id="rId28"/>
+      <w:footerReference w:type="default" r:id="rId29"/>
+      <w:headerReference w:type="first" r:id="rId30"/>
       <w:pgSz w:w="11906" w:h="16838"/>
       <w:pgMar w:top="1872" w:right="1872" w:bottom="1872" w:left="1872" w:header="706" w:footer="706" w:gutter="0"/>
       <w:pgNumType w:start="0"/>

</xml_diff>

<commit_message>
Add MC_UE02_BUNEA PDF and update related files
Added MC_UE02_BUNEA.pdf to the Aufgaben and attachments directories. Updated the protocol document and the markdown file to reference the new PDF.
</commit_message>
<xml_diff>
--- a/Modules/Semester_1/Modern Code/Aufgaben/02_Java_Variables_Types_Expression_Control_Structures/Protocol.docx
+++ b/Modules/Semester_1/Modern Code/Aufgaben/02_Java_Variables_Types_Expression_Control_Structures/Protocol.docx
@@ -264,25 +264,21 @@
                                 <w:r>
                                   <w:tab/>
                                 </w:r>
-                                <w:proofErr w:type="spellStart"/>
-                                <w:proofErr w:type="gramStart"/>
                                 <w:r>
-                                  <w:t>xx</w:t>
+                                  <w:t>01</w:t>
                                 </w:r>
                                 <w:r>
                                   <w:t>:</w:t>
                                 </w:r>
                                 <w:r>
-                                  <w:t>xx</w:t>
+                                  <w:t>23</w:t>
                                 </w:r>
-                                <w:proofErr w:type="gramEnd"/>
                                 <w:r>
                                   <w:t>:</w:t>
                                 </w:r>
                                 <w:r>
-                                  <w:t>xx</w:t>
+                                  <w:t>55</w:t>
                                 </w:r>
-                                <w:proofErr w:type="spellEnd"/>
                               </w:p>
                             </w:txbxContent>
                           </wps:txbx>
@@ -378,25 +374,21 @@
                           <w:r>
                             <w:tab/>
                           </w:r>
-                          <w:proofErr w:type="spellStart"/>
-                          <w:proofErr w:type="gramStart"/>
                           <w:r>
-                            <w:t>xx</w:t>
+                            <w:t>01</w:t>
                           </w:r>
                           <w:r>
                             <w:t>:</w:t>
                           </w:r>
                           <w:r>
-                            <w:t>xx</w:t>
+                            <w:t>23</w:t>
                           </w:r>
-                          <w:proofErr w:type="gramEnd"/>
                           <w:r>
                             <w:t>:</w:t>
                           </w:r>
                           <w:r>
-                            <w:t>xx</w:t>
+                            <w:t>55</w:t>
                           </w:r>
-                          <w:proofErr w:type="spellEnd"/>
                         </w:p>
                       </w:txbxContent>
                     </v:textbox>
@@ -464,7 +456,7 @@
           <w:r>
             <w:fldChar w:fldCharType="separate"/>
           </w:r>
-          <w:hyperlink w:anchor="_Toc212464874" w:history="1">
+          <w:hyperlink w:anchor="_Toc212471461" w:history="1">
             <w:r>
               <w:rPr>
                 <w:rStyle w:val="Hyperlink"/>
@@ -491,7 +483,7 @@
                 <w:noProof/>
                 <w:webHidden/>
               </w:rPr>
-              <w:instrText xml:space="preserve"> PAGEREF _Toc212464874 \h </w:instrText>
+              <w:instrText xml:space="preserve"> PAGEREF _Toc212471461 \h </w:instrText>
             </w:r>
             <w:r>
               <w:rPr>
@@ -534,7 +526,7 @@
               <w:lang w:val="en-AT" w:eastAsia="en-AT"/>
             </w:rPr>
           </w:pPr>
-          <w:hyperlink w:anchor="_Toc212464875" w:history="1">
+          <w:hyperlink w:anchor="_Toc212471462" w:history="1">
             <w:r>
               <w:rPr>
                 <w:rStyle w:val="Hyperlink"/>
@@ -561,7 +553,7 @@
                 <w:noProof/>
                 <w:webHidden/>
               </w:rPr>
-              <w:instrText xml:space="preserve"> PAGEREF _Toc212464875 \h </w:instrText>
+              <w:instrText xml:space="preserve"> PAGEREF _Toc212471462 \h </w:instrText>
             </w:r>
             <w:r>
               <w:rPr>
@@ -604,7 +596,7 @@
               <w:lang w:val="en-AT" w:eastAsia="en-AT"/>
             </w:rPr>
           </w:pPr>
-          <w:hyperlink w:anchor="_Toc212464876" w:history="1">
+          <w:hyperlink w:anchor="_Toc212471463" w:history="1">
             <w:r>
               <w:rPr>
                 <w:rStyle w:val="Hyperlink"/>
@@ -631,7 +623,7 @@
                 <w:noProof/>
                 <w:webHidden/>
               </w:rPr>
-              <w:instrText xml:space="preserve"> PAGEREF _Toc212464876 \h </w:instrText>
+              <w:instrText xml:space="preserve"> PAGEREF _Toc212471463 \h </w:instrText>
             </w:r>
             <w:r>
               <w:rPr>
@@ -674,7 +666,7 @@
               <w:lang w:val="en-AT" w:eastAsia="en-AT"/>
             </w:rPr>
           </w:pPr>
-          <w:hyperlink w:anchor="_Toc212464877" w:history="1">
+          <w:hyperlink w:anchor="_Toc212471464" w:history="1">
             <w:r>
               <w:rPr>
                 <w:rStyle w:val="Hyperlink"/>
@@ -701,7 +693,7 @@
                 <w:noProof/>
                 <w:webHidden/>
               </w:rPr>
-              <w:instrText xml:space="preserve"> PAGEREF _Toc212464877 \h </w:instrText>
+              <w:instrText xml:space="preserve"> PAGEREF _Toc212471464 \h </w:instrText>
             </w:r>
             <w:r>
               <w:rPr>
@@ -721,7 +713,7 @@
                 <w:noProof/>
                 <w:webHidden/>
               </w:rPr>
-              <w:t>2</w:t>
+              <w:t>3</w:t>
             </w:r>
             <w:r>
               <w:rPr>
@@ -744,7 +736,7 @@
               <w:lang w:val="en-AT" w:eastAsia="en-AT"/>
             </w:rPr>
           </w:pPr>
-          <w:hyperlink w:anchor="_Toc212464878" w:history="1">
+          <w:hyperlink w:anchor="_Toc212471465" w:history="1">
             <w:r>
               <w:rPr>
                 <w:rStyle w:val="Hyperlink"/>
@@ -771,7 +763,7 @@
                 <w:noProof/>
                 <w:webHidden/>
               </w:rPr>
-              <w:instrText xml:space="preserve"> PAGEREF _Toc212464878 \h </w:instrText>
+              <w:instrText xml:space="preserve"> PAGEREF _Toc212471465 \h </w:instrText>
             </w:r>
             <w:r>
               <w:rPr>
@@ -791,7 +783,7 @@
                 <w:noProof/>
                 <w:webHidden/>
               </w:rPr>
-              <w:t>3</w:t>
+              <w:t>4</w:t>
             </w:r>
             <w:r>
               <w:rPr>
@@ -814,7 +806,7 @@
               <w:lang w:val="en-AT" w:eastAsia="en-AT"/>
             </w:rPr>
           </w:pPr>
-          <w:hyperlink w:anchor="_Toc212464879" w:history="1">
+          <w:hyperlink w:anchor="_Toc212471466" w:history="1">
             <w:r>
               <w:rPr>
                 <w:rStyle w:val="Hyperlink"/>
@@ -841,7 +833,7 @@
                 <w:noProof/>
                 <w:webHidden/>
               </w:rPr>
-              <w:instrText xml:space="preserve"> PAGEREF _Toc212464879 \h </w:instrText>
+              <w:instrText xml:space="preserve"> PAGEREF _Toc212471466 \h </w:instrText>
             </w:r>
             <w:r>
               <w:rPr>
@@ -861,7 +853,7 @@
                 <w:noProof/>
                 <w:webHidden/>
               </w:rPr>
-              <w:t>3</w:t>
+              <w:t>4</w:t>
             </w:r>
             <w:r>
               <w:rPr>
@@ -884,7 +876,7 @@
               <w:lang w:val="en-AT" w:eastAsia="en-AT"/>
             </w:rPr>
           </w:pPr>
-          <w:hyperlink w:anchor="_Toc212464880" w:history="1">
+          <w:hyperlink w:anchor="_Toc212471467" w:history="1">
             <w:r>
               <w:rPr>
                 <w:rStyle w:val="Hyperlink"/>
@@ -911,7 +903,7 @@
                 <w:noProof/>
                 <w:webHidden/>
               </w:rPr>
-              <w:instrText xml:space="preserve"> PAGEREF _Toc212464880 \h </w:instrText>
+              <w:instrText xml:space="preserve"> PAGEREF _Toc212471467 \h </w:instrText>
             </w:r>
             <w:r>
               <w:rPr>
@@ -931,7 +923,7 @@
                 <w:noProof/>
                 <w:webHidden/>
               </w:rPr>
-              <w:t>3</w:t>
+              <w:t>4</w:t>
             </w:r>
             <w:r>
               <w:rPr>
@@ -954,7 +946,7 @@
               <w:lang w:val="en-AT" w:eastAsia="en-AT"/>
             </w:rPr>
           </w:pPr>
-          <w:hyperlink w:anchor="_Toc212464881" w:history="1">
+          <w:hyperlink w:anchor="_Toc212471468" w:history="1">
             <w:r>
               <w:rPr>
                 <w:rStyle w:val="Hyperlink"/>
@@ -981,7 +973,7 @@
                 <w:noProof/>
                 <w:webHidden/>
               </w:rPr>
-              <w:instrText xml:space="preserve"> PAGEREF _Toc212464881 \h </w:instrText>
+              <w:instrText xml:space="preserve"> PAGEREF _Toc212471468 \h </w:instrText>
             </w:r>
             <w:r>
               <w:rPr>
@@ -1001,7 +993,7 @@
                 <w:noProof/>
                 <w:webHidden/>
               </w:rPr>
-              <w:t>3</w:t>
+              <w:t>5</w:t>
             </w:r>
             <w:r>
               <w:rPr>
@@ -1024,7 +1016,7 @@
               <w:lang w:val="en-AT" w:eastAsia="en-AT"/>
             </w:rPr>
           </w:pPr>
-          <w:hyperlink w:anchor="_Toc212464882" w:history="1">
+          <w:hyperlink w:anchor="_Toc212471469" w:history="1">
             <w:r>
               <w:rPr>
                 <w:rStyle w:val="Hyperlink"/>
@@ -1051,7 +1043,7 @@
                 <w:noProof/>
                 <w:webHidden/>
               </w:rPr>
-              <w:instrText xml:space="preserve"> PAGEREF _Toc212464882 \h </w:instrText>
+              <w:instrText xml:space="preserve"> PAGEREF _Toc212471469 \h </w:instrText>
             </w:r>
             <w:r>
               <w:rPr>
@@ -1071,7 +1063,7 @@
                 <w:noProof/>
                 <w:webHidden/>
               </w:rPr>
-              <w:t>4</w:t>
+              <w:t>7</w:t>
             </w:r>
             <w:r>
               <w:rPr>
@@ -1094,7 +1086,7 @@
               <w:lang w:val="en-AT" w:eastAsia="en-AT"/>
             </w:rPr>
           </w:pPr>
-          <w:hyperlink w:anchor="_Toc212464883" w:history="1">
+          <w:hyperlink w:anchor="_Toc212471470" w:history="1">
             <w:r>
               <w:rPr>
                 <w:rStyle w:val="Hyperlink"/>
@@ -1121,7 +1113,7 @@
                 <w:noProof/>
                 <w:webHidden/>
               </w:rPr>
-              <w:instrText xml:space="preserve"> PAGEREF _Toc212464883 \h </w:instrText>
+              <w:instrText xml:space="preserve"> PAGEREF _Toc212471470 \h </w:instrText>
             </w:r>
             <w:r>
               <w:rPr>
@@ -1141,7 +1133,7 @@
                 <w:noProof/>
                 <w:webHidden/>
               </w:rPr>
-              <w:t>4</w:t>
+              <w:t>7</w:t>
             </w:r>
             <w:r>
               <w:rPr>
@@ -1164,7 +1156,7 @@
               <w:lang w:val="en-AT" w:eastAsia="en-AT"/>
             </w:rPr>
           </w:pPr>
-          <w:hyperlink w:anchor="_Toc212464884" w:history="1">
+          <w:hyperlink w:anchor="_Toc212471471" w:history="1">
             <w:r>
               <w:rPr>
                 <w:rStyle w:val="Hyperlink"/>
@@ -1191,7 +1183,7 @@
                 <w:noProof/>
                 <w:webHidden/>
               </w:rPr>
-              <w:instrText xml:space="preserve"> PAGEREF _Toc212464884 \h </w:instrText>
+              <w:instrText xml:space="preserve"> PAGEREF _Toc212471471 \h </w:instrText>
             </w:r>
             <w:r>
               <w:rPr>
@@ -1211,7 +1203,7 @@
                 <w:noProof/>
                 <w:webHidden/>
               </w:rPr>
-              <w:t>4</w:t>
+              <w:t>7</w:t>
             </w:r>
             <w:r>
               <w:rPr>
@@ -1234,7 +1226,7 @@
               <w:lang w:val="en-AT" w:eastAsia="en-AT"/>
             </w:rPr>
           </w:pPr>
-          <w:hyperlink w:anchor="_Toc212464885" w:history="1">
+          <w:hyperlink w:anchor="_Toc212471472" w:history="1">
             <w:r>
               <w:rPr>
                 <w:rStyle w:val="Hyperlink"/>
@@ -1261,7 +1253,7 @@
                 <w:noProof/>
                 <w:webHidden/>
               </w:rPr>
-              <w:instrText xml:space="preserve"> PAGEREF _Toc212464885 \h </w:instrText>
+              <w:instrText xml:space="preserve"> PAGEREF _Toc212471472 \h </w:instrText>
             </w:r>
             <w:r>
               <w:rPr>
@@ -1281,7 +1273,7 @@
                 <w:noProof/>
                 <w:webHidden/>
               </w:rPr>
-              <w:t>4</w:t>
+              <w:t>9</w:t>
             </w:r>
             <w:r>
               <w:rPr>
@@ -1304,7 +1296,7 @@
               <w:lang w:val="en-AT" w:eastAsia="en-AT"/>
             </w:rPr>
           </w:pPr>
-          <w:hyperlink w:anchor="_Toc212464886" w:history="1">
+          <w:hyperlink w:anchor="_Toc212471473" w:history="1">
             <w:r>
               <w:rPr>
                 <w:rStyle w:val="Hyperlink"/>
@@ -1331,7 +1323,7 @@
                 <w:noProof/>
                 <w:webHidden/>
               </w:rPr>
-              <w:instrText xml:space="preserve"> PAGEREF _Toc212464886 \h </w:instrText>
+              <w:instrText xml:space="preserve"> PAGEREF _Toc212471473 \h </w:instrText>
             </w:r>
             <w:r>
               <w:rPr>
@@ -1351,7 +1343,7 @@
                 <w:noProof/>
                 <w:webHidden/>
               </w:rPr>
-              <w:t>5</w:t>
+              <w:t>10</w:t>
             </w:r>
             <w:r>
               <w:rPr>
@@ -1374,7 +1366,7 @@
               <w:lang w:val="en-AT" w:eastAsia="en-AT"/>
             </w:rPr>
           </w:pPr>
-          <w:hyperlink w:anchor="_Toc212464887" w:history="1">
+          <w:hyperlink w:anchor="_Toc212471474" w:history="1">
             <w:r>
               <w:rPr>
                 <w:rStyle w:val="Hyperlink"/>
@@ -1401,7 +1393,7 @@
                 <w:noProof/>
                 <w:webHidden/>
               </w:rPr>
-              <w:instrText xml:space="preserve"> PAGEREF _Toc212464887 \h </w:instrText>
+              <w:instrText xml:space="preserve"> PAGEREF _Toc212471474 \h </w:instrText>
             </w:r>
             <w:r>
               <w:rPr>
@@ -1421,7 +1413,7 @@
                 <w:noProof/>
                 <w:webHidden/>
               </w:rPr>
-              <w:t>5</w:t>
+              <w:t>10</w:t>
             </w:r>
             <w:r>
               <w:rPr>
@@ -1444,7 +1436,7 @@
               <w:lang w:val="en-AT" w:eastAsia="en-AT"/>
             </w:rPr>
           </w:pPr>
-          <w:hyperlink w:anchor="_Toc212464888" w:history="1">
+          <w:hyperlink w:anchor="_Toc212471475" w:history="1">
             <w:r>
               <w:rPr>
                 <w:rStyle w:val="Hyperlink"/>
@@ -1471,7 +1463,7 @@
                 <w:noProof/>
                 <w:webHidden/>
               </w:rPr>
-              <w:instrText xml:space="preserve"> PAGEREF _Toc212464888 \h </w:instrText>
+              <w:instrText xml:space="preserve"> PAGEREF _Toc212471475 \h </w:instrText>
             </w:r>
             <w:r>
               <w:rPr>
@@ -1491,7 +1483,7 @@
                 <w:noProof/>
                 <w:webHidden/>
               </w:rPr>
-              <w:t>5</w:t>
+              <w:t>10</w:t>
             </w:r>
             <w:r>
               <w:rPr>
@@ -1514,7 +1506,7 @@
               <w:lang w:val="en-AT" w:eastAsia="en-AT"/>
             </w:rPr>
           </w:pPr>
-          <w:hyperlink w:anchor="_Toc212464889" w:history="1">
+          <w:hyperlink w:anchor="_Toc212471476" w:history="1">
             <w:r>
               <w:rPr>
                 <w:rStyle w:val="Hyperlink"/>
@@ -1541,7 +1533,7 @@
                 <w:noProof/>
                 <w:webHidden/>
               </w:rPr>
-              <w:instrText xml:space="preserve"> PAGEREF _Toc212464889 \h </w:instrText>
+              <w:instrText xml:space="preserve"> PAGEREF _Toc212471476 \h </w:instrText>
             </w:r>
             <w:r>
               <w:rPr>
@@ -1561,7 +1553,7 @@
                 <w:noProof/>
                 <w:webHidden/>
               </w:rPr>
-              <w:t>5</w:t>
+              <w:t>11</w:t>
             </w:r>
             <w:r>
               <w:rPr>
@@ -1584,7 +1576,7 @@
               <w:lang w:val="en-AT" w:eastAsia="en-AT"/>
             </w:rPr>
           </w:pPr>
-          <w:hyperlink w:anchor="_Toc212464890" w:history="1">
+          <w:hyperlink w:anchor="_Toc212471477" w:history="1">
             <w:r>
               <w:rPr>
                 <w:rStyle w:val="Hyperlink"/>
@@ -1611,7 +1603,7 @@
                 <w:noProof/>
                 <w:webHidden/>
               </w:rPr>
-              <w:instrText xml:space="preserve"> PAGEREF _Toc212464890 \h </w:instrText>
+              <w:instrText xml:space="preserve"> PAGEREF _Toc212471477 \h </w:instrText>
             </w:r>
             <w:r>
               <w:rPr>
@@ -1631,7 +1623,7 @@
                 <w:noProof/>
                 <w:webHidden/>
               </w:rPr>
-              <w:t>6</w:t>
+              <w:t>12</w:t>
             </w:r>
             <w:r>
               <w:rPr>
@@ -1654,7 +1646,7 @@
               <w:lang w:val="en-AT" w:eastAsia="en-AT"/>
             </w:rPr>
           </w:pPr>
-          <w:hyperlink w:anchor="_Toc212464891" w:history="1">
+          <w:hyperlink w:anchor="_Toc212471478" w:history="1">
             <w:r>
               <w:rPr>
                 <w:rStyle w:val="Hyperlink"/>
@@ -1681,7 +1673,7 @@
                 <w:noProof/>
                 <w:webHidden/>
               </w:rPr>
-              <w:instrText xml:space="preserve"> PAGEREF _Toc212464891 \h </w:instrText>
+              <w:instrText xml:space="preserve"> PAGEREF _Toc212471478 \h </w:instrText>
             </w:r>
             <w:r>
               <w:rPr>
@@ -1701,7 +1693,7 @@
                 <w:noProof/>
                 <w:webHidden/>
               </w:rPr>
-              <w:t>6</w:t>
+              <w:t>12</w:t>
             </w:r>
             <w:r>
               <w:rPr>
@@ -1724,7 +1716,7 @@
               <w:lang w:val="en-AT" w:eastAsia="en-AT"/>
             </w:rPr>
           </w:pPr>
-          <w:hyperlink w:anchor="_Toc212464892" w:history="1">
+          <w:hyperlink w:anchor="_Toc212471479" w:history="1">
             <w:r>
               <w:rPr>
                 <w:rStyle w:val="Hyperlink"/>
@@ -1751,7 +1743,7 @@
                 <w:noProof/>
                 <w:webHidden/>
               </w:rPr>
-              <w:instrText xml:space="preserve"> PAGEREF _Toc212464892 \h </w:instrText>
+              <w:instrText xml:space="preserve"> PAGEREF _Toc212471479 \h </w:instrText>
             </w:r>
             <w:r>
               <w:rPr>
@@ -1771,7 +1763,7 @@
                 <w:noProof/>
                 <w:webHidden/>
               </w:rPr>
-              <w:t>6</w:t>
+              <w:t>12</w:t>
             </w:r>
             <w:r>
               <w:rPr>
@@ -1794,7 +1786,7 @@
               <w:lang w:val="en-AT" w:eastAsia="en-AT"/>
             </w:rPr>
           </w:pPr>
-          <w:hyperlink w:anchor="_Toc212464893" w:history="1">
+          <w:hyperlink w:anchor="_Toc212471480" w:history="1">
             <w:r>
               <w:rPr>
                 <w:rStyle w:val="Hyperlink"/>
@@ -1821,7 +1813,7 @@
                 <w:noProof/>
                 <w:webHidden/>
               </w:rPr>
-              <w:instrText xml:space="preserve"> PAGEREF _Toc212464893 \h </w:instrText>
+              <w:instrText xml:space="preserve"> PAGEREF _Toc212471480 \h </w:instrText>
             </w:r>
             <w:r>
               <w:rPr>
@@ -1841,7 +1833,7 @@
                 <w:noProof/>
                 <w:webHidden/>
               </w:rPr>
-              <w:t>6</w:t>
+              <w:t>13</w:t>
             </w:r>
             <w:r>
               <w:rPr>
@@ -1864,7 +1856,7 @@
               <w:lang w:val="en-AT" w:eastAsia="en-AT"/>
             </w:rPr>
           </w:pPr>
-          <w:hyperlink w:anchor="_Toc212464894" w:history="1">
+          <w:hyperlink w:anchor="_Toc212471481" w:history="1">
             <w:r>
               <w:rPr>
                 <w:rStyle w:val="Hyperlink"/>
@@ -1891,7 +1883,7 @@
                 <w:noProof/>
                 <w:webHidden/>
               </w:rPr>
-              <w:instrText xml:space="preserve"> PAGEREF _Toc212464894 \h </w:instrText>
+              <w:instrText xml:space="preserve"> PAGEREF _Toc212471481 \h </w:instrText>
             </w:r>
             <w:r>
               <w:rPr>
@@ -1911,7 +1903,7 @@
                 <w:noProof/>
                 <w:webHidden/>
               </w:rPr>
-              <w:t>7</w:t>
+              <w:t>14</w:t>
             </w:r>
             <w:r>
               <w:rPr>
@@ -1934,7 +1926,7 @@
               <w:lang w:val="en-AT" w:eastAsia="en-AT"/>
             </w:rPr>
           </w:pPr>
-          <w:hyperlink w:anchor="_Toc212464895" w:history="1">
+          <w:hyperlink w:anchor="_Toc212471482" w:history="1">
             <w:r>
               <w:rPr>
                 <w:rStyle w:val="Hyperlink"/>
@@ -1961,7 +1953,7 @@
                 <w:noProof/>
                 <w:webHidden/>
               </w:rPr>
-              <w:instrText xml:space="preserve"> PAGEREF _Toc212464895 \h </w:instrText>
+              <w:instrText xml:space="preserve"> PAGEREF _Toc212471482 \h </w:instrText>
             </w:r>
             <w:r>
               <w:rPr>
@@ -1981,7 +1973,7 @@
                 <w:noProof/>
                 <w:webHidden/>
               </w:rPr>
-              <w:t>7</w:t>
+              <w:t>14</w:t>
             </w:r>
             <w:r>
               <w:rPr>
@@ -2004,7 +1996,7 @@
               <w:lang w:val="en-AT" w:eastAsia="en-AT"/>
             </w:rPr>
           </w:pPr>
-          <w:hyperlink w:anchor="_Toc212464896" w:history="1">
+          <w:hyperlink w:anchor="_Toc212471483" w:history="1">
             <w:r>
               <w:rPr>
                 <w:rStyle w:val="Hyperlink"/>
@@ -2031,7 +2023,7 @@
                 <w:noProof/>
                 <w:webHidden/>
               </w:rPr>
-              <w:instrText xml:space="preserve"> PAGEREF _Toc212464896 \h </w:instrText>
+              <w:instrText xml:space="preserve"> PAGEREF _Toc212471483 \h </w:instrText>
             </w:r>
             <w:r>
               <w:rPr>
@@ -2051,7 +2043,7 @@
                 <w:noProof/>
                 <w:webHidden/>
               </w:rPr>
-              <w:t>7</w:t>
+              <w:t>14</w:t>
             </w:r>
             <w:r>
               <w:rPr>
@@ -2074,7 +2066,7 @@
               <w:lang w:val="en-AT" w:eastAsia="en-AT"/>
             </w:rPr>
           </w:pPr>
-          <w:hyperlink w:anchor="_Toc212464897" w:history="1">
+          <w:hyperlink w:anchor="_Toc212471484" w:history="1">
             <w:r>
               <w:rPr>
                 <w:rStyle w:val="Hyperlink"/>
@@ -2101,7 +2093,7 @@
                 <w:noProof/>
                 <w:webHidden/>
               </w:rPr>
-              <w:instrText xml:space="preserve"> PAGEREF _Toc212464897 \h </w:instrText>
+              <w:instrText xml:space="preserve"> PAGEREF _Toc212471484 \h </w:instrText>
             </w:r>
             <w:r>
               <w:rPr>
@@ -2121,7 +2113,7 @@
                 <w:noProof/>
                 <w:webHidden/>
               </w:rPr>
-              <w:t>7</w:t>
+              <w:t>16</w:t>
             </w:r>
             <w:r>
               <w:rPr>
@@ -2155,7 +2147,7 @@
       <w:pPr>
         <w:pStyle w:val="Heading1"/>
       </w:pPr>
-      <w:bookmarkStart w:id="0" w:name="_Toc212464874"/>
+      <w:bookmarkStart w:id="0" w:name="_Toc212471461"/>
       <w:r>
         <w:lastRenderedPageBreak/>
         <w:t>Exercise 1</w:t>
@@ -2172,7 +2164,7 @@
       <w:pPr>
         <w:pStyle w:val="Heading2"/>
       </w:pPr>
-      <w:bookmarkStart w:id="1" w:name="_Toc212464875"/>
+      <w:bookmarkStart w:id="1" w:name="_Toc212471462"/>
       <w:r>
         <w:t>Solution Idea</w:t>
       </w:r>
@@ -2187,7 +2179,7 @@
       <w:pPr>
         <w:pStyle w:val="Heading2"/>
       </w:pPr>
-      <w:bookmarkStart w:id="2" w:name="_Toc212464876"/>
+      <w:bookmarkStart w:id="2" w:name="_Toc212471463"/>
       <w:r>
         <w:t>Code</w:t>
       </w:r>
@@ -2331,6 +2323,9 @@
         </mc:AlternateContent>
       </w:r>
       <w:r>
+        <w:rPr>
+          <w:noProof/>
+        </w:rPr>
         <w:drawing>
           <wp:anchor distT="0" distB="0" distL="114300" distR="114300" simplePos="0" relativeHeight="251662336" behindDoc="0" locked="0" layoutInCell="1" allowOverlap="1" wp14:anchorId="7FC8AC6C" wp14:editId="36BDE926">
             <wp:simplePos x="0" y="0"/>
@@ -2387,7 +2382,7 @@
       <w:pPr>
         <w:pStyle w:val="Heading2"/>
       </w:pPr>
-      <w:bookmarkStart w:id="3" w:name="_Toc212464877"/>
+      <w:bookmarkStart w:id="3" w:name="_Toc212471464"/>
       <w:r>
         <w:lastRenderedPageBreak/>
         <w:t>Tests</w:t>
@@ -2522,6 +2517,9 @@
         </mc:AlternateContent>
       </w:r>
       <w:r>
+        <w:rPr>
+          <w:noProof/>
+        </w:rPr>
         <w:drawing>
           <wp:anchor distT="0" distB="0" distL="114300" distR="114300" simplePos="0" relativeHeight="251665408" behindDoc="0" locked="0" layoutInCell="1" allowOverlap="1" wp14:anchorId="76EB206C" wp14:editId="7370681B">
             <wp:simplePos x="0" y="0"/>
@@ -2701,6 +2699,9 @@
         </mc:AlternateContent>
       </w:r>
       <w:r>
+        <w:rPr>
+          <w:noProof/>
+        </w:rPr>
         <w:drawing>
           <wp:anchor distT="0" distB="0" distL="114300" distR="114300" simplePos="0" relativeHeight="251668480" behindDoc="0" locked="0" layoutInCell="1" allowOverlap="1" wp14:anchorId="0810C21A" wp14:editId="2F9BB37B">
             <wp:simplePos x="0" y="0"/>
@@ -2772,7 +2773,7 @@
       <w:pPr>
         <w:pStyle w:val="Heading1"/>
       </w:pPr>
-      <w:bookmarkStart w:id="4" w:name="_Toc212464878"/>
+      <w:bookmarkStart w:id="4" w:name="_Toc212471465"/>
       <w:r>
         <w:lastRenderedPageBreak/>
         <w:t xml:space="preserve">Exercise 2- </w:t>
@@ -2791,7 +2792,7 @@
       <w:pPr>
         <w:pStyle w:val="Heading2"/>
       </w:pPr>
-      <w:bookmarkStart w:id="5" w:name="_Toc212464879"/>
+      <w:bookmarkStart w:id="5" w:name="_Toc212471466"/>
       <w:r>
         <w:t>Solution Idea</w:t>
       </w:r>
@@ -2809,7 +2810,7 @@
       <w:pPr>
         <w:pStyle w:val="Heading2"/>
       </w:pPr>
-      <w:bookmarkStart w:id="6" w:name="_Toc212464880"/>
+      <w:bookmarkStart w:id="6" w:name="_Toc212471467"/>
       <w:r>
         <w:t>Code</w:t>
       </w:r>
@@ -2953,6 +2954,9 @@
         </mc:AlternateContent>
       </w:r>
       <w:r>
+        <w:rPr>
+          <w:noProof/>
+        </w:rPr>
         <w:drawing>
           <wp:anchor distT="0" distB="0" distL="114300" distR="114300" simplePos="0" relativeHeight="251671552" behindDoc="0" locked="0" layoutInCell="1" allowOverlap="1" wp14:anchorId="3D22D195" wp14:editId="644F0D37">
             <wp:simplePos x="0" y="0"/>
@@ -3150,6 +3154,9 @@
         </mc:AlternateContent>
       </w:r>
       <w:r>
+        <w:rPr>
+          <w:noProof/>
+        </w:rPr>
         <w:drawing>
           <wp:anchor distT="0" distB="0" distL="114300" distR="114300" simplePos="0" relativeHeight="251674624" behindDoc="0" locked="0" layoutInCell="1" allowOverlap="1" wp14:anchorId="04000B4E" wp14:editId="2AF3FD4A">
             <wp:simplePos x="0" y="0"/>
@@ -3205,7 +3212,7 @@
       <w:pPr>
         <w:pStyle w:val="Heading2"/>
       </w:pPr>
-      <w:bookmarkStart w:id="7" w:name="_Toc212464881"/>
+      <w:bookmarkStart w:id="7" w:name="_Toc212471468"/>
       <w:r>
         <w:t>Tests</w:t>
       </w:r>
@@ -3355,6 +3362,9 @@
         </mc:AlternateContent>
       </w:r>
       <w:r>
+        <w:rPr>
+          <w:noProof/>
+        </w:rPr>
         <w:drawing>
           <wp:anchor distT="0" distB="0" distL="114300" distR="114300" simplePos="0" relativeHeight="251677696" behindDoc="0" locked="0" layoutInCell="1" allowOverlap="1" wp14:anchorId="08A72E9F" wp14:editId="1A451E98">
             <wp:simplePos x="0" y="0"/>
@@ -3553,6 +3563,9 @@
         </mc:AlternateContent>
       </w:r>
       <w:r>
+        <w:rPr>
+          <w:noProof/>
+        </w:rPr>
         <w:drawing>
           <wp:anchor distT="0" distB="0" distL="114300" distR="114300" simplePos="0" relativeHeight="251680768" behindDoc="0" locked="0" layoutInCell="1" allowOverlap="1" wp14:anchorId="3DE61125" wp14:editId="6800F58E">
             <wp:simplePos x="0" y="0"/>
@@ -3624,7 +3637,7 @@
       <w:pPr>
         <w:pStyle w:val="Heading1"/>
       </w:pPr>
-      <w:bookmarkStart w:id="8" w:name="_Toc212464882"/>
+      <w:bookmarkStart w:id="8" w:name="_Toc212471469"/>
       <w:r>
         <w:lastRenderedPageBreak/>
         <w:t xml:space="preserve">Exercise 3 </w:t>
@@ -3638,7 +3651,7 @@
       <w:pPr>
         <w:pStyle w:val="Heading2"/>
       </w:pPr>
-      <w:bookmarkStart w:id="9" w:name="_Toc212464883"/>
+      <w:bookmarkStart w:id="9" w:name="_Toc212471470"/>
       <w:r>
         <w:t>Solution Idea</w:t>
       </w:r>
@@ -3659,14 +3672,13 @@
       <w:pPr>
         <w:pStyle w:val="Heading2"/>
       </w:pPr>
-      <w:bookmarkStart w:id="10" w:name="_Toc212464884"/>
+      <w:bookmarkStart w:id="10" w:name="_Toc212471471"/>
       <w:r>
         <w:t>Code</w:t>
       </w:r>
       <w:bookmarkEnd w:id="10"/>
     </w:p>
     <w:p>
-      <w:bookmarkStart w:id="11" w:name="_Toc212464885"/>
       <w:r>
         <w:rPr>
           <w:noProof/>
@@ -3804,6 +3816,9 @@
         </mc:AlternateContent>
       </w:r>
       <w:r>
+        <w:rPr>
+          <w:noProof/>
+        </w:rPr>
         <w:drawing>
           <wp:anchor distT="0" distB="0" distL="114300" distR="114300" simplePos="0" relativeHeight="251683840" behindDoc="0" locked="0" layoutInCell="1" allowOverlap="1" wp14:anchorId="3D1272DF" wp14:editId="0C99BED0">
             <wp:simplePos x="0" y="0"/>
@@ -3859,6 +3874,9 @@
     <w:p/>
     <w:p>
       <w:r>
+        <w:rPr>
+          <w:noProof/>
+        </w:rPr>
         <w:lastRenderedPageBreak/>
         <w:drawing>
           <wp:anchor distT="0" distB="0" distL="114300" distR="114300" simplePos="0" relativeHeight="251686912" behindDoc="0" locked="0" layoutInCell="1" allowOverlap="1" wp14:anchorId="7E938A1E" wp14:editId="6B395F8B">
@@ -4057,6 +4075,7 @@
       <w:pPr>
         <w:pStyle w:val="Heading2"/>
       </w:pPr>
+      <w:bookmarkStart w:id="11" w:name="_Toc212471472"/>
       <w:r>
         <w:lastRenderedPageBreak/>
         <w:t>Tests</w:t>
@@ -4207,6 +4226,9 @@
         </mc:AlternateContent>
       </w:r>
       <w:r>
+        <w:rPr>
+          <w:noProof/>
+        </w:rPr>
         <w:drawing>
           <wp:anchor distT="0" distB="0" distL="114300" distR="114300" simplePos="0" relativeHeight="251689984" behindDoc="0" locked="0" layoutInCell="1" allowOverlap="1" wp14:anchorId="7A3A0651" wp14:editId="62983BAE">
             <wp:simplePos x="0" y="0"/>
@@ -4402,6 +4424,9 @@
         </mc:AlternateContent>
       </w:r>
       <w:r>
+        <w:rPr>
+          <w:noProof/>
+        </w:rPr>
         <w:drawing>
           <wp:anchor distT="0" distB="0" distL="114300" distR="114300" simplePos="0" relativeHeight="251693056" behindDoc="0" locked="0" layoutInCell="1" allowOverlap="1" wp14:anchorId="3985235E" wp14:editId="28E2A042">
             <wp:simplePos x="0" y="0"/>
@@ -4474,7 +4499,7 @@
       <w:pPr>
         <w:pStyle w:val="Heading1"/>
       </w:pPr>
-      <w:bookmarkStart w:id="12" w:name="_Toc212464886"/>
+      <w:bookmarkStart w:id="12" w:name="_Toc212471473"/>
       <w:r>
         <w:lastRenderedPageBreak/>
         <w:t xml:space="preserve">Exercise 4 </w:t>
@@ -4488,7 +4513,7 @@
       <w:pPr>
         <w:pStyle w:val="Heading2"/>
       </w:pPr>
-      <w:bookmarkStart w:id="13" w:name="_Toc212464887"/>
+      <w:bookmarkStart w:id="13" w:name="_Toc212471474"/>
       <w:r>
         <w:t>Solution Idea</w:t>
       </w:r>
@@ -4503,7 +4528,7 @@
       <w:pPr>
         <w:pStyle w:val="Heading2"/>
       </w:pPr>
-      <w:bookmarkStart w:id="14" w:name="_Toc212464888"/>
+      <w:bookmarkStart w:id="14" w:name="_Toc212471475"/>
       <w:r>
         <w:t>Code</w:t>
       </w:r>
@@ -4637,6 +4662,9 @@
         </mc:AlternateContent>
       </w:r>
       <w:r>
+        <w:rPr>
+          <w:noProof/>
+        </w:rPr>
         <w:drawing>
           <wp:anchor distT="0" distB="0" distL="114300" distR="114300" simplePos="0" relativeHeight="251696128" behindDoc="0" locked="0" layoutInCell="1" allowOverlap="1" wp14:anchorId="08E41B1A" wp14:editId="26474F12">
             <wp:simplePos x="0" y="0"/>
@@ -4695,11 +4723,11 @@
       </w:r>
     </w:p>
     <w:p/>
+    <w:bookmarkStart w:id="15" w:name="_Toc212471476"/>
     <w:p>
       <w:pPr>
         <w:pStyle w:val="Heading2"/>
       </w:pPr>
-      <w:bookmarkStart w:id="15" w:name="_Toc212464889"/>
       <w:r>
         <w:rPr>
           <w:noProof/>
@@ -4834,6 +4862,9 @@
         </mc:AlternateContent>
       </w:r>
       <w:r>
+        <w:rPr>
+          <w:noProof/>
+        </w:rPr>
         <w:drawing>
           <wp:anchor distT="0" distB="0" distL="114300" distR="114300" simplePos="0" relativeHeight="251699200" behindDoc="0" locked="0" layoutInCell="1" allowOverlap="1" wp14:anchorId="019D67E9" wp14:editId="6C993371">
             <wp:simplePos x="0" y="0"/>
@@ -4909,7 +4940,7 @@
       <w:pPr>
         <w:pStyle w:val="Heading1"/>
       </w:pPr>
-      <w:bookmarkStart w:id="16" w:name="_Toc212464890"/>
+      <w:bookmarkStart w:id="16" w:name="_Toc212471477"/>
       <w:r>
         <w:lastRenderedPageBreak/>
         <w:t xml:space="preserve">Exercise 5 </w:t>
@@ -4923,7 +4954,7 @@
       <w:pPr>
         <w:pStyle w:val="Heading2"/>
       </w:pPr>
-      <w:bookmarkStart w:id="17" w:name="_Toc212464891"/>
+      <w:bookmarkStart w:id="17" w:name="_Toc212471478"/>
       <w:r>
         <w:t>Solution Idea</w:t>
       </w:r>
@@ -4944,7 +4975,7 @@
       <w:pPr>
         <w:pStyle w:val="Heading2"/>
       </w:pPr>
-      <w:bookmarkStart w:id="18" w:name="_Toc212464892"/>
+      <w:bookmarkStart w:id="18" w:name="_Toc212471479"/>
       <w:r>
         <w:t>Code</w:t>
       </w:r>
@@ -5078,6 +5109,9 @@
         </mc:AlternateContent>
       </w:r>
       <w:r>
+        <w:rPr>
+          <w:noProof/>
+        </w:rPr>
         <w:drawing>
           <wp:anchor distT="0" distB="0" distL="114300" distR="114300" simplePos="0" relativeHeight="251702272" behindDoc="0" locked="0" layoutInCell="1" allowOverlap="1" wp14:anchorId="1EAC8D06" wp14:editId="0DA6CDDB">
             <wp:simplePos x="0" y="0"/>
@@ -5135,11 +5169,11 @@
         </w:drawing>
       </w:r>
     </w:p>
+    <w:bookmarkStart w:id="19" w:name="_Toc212471480"/>
     <w:p>
       <w:pPr>
         <w:pStyle w:val="Heading2"/>
       </w:pPr>
-      <w:bookmarkStart w:id="19" w:name="_Toc212464893"/>
       <w:r>
         <w:rPr>
           <w:noProof/>
@@ -5274,6 +5308,9 @@
         </mc:AlternateContent>
       </w:r>
       <w:r>
+        <w:rPr>
+          <w:noProof/>
+        </w:rPr>
         <w:drawing>
           <wp:anchor distT="0" distB="0" distL="114300" distR="114300" simplePos="0" relativeHeight="251705344" behindDoc="0" locked="0" layoutInCell="1" allowOverlap="1" wp14:anchorId="6E0B82FE" wp14:editId="7F39C051">
             <wp:simplePos x="0" y="0"/>
@@ -5336,6 +5373,9 @@
         <w:keepNext/>
       </w:pPr>
       <w:r>
+        <w:rPr>
+          <w:noProof/>
+        </w:rPr>
         <w:drawing>
           <wp:inline distT="0" distB="0" distL="0" distR="0" wp14:anchorId="1B7D7F41" wp14:editId="7979568F">
             <wp:extent cx="5182870" cy="1324610"/>
@@ -5422,7 +5462,7 @@
       <w:pPr>
         <w:pStyle w:val="Heading1"/>
       </w:pPr>
-      <w:bookmarkStart w:id="20" w:name="_Toc212464894"/>
+      <w:bookmarkStart w:id="20" w:name="_Toc212471481"/>
       <w:r>
         <w:lastRenderedPageBreak/>
         <w:t xml:space="preserve">Exercise 6 </w:t>
@@ -5436,7 +5476,7 @@
       <w:pPr>
         <w:pStyle w:val="Heading2"/>
       </w:pPr>
-      <w:bookmarkStart w:id="21" w:name="_Toc212464895"/>
+      <w:bookmarkStart w:id="21" w:name="_Toc212471482"/>
       <w:r>
         <w:t>Solution Idea</w:t>
       </w:r>
@@ -5447,11 +5487,11 @@
         <w:t>Generate random numbers in a while loop until random number is equal to target number.</w:t>
       </w:r>
     </w:p>
+    <w:bookmarkStart w:id="22" w:name="_Toc212471483"/>
     <w:p>
       <w:pPr>
         <w:pStyle w:val="Heading2"/>
       </w:pPr>
-      <w:bookmarkStart w:id="22" w:name="_Toc212464896"/>
       <w:r>
         <w:rPr>
           <w:noProof/>
@@ -5585,6 +5625,9 @@
         </mc:AlternateContent>
       </w:r>
       <w:r>
+        <w:rPr>
+          <w:noProof/>
+        </w:rPr>
         <w:drawing>
           <wp:anchor distT="0" distB="0" distL="114300" distR="114300" simplePos="0" relativeHeight="251714560" behindDoc="0" locked="0" layoutInCell="1" allowOverlap="1" wp14:anchorId="0FFC8B8C" wp14:editId="782A7876">
             <wp:simplePos x="0" y="0"/>
@@ -5776,6 +5819,9 @@
         </mc:AlternateContent>
       </w:r>
       <w:r>
+        <w:rPr>
+          <w:noProof/>
+        </w:rPr>
         <w:drawing>
           <wp:anchor distT="0" distB="0" distL="114300" distR="114300" simplePos="0" relativeHeight="251717632" behindDoc="0" locked="0" layoutInCell="1" allowOverlap="1" wp14:anchorId="22638630" wp14:editId="207783C0">
             <wp:simplePos x="0" y="0"/>
@@ -5828,11 +5874,11 @@
       </w:r>
     </w:p>
     <w:p/>
+    <w:bookmarkStart w:id="23" w:name="_Toc212471484"/>
     <w:p>
       <w:pPr>
         <w:pStyle w:val="Heading2"/>
       </w:pPr>
-      <w:bookmarkStart w:id="23" w:name="_Toc212464897"/>
       <w:r>
         <w:rPr>
           <w:noProof/>
@@ -5967,6 +6013,9 @@
         </mc:AlternateContent>
       </w:r>
       <w:r>
+        <w:rPr>
+          <w:noProof/>
+        </w:rPr>
         <w:drawing>
           <wp:anchor distT="0" distB="0" distL="114300" distR="114300" simplePos="0" relativeHeight="251709440" behindDoc="0" locked="0" layoutInCell="1" allowOverlap="1" wp14:anchorId="1120B080" wp14:editId="24EDD397">
             <wp:simplePos x="0" y="0"/>
@@ -6152,6 +6201,9 @@
         </mc:AlternateContent>
       </w:r>
       <w:r>
+        <w:rPr>
+          <w:noProof/>
+        </w:rPr>
         <w:drawing>
           <wp:anchor distT="0" distB="0" distL="114300" distR="114300" simplePos="0" relativeHeight="251708416" behindDoc="0" locked="0" layoutInCell="1" allowOverlap="1" wp14:anchorId="5D0E7002" wp14:editId="184824E1">
             <wp:simplePos x="0" y="0"/>
@@ -6315,16 +6367,12 @@
 <w:hdr xmlns:wpc="http://schemas.microsoft.com/office/word/2010/wordprocessingCanvas" xmlns:cx="http://schemas.microsoft.com/office/drawing/2014/chartex" xmlns:cx1="http://schemas.microsoft.com/office/drawing/2015/9/8/chartex" xmlns:cx2="http://schemas.microsoft.com/office/drawing/2015/10/21/chartex" xmlns:cx3="http://schemas.microsoft.com/office/drawing/2016/5/9/chartex" xmlns:cx4="http://schemas.microsoft.com/office/drawing/2016/5/10/chartex" xmlns:cx5="http://schemas.microsoft.com/office/drawing/2016/5/11/chartex" xmlns:cx6="http://schemas.microsoft.com/office/drawing/2016/5/12/chartex" xmlns:cx7="http://schemas.microsoft.com/office/drawing/2016/5/13/chartex" xmlns:cx8="http://schemas.microsoft.com/office/drawing/2016/5/14/chartex" xmlns:mc="http://schemas.openxmlformats.org/markup-compatibility/2006" xmlns:aink="http://schemas.microsoft.com/office/drawing/2016/ink" xmlns:am3d="http://schemas.microsoft.com/office/drawing/2017/model3d" xmlns:o="urn:schemas-microsoft-com:office:office" xmlns:oel="http://schemas.microsoft.com/office/2019/extlst" xmlns:r="http://schemas.openxmlformats.org/officeDocument/2006/relationships" xmlns:m="http://schemas.openxmlformats.org/officeDocument/2006/math" xmlns:v="urn:schemas-microsoft-com:vml" xmlns:wp14="http://schemas.microsoft.com/office/word/2010/wordprocessingDrawing" xmlns:wp="http://schemas.openxmlformats.org/drawingml/2006/wordprocessingDrawing" xmlns:w10="urn:schemas-microsoft-com:office:word" xmlns:w="http://schemas.openxmlformats.org/wordprocessingml/2006/main" xmlns:w14="http://schemas.microsoft.com/office/word/2010/wordml" xmlns:w15="http://schemas.microsoft.com/office/word/2012/wordml" xmlns:w16cex="http://schemas.microsoft.com/office/word/2018/wordml/cex" xmlns:w16cid="http://schemas.microsoft.com/office/word/2016/wordml/cid" xmlns:w16="http://schemas.microsoft.com/office/word/2018/wordml" xmlns:w16du="http://schemas.microsoft.com/office/word/2023/wordml/word16du" xmlns:w16sdtdh="http://schemas.microsoft.com/office/word/2020/wordml/sdtdatahash" xmlns:w16sdtfl="http://schemas.microsoft.com/office/word/2024/wordml/sdtformatlock" xmlns:w16se="http://schemas.microsoft.com/office/word/2015/wordml/symex" xmlns:wpg="http://schemas.microsoft.com/office/word/2010/wordprocessingGroup" xmlns:wpi="http://schemas.microsoft.com/office/word/2010/wordprocessingInk" xmlns:wne="http://schemas.microsoft.com/office/word/2006/wordml" xmlns:wps="http://schemas.microsoft.com/office/word/2010/wordprocessingShape" mc:Ignorable="w14 w15 w16se w16cid w16 w16cex w16sdtdh w16sdtfl w16du wp14">
   <w:p>
     <w:pPr>
+      <w:pStyle w:val="Header"/>
       <w:jc w:val="center"/>
     </w:pPr>
     <w:r>
-      <w:t>Java Basics &amp; Pseudocode</w:t>
+      <w:t>Variables &amp; Control Structures</w:t>
     </w:r>
-  </w:p>
-  <w:p>
-    <w:pPr>
-      <w:pStyle w:val="Header"/>
-    </w:pPr>
   </w:p>
 </w:hdr>
 </file>
@@ -6336,7 +6384,10 @@
       <w:pStyle w:val="Header"/>
     </w:pPr>
     <w:r>
-      <w:t>UE01</w:t>
+      <w:t>UE0</w:t>
+    </w:r>
+    <w:r>
+      <w:t>2</w:t>
     </w:r>
   </w:p>
 </w:hdr>

</xml_diff>